<commit_message>
feat(evse): add EVSE low voltage controller architecture, IoT subsystem, and hardware guides
- Add vvdn/evse/README.md and .docx (EVSE master architecture, system domain division, standards map)
- Add vvdn/evse/evse-low-voltage-controller-working.md and .docx (LV board working, ±12V CP PWM, state machine, PP cable rating, 6mA DC RCM, energy metering, contactor economizer)
- Add vvdn/evse/evse-iot-and-communication-subsystem.md and .docx (dual-processor topology, 4G/Wi-Fi/Ethernet, OCPP 1.6J/2.0.1, RS-485 Modbus DLM, RFID, dual-bank OTA)
- Add vvdn/evse/evse-hardware-schematic-and-interfacing.md and .docx (circuit schematics, isolation barriers, surge protection, bring-up checklist)
- Add vvdn/tools/evse_calc.py for CP duty cycle, current sizing, voltage state decoding, and power calculations
- Update vvdn/tools/md_to_docx.py to scan evse directory by default
- Update root README.md and README.docx with EVSE guides and calculator tool
</commit_message>
<xml_diff>
--- a/vvdn/README.docx
+++ b/vvdn/README.docx
@@ -146,6 +146,16 @@
               <w:t>│   │   └── i2c-timing-calculations-and-hardware.md (.docx)# AC timing specs, pull-up sizing math, bus capacitance &amp; PCB design</w:t>
               <w:br/>
               <w:t>│   └── can/                           # (Planned: CAN bus framing &amp; bitrates)</w:t>
+              <w:br/>
+              <w:t>├── evse/</w:t>
+              <w:br/>
+              <w:t>│   ├── README.md (.docx)                              # EVSE master hub, system architecture &amp; standards index</w:t>
+              <w:br/>
+              <w:t>│   ├── evse-low-voltage-controller-working.md (.docx) # LV controller board working, CP/PP, safety, metering &amp; contactor</w:t>
+              <w:br/>
+              <w:t>│   ├── evse-iot-and-communication-subsystem.md (.docx)# IoT gateway, 4G/Wi-Fi/Ethernet, OCPP 1.6J/2.0.1 &amp; DLM</w:t>
+              <w:br/>
+              <w:t>│   └── evse-hardware-schematic-and-interfacing.md (.docx) # Schematics, BOM selection, galvanic isolation &amp; bring-up</w:t>
               <w:br/>
               <w:t>├── standards/</w:t>
               <w:br/>
@@ -504,6 +514,72 @@
                 <w:sz w:val="18"/>
               </w:rPr>
               <w:t xml:space="preserve">  python3 tools/i2c_calc.py --mode full --vdd 3.3 --cap 180 --rp 2.2k --speed fast --address 0x68</w:t>
+            </w:r>
+          </w:p>
+        </w:tc>
+      </w:tr>
+    </w:tbl>
+    <w:p/>
+    <w:p>
+      <w:pPr>
+        <w:pStyle w:val="ListBullet"/>
+        <w:spacing w:after="40"/>
+        <w:ind w:left="360"/>
+      </w:pPr>
+      <w:r>
+        <w:rPr>
+          <w:b/>
+          <w:color w:val="282C34"/>
+          <w:sz w:val="21"/>
+        </w:rPr>
+        <w:t>[tools/evse_calc.py](file:///home/tthhongs/build_tthongs/tasks_aa_ii/vvdn/tools/evse_calc.py)</w:t>
+      </w:r>
+      <w:r>
+        <w:rPr>
+          <w:color w:val="282C34"/>
+          <w:sz w:val="21"/>
+        </w:rPr>
+        <w:t>: Calculate EVSE Control Pilot PWM duty cycles, allowable charging currents, grid power, and RCM response times:</w:t>
+      </w:r>
+    </w:p>
+    <w:tbl>
+      <w:tblPr>
+        <w:tblW w:type="auto" w:w="0"/>
+        <w:jc w:val="center"/>
+        <w:tblLook w:firstColumn="1" w:firstRow="1" w:lastColumn="0" w:lastRow="0" w:noHBand="0" w:noVBand="1" w:val="04A0"/>
+      </w:tblPr>
+      <w:tblGrid>
+        <w:gridCol w:w="9792"/>
+      </w:tblGrid>
+      <w:tr>
+        <w:tc>
+          <w:tcPr>
+            <w:tcW w:type="dxa" w:w="9792"/>
+            <w:shd w:fill="F5F6F8"/>
+            <w:tcMar>
+              <w:top w:w="80" w:type="dxa"/>
+              <w:bottom w:w="80" w:type="dxa"/>
+              <w:left w:w="140" w:type="dxa"/>
+              <w:right w:w="140" w:type="dxa"/>
+            </w:tcMar>
+            <w:tcBorders>
+              <w:left w:val="single" w:sz="18" w:space="0" w:color="CBD5E0"/>
+              <w:top w:val="none"/>
+              <w:right w:val="none"/>
+              <w:bottom w:val="none"/>
+            </w:tcBorders>
+          </w:tcPr>
+          <w:p>
+            <w:pPr>
+              <w:spacing w:line="240" w:lineRule="auto" w:after="0"/>
+            </w:pPr>
+            <w:r>
+              <w:rPr>
+                <w:rFonts w:ascii="Consolas" w:hAnsi="Consolas"/>
+                <w:color w:val="2D3748"/>
+                <w:sz w:val="18"/>
+              </w:rPr>
+              <w:t xml:space="preserve">  python3 tools/evse_calc.py --mode full --current 32 --phase 3 --voltage-grid 400</w:t>
             </w:r>
           </w:p>
         </w:tc>
@@ -1298,6 +1374,154 @@
     </w:p>
     <w:p>
       <w:pPr>
+        <w:pStyle w:val="ListBullet"/>
+        <w:spacing w:after="40"/>
+        <w:ind w:left="360"/>
+      </w:pPr>
+      <w:r>
+        <w:rPr>
+          <w:color w:val="0066CC"/>
+          <w:sz w:val="21"/>
+          <w:u w:val="single"/>
+        </w:rPr>
+        <w:t>EVSE Knowledge Base &amp; Systems Hub</w:t>
+      </w:r>
+      <w:r>
+        <w:rPr>
+          <w:color w:val="282C34"/>
+          <w:sz w:val="21"/>
+        </w:rPr>
+        <w:t xml:space="preserve"> (</w:t>
+      </w:r>
+      <w:r>
+        <w:rPr>
+          <w:color w:val="0066CC"/>
+          <w:sz w:val="21"/>
+          <w:u w:val="single"/>
+        </w:rPr>
+        <w:t>Word DOCX</w:t>
+      </w:r>
+      <w:r>
+        <w:rPr>
+          <w:color w:val="282C34"/>
+          <w:sz w:val="21"/>
+        </w:rPr>
+        <w:t>): Master hub for EV charging equipment architecture, high-voltage vs low-voltage domain separation, and international standards.</w:t>
+      </w:r>
+    </w:p>
+    <w:p>
+      <w:pPr>
+        <w:pStyle w:val="ListBullet"/>
+        <w:spacing w:after="40"/>
+        <w:ind w:left="360"/>
+      </w:pPr>
+      <w:r>
+        <w:rPr>
+          <w:color w:val="0066CC"/>
+          <w:sz w:val="21"/>
+          <w:u w:val="single"/>
+        </w:rPr>
+        <w:t>EVSE Low Voltage Controller Working &amp; Architecture</w:t>
+      </w:r>
+      <w:r>
+        <w:rPr>
+          <w:color w:val="282C34"/>
+          <w:sz w:val="21"/>
+        </w:rPr>
+        <w:t xml:space="preserve"> (</w:t>
+      </w:r>
+      <w:r>
+        <w:rPr>
+          <w:color w:val="0066CC"/>
+          <w:sz w:val="21"/>
+          <w:u w:val="single"/>
+        </w:rPr>
+        <w:t>Word DOCX</w:t>
+      </w:r>
+      <w:r>
+        <w:rPr>
+          <w:color w:val="282C34"/>
+          <w:sz w:val="21"/>
+        </w:rPr>
+        <w:t>): Complete working of the LV controller board, ±12V CP PWM bipolar generation, vehicle state machine (A..F), diode safety check, PP cable rating detection, 6mA DC / 30mA AC RCM leakage trip, welded contactor detection, precision energy metering, and coil economizer.</w:t>
+      </w:r>
+    </w:p>
+    <w:p>
+      <w:pPr>
+        <w:pStyle w:val="ListBullet"/>
+        <w:spacing w:after="40"/>
+        <w:ind w:left="360"/>
+      </w:pPr>
+      <w:r>
+        <w:rPr>
+          <w:color w:val="0066CC"/>
+          <w:sz w:val="21"/>
+          <w:u w:val="single"/>
+        </w:rPr>
+        <w:t>EVSE IoT Gateway &amp; Communication Subsystem</w:t>
+      </w:r>
+      <w:r>
+        <w:rPr>
+          <w:color w:val="282C34"/>
+          <w:sz w:val="21"/>
+        </w:rPr>
+        <w:t xml:space="preserve"> (</w:t>
+      </w:r>
+      <w:r>
+        <w:rPr>
+          <w:color w:val="0066CC"/>
+          <w:sz w:val="21"/>
+          <w:u w:val="single"/>
+        </w:rPr>
+        <w:t>Word DOCX</w:t>
+      </w:r>
+      <w:r>
+        <w:rPr>
+          <w:color w:val="282C34"/>
+          <w:sz w:val="21"/>
+        </w:rPr>
+        <w:t>): Dual-processor safety architecture, 4G LTE Cat-1 / Wi-Fi / BLE / Ethernet connectivity, complete OCPP 1.6-J / 2.0.1 transaction message flows, RS-485 Modbus Dynamic Load Management (DLM), RFID authentication, and A/B dual-bank secure OTA.</w:t>
+      </w:r>
+    </w:p>
+    <w:p>
+      <w:pPr>
+        <w:pStyle w:val="ListBullet"/>
+        <w:spacing w:after="40"/>
+        <w:ind w:left="360"/>
+      </w:pPr>
+      <w:r>
+        <w:rPr>
+          <w:color w:val="0066CC"/>
+          <w:sz w:val="21"/>
+          <w:u w:val="single"/>
+        </w:rPr>
+        <w:t>EVSE Hardware Schematics &amp; Bring-Up Guide</w:t>
+      </w:r>
+      <w:r>
+        <w:rPr>
+          <w:color w:val="282C34"/>
+          <w:sz w:val="21"/>
+        </w:rPr>
+        <w:t xml:space="preserve"> (</w:t>
+      </w:r>
+      <w:r>
+        <w:rPr>
+          <w:color w:val="0066CC"/>
+          <w:sz w:val="21"/>
+          <w:u w:val="single"/>
+        </w:rPr>
+        <w:t>Word DOCX</w:t>
+      </w:r>
+      <w:r>
+        <w:rPr>
+          <w:color w:val="282C34"/>
+          <w:sz w:val="21"/>
+        </w:rPr>
+        <w:t>): Component-level schematics (CP op-amp buffer, PP divider, contactor driver, H-bridge lock), reinforced creepage/clearance (&gt;= 6-8mm), GDT/MOV surge protection, and bench RCA troubleshooting matrix.</w:t>
+      </w:r>
+    </w:p>
+    <w:p>
+      <w:pPr>
         <w:spacing w:before="80" w:after="80"/>
         <w:pBdr>
           <w:bottom w:val="single" w:sz="6" w:space="1" w:color="E2E8F0"/>

</xml_diff>

<commit_message>
feat(mosfets): add comprehensive MOSFET study modules, calculators, and documentation suite
</commit_message>
<xml_diff>
--- a/vvdn/README.docx
+++ b/vvdn/README.docx
@@ -103,6 +103,14 @@
               <w:br/>
               <w:t>│   ├── nfc_calc.py                    # CLI tool for antenna inductance, matching network, Q &amp; NDEF</w:t>
               <w:br/>
+              <w:t>│   ├── i2c_calc.py                    # CLI tool for I2C pull-up windows, bus capacitance &amp; address decode</w:t>
+              <w:br/>
+              <w:t>│   ├── can_calc.py                    # CLI tool for CAN/CAN-FD bit timing, sample points &amp; arbitration</w:t>
+              <w:br/>
+              <w:t>│   ├── lin_calc.py                    # CLI tool for LIN frame timing, PID parity, checksums &amp; auto-baud</w:t>
+              <w:br/>
+              <w:t>│   ├── ldo_calc.py                    # CLI tool for LDO thermal dissipation, feedback dividers &amp; ESR stability</w:t>
+              <w:br/>
               <w:t>│   └── md_to_docx.py                  # CLI generator to synchronize .md guides into styled .docx files</w:t>
               <w:br/>
               <w:t>├── protocols/</w:t>
@@ -145,7 +153,61 @@
               <w:br/>
               <w:t>│   │   └── i2c-timing-calculations-and-hardware.md (.docx)# AC timing specs, pull-up sizing math, bus capacitance &amp; PCB design</w:t>
               <w:br/>
-              <w:t>│   └── can/                           # (Planned: CAN bus framing &amp; bitrates)</w:t>
+              <w:t>│   ├── can/</w:t>
+              <w:br/>
+              <w:t>│   │   ├── README.md (.docx)                              # CAN master hub, standard comparisons &amp; roadmap</w:t>
+              <w:br/>
+              <w:t>│   │   ├── can-working-and-architecture.md (.docx)        # Differential physical layer, arbitration, fault confinement &amp; transceivers</w:t>
+              <w:br/>
+              <w:t>│   │   ├── can-frame-and-protocol-analysis.md (.docx)     # Frame formats (2.0A/B, FD), bit stuffing, J1939, CANopen, UDS &amp; SocketCAN</w:t>
+              <w:br/>
+              <w:t>│   │   └── can-timing-bitrates-and-hardware.md (.docx)    # Bit timing budgets, Time Quanta, SJW, TDC, termination &amp; RCA matrix</w:t>
+              <w:br/>
+              <w:t>│   └── lin/</w:t>
+              <w:br/>
+              <w:t>│       ├── README.md (.docx)                              # LIN master hub, standard comparisons &amp; roadmap</w:t>
+              <w:br/>
+              <w:t>│       ├── lin-working-and-architecture.md (.docx)        # Single-wire 12V physical layer, asymmetric pull-up, scheduling &amp; sleep/wake</w:t>
+              <w:br/>
+              <w:t>│       ├── lin-frame-and-protocol-analysis.md (.docx)     # Frame anatomy (Break, Sync 0x55, PID parity, Classic/Enhanced Checksum)</w:t>
+              <w:br/>
+              <w:t>│       └── lin-timing-synchronization-and-hardware.md (.docx)# Auto-baud sync math, slave RC capture, duty cycles &amp; bench RCA</w:t>
+              <w:br/>
+              <w:t>├── ldo/</w:t>
+              <w:br/>
+              <w:t>│   ├── README.md (.docx)                              # LDO master hub, operating principles &amp; pass element comparison</w:t>
+              <w:br/>
+              <w:t>│   ├── pmos-ldo-working-and-architecture.md (.docx)   # Common-Source topology, stability tunnel &amp; MLCC compensation</w:t>
+              <w:br/>
+              <w:t>│   ├── nmos-ldo-working-and-architecture.md (.docx)   # Source-Follower topology, Vbias rails, charge pumps &amp; fast transient</w:t>
+              <w:br/>
+              <w:t>│   └── ldo-calculations-and-thermal-design.md (.docx) # Thermal networks, heatsinks, feedback dividers, ESR zeros &amp; RCA</w:t>
+              <w:br/>
+              <w:t>├── mosfets/</w:t>
+              <w:br/>
+              <w:t>│   ├── README.md (.docx)                              # MOSFET master hub, taxonomy, physics, math &amp; selection matrix</w:t>
+              <w:br/>
+              <w:t>│   ├── n-channel-enhancement/                         # e-NMOS physics, inversion, low-side switching &amp; flyback clamping</w:t>
+              <w:br/>
+              <w:t>│   ├── p-channel-enhancement/                         # e-PMOS physics, hole mobility, high-side drive &amp; reverse polarity</w:t>
+              <w:br/>
+              <w:t>│   ├── depletion-mode/                                # Normally-ON d-MOSFET, pinch-off, offline startup &amp; current sources</w:t>
+              <w:br/>
+              <w:t>│   ├── power-trench-mosfet/                           # UMOS &amp; SGT shielded trench, low Rdson, sync buck top/bottom FETs</w:t>
+              <w:br/>
+              <w:t>│   ├── power-vdmos/                                   # Vertical planar DMOS, UIS avalanche Eas &amp; linear mode SOA</w:t>
+              <w:br/>
+              <w:t>│   ├── superjunction-mosfet/                          # CoolMOS charge balance, breaking Si limit, PFC &amp; fast diodes</w:t>
+              <w:br/>
+              <w:t>│   ├── sic-mosfet/                                    # 4H-SiC wide-bandgap, 1200V EV traction, EVSE &amp; +18V/-4V drive</w:t>
+              <w:br/>
+              <w:t>│   ├── logic-level-mosfet/                            # Low-Vth logic-level FETs, direct 3.3V/5V MCU GPIO drive &amp; Qg sizing</w:t>
+              <w:br/>
+              <w:t>│   ├── ldmos-rf/                                      # Lateral DMOS, grounded flange, GHz RF power &amp; Doherty amplifiers</w:t>
+              <w:br/>
+              <w:t>│   ├── finfet-and-gaafet/                             # 3D multi-gate, FinFET &amp; GAA nanosheets, SCE &amp; sub-3nm VLSI</w:t>
+              <w:br/>
+              <w:t>│   └── dual-gate-mosfet/                              # Tetrode FET, cascode integration, ultra-low Crss, AGC &amp; RF mixers</w:t>
               <w:br/>
               <w:t>├── evse/</w:t>
               <w:br/>
@@ -156,6 +218,20 @@
               <w:t>│   ├── evse-iot-and-communication-subsystem.md (.docx)# IoT gateway, 4G/Wi-Fi/Ethernet, OCPP 1.6J/2.0.1 &amp; DLM</w:t>
               <w:br/>
               <w:t>│   └── evse-hardware-schematic-and-interfacing.md (.docx) # Schematics, BOM selection, galvanic isolation &amp; bring-up</w:t>
+              <w:br/>
+              <w:t>├── dual_lift_controller/</w:t>
+              <w:br/>
+              <w:t>│   ├── README.md (.docx)                              # Dual lift master hub, architecture &amp; design index</w:t>
+              <w:br/>
+              <w:t>│   ├── 3-floor-dual-lift-logic-design.md (.docx)      # Gate-level design for 3-floor building (27-state truth table, K-maps)</w:t>
+              <w:br/>
+              <w:t>│   ├── 4-floor-dual-lift-logic-design.md (.docx)      # Gate-level design for 4-floor building (64-state truth table, subtractors)</w:t>
+              <w:br/>
+              <w:t>│   ├── gate-level-schematics-and-simulation.md (.docx)# TTL 7400 IC schematics, gate counts &amp; simulation waveforms</w:t>
+              <w:br/>
+              <w:t>│   ├── dual_lift_controller.v                         # Synthesizable gate-level Verilog hardware description module</w:t>
+              <w:br/>
+              <w:t>│   └── dual_lift_controller_tb.v                      # Verilog testbench validating all 64 state combinations</w:t>
               <w:br/>
               <w:t>├── standards/</w:t>
               <w:br/>
@@ -532,6 +608,333 @@
           <w:color w:val="282C34"/>
           <w:sz w:val="21"/>
         </w:rPr>
+        <w:t>[tools/can_calc.py](file:///home/tthhongs/build_tthongs/tasks_aa_ii/vvdn/tools/can_calc.py)</w:t>
+      </w:r>
+      <w:r>
+        <w:rPr>
+          <w:color w:val="282C34"/>
+          <w:sz w:val="21"/>
+        </w:rPr>
+        <w:t>: Calculate CAN and CAN FD bit timing registers, Sample Point %, bit-stuffing overhead, frame duration, and bitwise arbitration simulation:</w:t>
+      </w:r>
+    </w:p>
+    <w:tbl>
+      <w:tblPr>
+        <w:tblW w:type="auto" w:w="0"/>
+        <w:jc w:val="center"/>
+        <w:tblLook w:firstColumn="1" w:firstRow="1" w:lastColumn="0" w:lastRow="0" w:noHBand="0" w:noVBand="1" w:val="04A0"/>
+      </w:tblPr>
+      <w:tblGrid>
+        <w:gridCol w:w="9792"/>
+      </w:tblGrid>
+      <w:tr>
+        <w:tc>
+          <w:tcPr>
+            <w:tcW w:type="dxa" w:w="9792"/>
+            <w:shd w:fill="F5F6F8"/>
+            <w:tcMar>
+              <w:top w:w="80" w:type="dxa"/>
+              <w:bottom w:w="80" w:type="dxa"/>
+              <w:left w:w="140" w:type="dxa"/>
+              <w:right w:w="140" w:type="dxa"/>
+            </w:tcMar>
+            <w:tcBorders>
+              <w:left w:val="single" w:sz="18" w:space="0" w:color="CBD5E0"/>
+              <w:top w:val="none"/>
+              <w:right w:val="none"/>
+              <w:bottom w:val="none"/>
+            </w:tcBorders>
+          </w:tcPr>
+          <w:p>
+            <w:pPr>
+              <w:spacing w:line="240" w:lineRule="auto" w:after="0"/>
+            </w:pPr>
+            <w:r>
+              <w:rPr>
+                <w:rFonts w:ascii="Consolas" w:hAnsi="Consolas"/>
+                <w:color w:val="2D3748"/>
+                <w:sz w:val="18"/>
+              </w:rPr>
+              <w:t xml:space="preserve">  python3 tools/can_calc.py --clock 80MHz --baud 500000 --sp 87.5</w:t>
+              <w:br/>
+              <w:t xml:space="preserve">  python3 tools/can_calc.py --fd --clock 80MHz --baud 500000 --data-baud 2000000</w:t>
+              <w:br/>
+              <w:t xml:space="preserve">  python3 tools/can_calc.py --arbitrate --id1 0x120 --id2 0x124</w:t>
+            </w:r>
+          </w:p>
+        </w:tc>
+      </w:tr>
+    </w:tbl>
+    <w:p/>
+    <w:p>
+      <w:pPr>
+        <w:pStyle w:val="ListBullet"/>
+        <w:spacing w:after="40"/>
+        <w:ind w:left="360"/>
+      </w:pPr>
+      <w:r>
+        <w:rPr>
+          <w:b/>
+          <w:color w:val="282C34"/>
+          <w:sz w:val="21"/>
+        </w:rPr>
+        <w:t>[tools/lin_calc.py](file:///home/tthhongs/build_tthongs/tasks_aa_ii/vvdn/tools/lin_calc.py)</w:t>
+      </w:r>
+      <w:r>
+        <w:rPr>
+          <w:color w:val="282C34"/>
+          <w:sz w:val="21"/>
+        </w:rPr>
+        <w:t>: Calculate LIN frame slot durations (</w:t>
+      </w:r>
+      <w:r>
+        <w:rPr>
+          <w:i/>
+          <w:color w:val="145AA0"/>
+          <w:sz w:val="21"/>
+        </w:rPr>
+        <w:t>1.4×</w:t>
+      </w:r>
+      <w:r>
+        <w:rPr>
+          <w:color w:val="282C34"/>
+          <w:sz w:val="21"/>
+        </w:rPr>
+        <w:t xml:space="preserve"> slot budget), PID parity bits (</w:t>
+      </w:r>
+      <w:r>
+        <w:rPr>
+          <w:i/>
+          <w:color w:val="145AA0"/>
+          <w:sz w:val="21"/>
+        </w:rPr>
+        <w:t>P0, P1</w:t>
+      </w:r>
+      <w:r>
+        <w:rPr>
+          <w:color w:val="282C34"/>
+          <w:sz w:val="21"/>
+        </w:rPr>
+        <w:t>), Classic &amp; Enhanced checksums, auto-baud sync capture ticks, and bus RC parameters:</w:t>
+      </w:r>
+    </w:p>
+    <w:tbl>
+      <w:tblPr>
+        <w:tblW w:type="auto" w:w="0"/>
+        <w:jc w:val="center"/>
+        <w:tblLook w:firstColumn="1" w:firstRow="1" w:lastColumn="0" w:lastRow="0" w:noHBand="0" w:noVBand="1" w:val="04A0"/>
+      </w:tblPr>
+      <w:tblGrid>
+        <w:gridCol w:w="9792"/>
+      </w:tblGrid>
+      <w:tr>
+        <w:tc>
+          <w:tcPr>
+            <w:tcW w:type="dxa" w:w="9792"/>
+            <w:shd w:fill="F5F6F8"/>
+            <w:tcMar>
+              <w:top w:w="80" w:type="dxa"/>
+              <w:bottom w:w="80" w:type="dxa"/>
+              <w:left w:w="140" w:type="dxa"/>
+              <w:right w:w="140" w:type="dxa"/>
+            </w:tcMar>
+            <w:tcBorders>
+              <w:left w:val="single" w:sz="18" w:space="0" w:color="CBD5E0"/>
+              <w:top w:val="none"/>
+              <w:right w:val="none"/>
+              <w:bottom w:val="none"/>
+            </w:tcBorders>
+          </w:tcPr>
+          <w:p>
+            <w:pPr>
+              <w:spacing w:line="240" w:lineRule="auto" w:after="0"/>
+            </w:pPr>
+            <w:r>
+              <w:rPr>
+                <w:rFonts w:ascii="Consolas" w:hAnsi="Consolas"/>
+                <w:color w:val="2D3748"/>
+                <w:sz w:val="18"/>
+              </w:rPr>
+              <w:t xml:space="preserve">  python3 tools/lin_calc.py --baud 19200 --data-bytes 8 --slaves 8</w:t>
+              <w:br/>
+              <w:t xml:space="preserve">  python3 tools/lin_calc.py --pid 0x23</w:t>
+              <w:br/>
+              <w:t xml:space="preserve">  python3 tools/lin_calc.py --checksum --pid 0x23 --data 0x01 0x02 0x03 0x04</w:t>
+            </w:r>
+          </w:p>
+        </w:tc>
+      </w:tr>
+    </w:tbl>
+    <w:p/>
+    <w:p>
+      <w:pPr>
+        <w:pStyle w:val="ListBullet"/>
+        <w:spacing w:after="40"/>
+        <w:ind w:left="360"/>
+      </w:pPr>
+      <w:r>
+        <w:rPr>
+          <w:b/>
+          <w:color w:val="282C34"/>
+          <w:sz w:val="21"/>
+        </w:rPr>
+        <w:t>[tools/ldo_calc.py](file:///home/tthhongs/build_tthongs/tasks_aa_ii/vvdn/tools/ldo_calc.py)</w:t>
+      </w:r>
+      <w:r>
+        <w:rPr>
+          <w:color w:val="282C34"/>
+          <w:sz w:val="21"/>
+        </w:rPr>
+        <w:t>: Calculate LDO power dissipation, junction temperature (</w:t>
+      </w:r>
+      <w:r>
+        <w:rPr>
+          <w:i/>
+          <w:color w:val="145AA0"/>
+          <w:sz w:val="21"/>
+        </w:rPr>
+        <w:t>T_J</w:t>
+      </w:r>
+      <w:r>
+        <w:rPr>
+          <w:color w:val="282C34"/>
+          <w:sz w:val="21"/>
+        </w:rPr>
+        <w:t>), required heatsink thermal resistance, feedback resistor divider sizing (E96 1%), and ESR stability zero frequency:</w:t>
+      </w:r>
+    </w:p>
+    <w:tbl>
+      <w:tblPr>
+        <w:tblW w:type="auto" w:w="0"/>
+        <w:jc w:val="center"/>
+        <w:tblLook w:firstColumn="1" w:firstRow="1" w:lastColumn="0" w:lastRow="0" w:noHBand="0" w:noVBand="1" w:val="04A0"/>
+      </w:tblPr>
+      <w:tblGrid>
+        <w:gridCol w:w="9792"/>
+      </w:tblGrid>
+      <w:tr>
+        <w:tc>
+          <w:tcPr>
+            <w:tcW w:type="dxa" w:w="9792"/>
+            <w:shd w:fill="F5F6F8"/>
+            <w:tcMar>
+              <w:top w:w="80" w:type="dxa"/>
+              <w:bottom w:w="80" w:type="dxa"/>
+              <w:left w:w="140" w:type="dxa"/>
+              <w:right w:w="140" w:type="dxa"/>
+            </w:tcMar>
+            <w:tcBorders>
+              <w:left w:val="single" w:sz="18" w:space="0" w:color="CBD5E0"/>
+              <w:top w:val="none"/>
+              <w:right w:val="none"/>
+              <w:bottom w:val="none"/>
+            </w:tcBorders>
+          </w:tcPr>
+          <w:p>
+            <w:pPr>
+              <w:spacing w:line="240" w:lineRule="auto" w:after="0"/>
+            </w:pPr>
+            <w:r>
+              <w:rPr>
+                <w:rFonts w:ascii="Consolas" w:hAnsi="Consolas"/>
+                <w:color w:val="2D3748"/>
+                <w:sz w:val="18"/>
+              </w:rPr>
+              <w:t xml:space="preserve">  python3 tools/ldo_calc.py --thermal --vin 5.0 --vout 3.3 --iload 0.5 --theta-ja 45.0</w:t>
+              <w:br/>
+              <w:t xml:space="preserve">  python3 tools/ldo_calc.py --feedback --vout 3.3 --vref 1.2</w:t>
+              <w:br/>
+              <w:t xml:space="preserve">  python3 tools/ldo_calc.py --stability --cout 10.0 --esr 15.0 --cff 47.0 --r1 21.0 --r2 12.0</w:t>
+              <w:br/>
+              <w:t xml:space="preserve">  python3 tools/ldo_calc.py --compare --vin 3.3 --vout 1.8 --iload 1.0</w:t>
+            </w:r>
+          </w:p>
+        </w:tc>
+      </w:tr>
+    </w:tbl>
+    <w:p/>
+    <w:p>
+      <w:pPr>
+        <w:pStyle w:val="ListBullet"/>
+        <w:spacing w:after="40"/>
+        <w:ind w:left="360"/>
+      </w:pPr>
+      <w:r>
+        <w:rPr>
+          <w:b/>
+          <w:color w:val="282C34"/>
+          <w:sz w:val="21"/>
+        </w:rPr>
+        <w:t>[tools/mosfet_calc.py](file:///home/tthhongs/build_tthongs/tasks_aa_ii/vvdn/tools/mosfet_calc.py)</w:t>
+      </w:r>
+      <w:r>
+        <w:rPr>
+          <w:color w:val="282C34"/>
+          <w:sz w:val="21"/>
+        </w:rPr>
+        <w:t>: Calculate MOSFET conduction loss, switching loss, gate drive resistor sizing, thermal junction temperatures, and body diode recovery:</w:t>
+      </w:r>
+    </w:p>
+    <w:tbl>
+      <w:tblPr>
+        <w:tblW w:type="auto" w:w="0"/>
+        <w:jc w:val="center"/>
+        <w:tblLook w:firstColumn="1" w:firstRow="1" w:lastColumn="0" w:lastRow="0" w:noHBand="0" w:noVBand="1" w:val="04A0"/>
+      </w:tblPr>
+      <w:tblGrid>
+        <w:gridCol w:w="9792"/>
+      </w:tblGrid>
+      <w:tr>
+        <w:tc>
+          <w:tcPr>
+            <w:tcW w:type="dxa" w:w="9792"/>
+            <w:shd w:fill="F5F6F8"/>
+            <w:tcMar>
+              <w:top w:w="80" w:type="dxa"/>
+              <w:bottom w:w="80" w:type="dxa"/>
+              <w:left w:w="140" w:type="dxa"/>
+              <w:right w:w="140" w:type="dxa"/>
+            </w:tcMar>
+            <w:tcBorders>
+              <w:left w:val="single" w:sz="18" w:space="0" w:color="CBD5E0"/>
+              <w:top w:val="none"/>
+              <w:right w:val="none"/>
+              <w:bottom w:val="none"/>
+            </w:tcBorders>
+          </w:tcPr>
+          <w:p>
+            <w:pPr>
+              <w:spacing w:line="240" w:lineRule="auto" w:after="0"/>
+            </w:pPr>
+            <w:r>
+              <w:rPr>
+                <w:rFonts w:ascii="Consolas" w:hAnsi="Consolas"/>
+                <w:color w:val="2D3748"/>
+                <w:sz w:val="18"/>
+              </w:rPr>
+              <w:t xml:space="preserve">  python3 tools/mosfet_calc.py --loss --vds 48 --id 15 --rdson 0.005 --trise 25n --tfall 20n --fsw 150k</w:t>
+              <w:br/>
+              <w:t xml:space="preserve">  python3 tools/mosfet_calc.py --gate --vdrv 12 --vplat 4.2 --qgd 12n --target-dt 30n</w:t>
+              <w:br/>
+              <w:t xml:space="preserve">  python3 tools/mosfet_calc.py --diode --vds 400 --iload 20 --vsd 1.2 --tdead 100n --qrr 450n --fsw 100k</w:t>
+            </w:r>
+          </w:p>
+        </w:tc>
+      </w:tr>
+    </w:tbl>
+    <w:p/>
+    <w:p>
+      <w:pPr>
+        <w:pStyle w:val="ListBullet"/>
+        <w:spacing w:after="40"/>
+        <w:ind w:left="360"/>
+      </w:pPr>
+      <w:r>
+        <w:rPr>
+          <w:b/>
+          <w:color w:val="282C34"/>
+          <w:sz w:val="21"/>
+        </w:rPr>
         <w:t>[tools/evse_calc.py](file:///home/tthhongs/build_tthongs/tasks_aa_ii/vvdn/tools/evse_calc.py)</w:t>
       </w:r>
       <w:r>
@@ -580,6 +983,72 @@
                 <w:sz w:val="18"/>
               </w:rPr>
               <w:t xml:space="preserve">  python3 tools/evse_calc.py --mode full --current 32 --phase 3 --voltage-grid 400</w:t>
+            </w:r>
+          </w:p>
+        </w:tc>
+      </w:tr>
+    </w:tbl>
+    <w:p/>
+    <w:p>
+      <w:pPr>
+        <w:pStyle w:val="ListBullet"/>
+        <w:spacing w:after="40"/>
+        <w:ind w:left="360"/>
+      </w:pPr>
+      <w:r>
+        <w:rPr>
+          <w:b/>
+          <w:color w:val="282C34"/>
+          <w:sz w:val="21"/>
+        </w:rPr>
+        <w:t>[tools/lift_sim.py](file:///home/tthhongs/build_tthongs/tasks_aa_ii/vvdn/tools/lift_sim.py)</w:t>
+      </w:r>
+      <w:r>
+        <w:rPr>
+          <w:color w:val="282C34"/>
+          <w:sz w:val="21"/>
+        </w:rPr>
+        <w:t>: Simulate and verify gate-level nearest-lift arbitration and motor direction logic across all floor combinations:</w:t>
+      </w:r>
+    </w:p>
+    <w:tbl>
+      <w:tblPr>
+        <w:tblW w:type="auto" w:w="0"/>
+        <w:jc w:val="center"/>
+        <w:tblLook w:firstColumn="1" w:firstRow="1" w:lastColumn="0" w:lastRow="0" w:noHBand="0" w:noVBand="1" w:val="04A0"/>
+      </w:tblPr>
+      <w:tblGrid>
+        <w:gridCol w:w="9792"/>
+      </w:tblGrid>
+      <w:tr>
+        <w:tc>
+          <w:tcPr>
+            <w:tcW w:type="dxa" w:w="9792"/>
+            <w:shd w:fill="F5F6F8"/>
+            <w:tcMar>
+              <w:top w:w="80" w:type="dxa"/>
+              <w:bottom w:w="80" w:type="dxa"/>
+              <w:left w:w="140" w:type="dxa"/>
+              <w:right w:w="140" w:type="dxa"/>
+            </w:tcMar>
+            <w:tcBorders>
+              <w:left w:val="single" w:sz="18" w:space="0" w:color="CBD5E0"/>
+              <w:top w:val="none"/>
+              <w:right w:val="none"/>
+              <w:bottom w:val="none"/>
+            </w:tcBorders>
+          </w:tcPr>
+          <w:p>
+            <w:pPr>
+              <w:spacing w:line="240" w:lineRule="auto" w:after="0"/>
+            </w:pPr>
+            <w:r>
+              <w:rPr>
+                <w:rFonts w:ascii="Consolas" w:hAnsi="Consolas"/>
+                <w:color w:val="2D3748"/>
+                <w:sz w:val="18"/>
+              </w:rPr>
+              <w:t xml:space="preserve">  python3 tools/lift_sim.py --floors 4 --verify</w:t>
             </w:r>
           </w:p>
         </w:tc>
@@ -1384,7 +1853,7 @@
           <w:sz w:val="21"/>
           <w:u w:val="single"/>
         </w:rPr>
-        <w:t>EVSE Knowledge Base &amp; Systems Hub</w:t>
+        <w:t>CAN Master Architecture &amp; Knowledge Base</w:t>
       </w:r>
       <w:r>
         <w:rPr>
@@ -1406,7 +1875,7 @@
           <w:color w:val="282C34"/>
           <w:sz w:val="21"/>
         </w:rPr>
-        <w:t>): Master hub for EV charging equipment architecture, high-voltage vs low-voltage domain separation, and international standards.</w:t>
+        <w:t>): Master hub for CAN/CAN-FD standards, generational comparison matrix (2.0A/B, FD, XL), bus architecture, and CLI tools.</w:t>
       </w:r>
     </w:p>
     <w:p>
@@ -1421,7 +1890,7 @@
           <w:sz w:val="21"/>
           <w:u w:val="single"/>
         </w:rPr>
-        <w:t>EVSE Low Voltage Controller Working &amp; Architecture</w:t>
+        <w:t>CAN Working Mechanism &amp; Physical Layer</w:t>
       </w:r>
       <w:r>
         <w:rPr>
@@ -1443,7 +1912,7 @@
           <w:color w:val="282C34"/>
           <w:sz w:val="21"/>
         </w:rPr>
-        <w:t>): Complete working of the LV controller board, ±12V CP PWM bipolar generation, vehicle state machine (A..F), diode safety check, PP cable rating detection, 6mA DC / 30mA AC RCM leakage trip, welded contactor detection, precision energy metering, and coil economizer.</w:t>
+        <w:t>): Physical differential signaling, Recessive/Dominant voltage levels, transceivers, non-destructive bitwise arbitration, error detection, fault confinement state machine (TEC/REC), and acceptance filters.</w:t>
       </w:r>
     </w:p>
     <w:p>
@@ -1458,7 +1927,7 @@
           <w:sz w:val="21"/>
           <w:u w:val="single"/>
         </w:rPr>
-        <w:t>EVSE IoT Gateway &amp; Communication Subsystem</w:t>
+        <w:t>CAN Frame &amp; Protocol Analysis</w:t>
       </w:r>
       <w:r>
         <w:rPr>
@@ -1480,7 +1949,7 @@
           <w:color w:val="282C34"/>
           <w:sz w:val="21"/>
         </w:rPr>
-        <w:t>): Dual-processor safety architecture, 4G LTE Cat-1 / Wi-Fi / BLE / Ethernet connectivity, complete OCPP 1.6-J / 2.0.1 transaction message flows, RS-485 Modbus Dynamic Load Management (DLM), RFID authentication, and A/B dual-bank secure OTA.</w:t>
+        <w:t>): Bit-by-bit frame anatomy (Standard 2.0A, Extended 2.0B, CAN FD), bit-stuffing overhead, SAE J1939, CANopen, UDS over CAN-TP (ISO 15765-2), and Linux SocketCAN C driver.</w:t>
       </w:r>
     </w:p>
     <w:p>
@@ -1495,6 +1964,1194 @@
           <w:sz w:val="21"/>
           <w:u w:val="single"/>
         </w:rPr>
+        <w:t>CAN Timing, Bitrates &amp; Hardware Engineering</w:t>
+      </w:r>
+      <w:r>
+        <w:rPr>
+          <w:color w:val="282C34"/>
+          <w:sz w:val="21"/>
+        </w:rPr>
+        <w:t xml:space="preserve"> (</w:t>
+      </w:r>
+      <w:r>
+        <w:rPr>
+          <w:color w:val="0066CC"/>
+          <w:sz w:val="21"/>
+          <w:u w:val="single"/>
+        </w:rPr>
+        <w:t>Word DOCX</w:t>
+      </w:r>
+      <w:r>
+        <w:rPr>
+          <w:color w:val="282C34"/>
+          <w:sz w:val="21"/>
+        </w:rPr>
+        <w:t>): Bit timing theory, Time Quanta, SJW, sample point optimization, CAN FD dual-bitrate timing, Transmitter Delay Compensation (TDC/SSP), bus length trade-offs, split termination, and bench RCA matrix.</w:t>
+      </w:r>
+    </w:p>
+    <w:p>
+      <w:pPr>
+        <w:pStyle w:val="ListBullet"/>
+        <w:spacing w:after="40"/>
+        <w:ind w:left="360"/>
+      </w:pPr>
+      <w:r>
+        <w:rPr>
+          <w:color w:val="0066CC"/>
+          <w:sz w:val="21"/>
+          <w:u w:val="single"/>
+        </w:rPr>
+        <w:t>LIN Master Architecture &amp; Knowledge Base</w:t>
+      </w:r>
+      <w:r>
+        <w:rPr>
+          <w:color w:val="282C34"/>
+          <w:sz w:val="21"/>
+        </w:rPr>
+        <w:t xml:space="preserve"> (</w:t>
+      </w:r>
+      <w:r>
+        <w:rPr>
+          <w:color w:val="0066CC"/>
+          <w:sz w:val="21"/>
+          <w:u w:val="single"/>
+        </w:rPr>
+        <w:t>Word DOCX</w:t>
+      </w:r>
+      <w:r>
+        <w:rPr>
+          <w:color w:val="282C34"/>
+          <w:sz w:val="21"/>
+        </w:rPr>
+        <w:t>): Master hub for LIN protocol standards (LIN 1.3, 2.0, 2.1, 2.2A, ISO 17987), vehicle sub-bus architecture, and comparison matrix.</w:t>
+      </w:r>
+    </w:p>
+    <w:p>
+      <w:pPr>
+        <w:pStyle w:val="ListBullet"/>
+        <w:spacing w:after="40"/>
+        <w:ind w:left="360"/>
+      </w:pPr>
+      <w:r>
+        <w:rPr>
+          <w:color w:val="0066CC"/>
+          <w:sz w:val="21"/>
+          <w:u w:val="single"/>
+        </w:rPr>
+        <w:t>LIN Working Mechanism &amp; Electrical Architecture</w:t>
+      </w:r>
+      <w:r>
+        <w:rPr>
+          <w:color w:val="282C34"/>
+          <w:sz w:val="21"/>
+        </w:rPr>
+        <w:t xml:space="preserve"> (</w:t>
+      </w:r>
+      <w:r>
+        <w:rPr>
+          <w:color w:val="0066CC"/>
+          <w:sz w:val="21"/>
+          <w:u w:val="single"/>
+        </w:rPr>
+        <w:t>Word DOCX</w:t>
+      </w:r>
+      <w:r>
+        <w:rPr>
+          <w:color w:val="282C34"/>
+          <w:sz w:val="21"/>
+        </w:rPr>
+        <w:t>): Single-wire 12V physical layer, asymmetric termination (</w:t>
+      </w:r>
+      <w:r>
+        <w:rPr>
+          <w:i/>
+          <w:color w:val="145AA0"/>
+          <w:sz w:val="21"/>
+        </w:rPr>
+        <w:t>1k\Omega</w:t>
+      </w:r>
+      <w:r>
+        <w:rPr>
+          <w:color w:val="282C34"/>
+          <w:sz w:val="21"/>
+        </w:rPr>
+        <w:t xml:space="preserve"> Master, </w:t>
+      </w:r>
+      <w:r>
+        <w:rPr>
+          <w:i/>
+          <w:color w:val="145AA0"/>
+          <w:sz w:val="21"/>
+        </w:rPr>
+        <w:t>30k\Omega</w:t>
+      </w:r>
+      <w:r>
+        <w:rPr>
+          <w:color w:val="282C34"/>
+          <w:sz w:val="21"/>
+        </w:rPr>
+        <w:t xml:space="preserve"> Slave), transceiver slew-rate control, deterministic schedule tables, sleep/wake-up protocol, and node configuration (NAD).</w:t>
+      </w:r>
+    </w:p>
+    <w:p>
+      <w:pPr>
+        <w:pStyle w:val="ListBullet"/>
+        <w:spacing w:after="40"/>
+        <w:ind w:left="360"/>
+      </w:pPr>
+      <w:r>
+        <w:rPr>
+          <w:color w:val="0066CC"/>
+          <w:sz w:val="21"/>
+          <w:u w:val="single"/>
+        </w:rPr>
+        <w:t>LIN Frame &amp; Protocol Analysis</w:t>
+      </w:r>
+      <w:r>
+        <w:rPr>
+          <w:color w:val="282C34"/>
+          <w:sz w:val="21"/>
+        </w:rPr>
+        <w:t xml:space="preserve"> (</w:t>
+      </w:r>
+      <w:r>
+        <w:rPr>
+          <w:color w:val="0066CC"/>
+          <w:sz w:val="21"/>
+          <w:u w:val="single"/>
+        </w:rPr>
+        <w:t>Word DOCX</w:t>
+      </w:r>
+      <w:r>
+        <w:rPr>
+          <w:color w:val="282C34"/>
+          <w:sz w:val="21"/>
+        </w:rPr>
+        <w:t xml:space="preserve">): Bit-level frame anatomy (Break </w:t>
+      </w:r>
+      <w:r>
+        <w:rPr>
+          <w:i/>
+          <w:color w:val="145AA0"/>
+          <w:sz w:val="21"/>
+        </w:rPr>
+        <w:t>≥ 13</w:t>
+      </w:r>
+      <w:r>
+        <w:rPr>
+          <w:color w:val="282C34"/>
+          <w:sz w:val="21"/>
+        </w:rPr>
+        <w:t xml:space="preserve"> bits, Sync 0x55, PID parity equations P0/P1), Classic vs Enhanced Checksum algorithms, frame types, LIN TP, waveform decoding, and MCU UART driver.</w:t>
+      </w:r>
+    </w:p>
+    <w:p>
+      <w:pPr>
+        <w:pStyle w:val="ListBullet"/>
+        <w:spacing w:after="40"/>
+        <w:ind w:left="360"/>
+      </w:pPr>
+      <w:r>
+        <w:rPr>
+          <w:color w:val="0066CC"/>
+          <w:sz w:val="21"/>
+          <w:u w:val="single"/>
+        </w:rPr>
+        <w:t>LIN Timing Calculations, Synchronization &amp; Hardware</w:t>
+      </w:r>
+      <w:r>
+        <w:rPr>
+          <w:color w:val="282C34"/>
+          <w:sz w:val="21"/>
+        </w:rPr>
+        <w:t xml:space="preserve"> (</w:t>
+      </w:r>
+      <w:r>
+        <w:rPr>
+          <w:color w:val="0066CC"/>
+          <w:sz w:val="21"/>
+          <w:u w:val="single"/>
+        </w:rPr>
+        <w:t>Word DOCX</w:t>
+      </w:r>
+      <w:r>
+        <w:rPr>
+          <w:color w:val="282C34"/>
+          <w:sz w:val="21"/>
+        </w:rPr>
+        <w:t xml:space="preserve">): Bit timing, </w:t>
+      </w:r>
+      <w:r>
+        <w:rPr>
+          <w:i/>
+          <w:color w:val="145AA0"/>
+          <w:sz w:val="21"/>
+        </w:rPr>
+        <w:t>1.4×</w:t>
+      </w:r>
+      <w:r>
+        <w:rPr>
+          <w:color w:val="282C34"/>
+          <w:sz w:val="21"/>
+        </w:rPr>
+        <w:t xml:space="preserve"> slot budget sizing, slave auto-baud clock synchronization math, timer input capture ISR, duty cycle timing budgets, bus RC capacitance, ISO 7637-2 surge protection, and bench RCA matrix.</w:t>
+      </w:r>
+    </w:p>
+    <w:p>
+      <w:pPr>
+        <w:pStyle w:val="ListBullet"/>
+        <w:spacing w:after="40"/>
+        <w:ind w:left="360"/>
+      </w:pPr>
+      <w:r>
+        <w:rPr>
+          <w:color w:val="0066CC"/>
+          <w:sz w:val="21"/>
+          <w:u w:val="single"/>
+        </w:rPr>
+        <w:t>LDO Master Architecture &amp; Knowledge Base</w:t>
+      </w:r>
+      <w:r>
+        <w:rPr>
+          <w:color w:val="282C34"/>
+          <w:sz w:val="21"/>
+        </w:rPr>
+        <w:t xml:space="preserve"> (</w:t>
+      </w:r>
+      <w:r>
+        <w:rPr>
+          <w:color w:val="0066CC"/>
+          <w:sz w:val="21"/>
+          <w:u w:val="single"/>
+        </w:rPr>
+        <w:t>Word DOCX</w:t>
+      </w:r>
+      <w:r>
+        <w:rPr>
+          <w:color w:val="282C34"/>
+          <w:sz w:val="21"/>
+        </w:rPr>
+        <w:t>): Master hub for linear regulators, LDO operating principles, PMOS vs. NMOS pass element benchmark, performance metrics, and CLI tools.</w:t>
+      </w:r>
+    </w:p>
+    <w:p>
+      <w:pPr>
+        <w:pStyle w:val="ListBullet"/>
+        <w:spacing w:after="40"/>
+        <w:ind w:left="360"/>
+      </w:pPr>
+      <w:r>
+        <w:rPr>
+          <w:color w:val="0066CC"/>
+          <w:sz w:val="21"/>
+          <w:u w:val="single"/>
+        </w:rPr>
+        <w:t>PMOS LDO Working Mechanism &amp; Architecture</w:t>
+      </w:r>
+      <w:r>
+        <w:rPr>
+          <w:color w:val="282C34"/>
+          <w:sz w:val="21"/>
+        </w:rPr>
+        <w:t xml:space="preserve"> (</w:t>
+      </w:r>
+      <w:r>
+        <w:rPr>
+          <w:color w:val="0066CC"/>
+          <w:sz w:val="21"/>
+          <w:u w:val="single"/>
+        </w:rPr>
+        <w:t>Word DOCX</w:t>
+      </w:r>
+      <w:r>
+        <w:rPr>
+          <w:color w:val="282C34"/>
+          <w:sz w:val="21"/>
+        </w:rPr>
+        <w:t>): Common-Source topology, gate drive physics (</w:t>
+      </w:r>
+      <w:r>
+        <w:rPr>
+          <w:i/>
+          <w:color w:val="145AA0"/>
+          <w:sz w:val="21"/>
+        </w:rPr>
+        <w:t>V_{GATE &lt; V_{IN</w:t>
+      </w:r>
+      <w:r>
+        <w:rPr>
+          <w:color w:val="282C34"/>
+          <w:sz w:val="21"/>
+        </w:rPr>
+        <w:t>), two-pole loop dynamics, ESR stability tunnel, MLCC ceramic compensation, and parasitic body diode reverse current protection.</w:t>
+      </w:r>
+    </w:p>
+    <w:p>
+      <w:pPr>
+        <w:pStyle w:val="ListBullet"/>
+        <w:spacing w:after="40"/>
+        <w:ind w:left="360"/>
+      </w:pPr>
+      <w:r>
+        <w:rPr>
+          <w:color w:val="0066CC"/>
+          <w:sz w:val="21"/>
+          <w:u w:val="single"/>
+        </w:rPr>
+        <w:t>NMOS LDO Working Mechanism &amp; Architecture</w:t>
+      </w:r>
+      <w:r>
+        <w:rPr>
+          <w:color w:val="282C34"/>
+          <w:sz w:val="21"/>
+        </w:rPr>
+        <w:t xml:space="preserve"> (</w:t>
+      </w:r>
+      <w:r>
+        <w:rPr>
+          <w:color w:val="0066CC"/>
+          <w:sz w:val="21"/>
+          <w:u w:val="single"/>
+        </w:rPr>
+        <w:t>Word DOCX</w:t>
+      </w:r>
+      <w:r>
+        <w:rPr>
+          <w:color w:val="282C34"/>
+          <w:sz w:val="21"/>
+        </w:rPr>
+        <w:t>): Source-Follower topology, intrinsic local feedback, gate headroom constraint (</w:t>
+      </w:r>
+      <w:r>
+        <w:rPr>
+          <w:i/>
+          <w:color w:val="145AA0"/>
+          <w:sz w:val="21"/>
+        </w:rPr>
+        <w:t>V_{GATE &gt; V_{IN</w:t>
+      </w:r>
+      <w:r>
+        <w:rPr>
+          <w:color w:val="282C34"/>
+          <w:sz w:val="21"/>
+        </w:rPr>
+        <w:t xml:space="preserve">), dual-rail </w:t>
+      </w:r>
+      <w:r>
+        <w:rPr>
+          <w:i/>
+          <w:color w:val="145AA0"/>
+          <w:sz w:val="21"/>
+        </w:rPr>
+        <w:t>V_{BIAS</w:t>
+      </w:r>
+      <w:r>
+        <w:rPr>
+          <w:color w:val="282C34"/>
+          <w:sz w:val="21"/>
+        </w:rPr>
+        <w:t xml:space="preserve"> vs. internal charge pumps, wideband MLCC stability, and triple-well body effect elimination.</w:t>
+      </w:r>
+    </w:p>
+    <w:p>
+      <w:pPr>
+        <w:pStyle w:val="ListBullet"/>
+        <w:spacing w:after="40"/>
+        <w:ind w:left="360"/>
+      </w:pPr>
+      <w:r>
+        <w:rPr>
+          <w:color w:val="0066CC"/>
+          <w:sz w:val="21"/>
+          <w:u w:val="single"/>
+        </w:rPr>
+        <w:t>LDO Calculations, Feedback Sizing &amp; Thermal Design</w:t>
+      </w:r>
+      <w:r>
+        <w:rPr>
+          <w:color w:val="282C34"/>
+          <w:sz w:val="21"/>
+        </w:rPr>
+        <w:t xml:space="preserve"> (</w:t>
+      </w:r>
+      <w:r>
+        <w:rPr>
+          <w:color w:val="0066CC"/>
+          <w:sz w:val="21"/>
+          <w:u w:val="single"/>
+        </w:rPr>
+        <w:t>Word DOCX</w:t>
+      </w:r>
+      <w:r>
+        <w:rPr>
+          <w:color w:val="282C34"/>
+          <w:sz w:val="21"/>
+        </w:rPr>
+        <w:t>): Power dissipation math, thermal resistance network (</w:t>
+      </w:r>
+      <w:r>
+        <w:rPr>
+          <w:i/>
+          <w:color w:val="145AA0"/>
+          <w:sz w:val="21"/>
+        </w:rPr>
+        <w:t>\theta_{JA, \theta_{JC</w:t>
+      </w:r>
+      <w:r>
+        <w:rPr>
+          <w:color w:val="282C34"/>
+          <w:sz w:val="21"/>
+        </w:rPr>
+        <w:t>), heatsink sizing, standard E96 feedback divider design, feedforward capacitor (</w:t>
+      </w:r>
+      <w:r>
+        <w:rPr>
+          <w:i/>
+          <w:color w:val="145AA0"/>
+          <w:sz w:val="21"/>
+        </w:rPr>
+        <w:t>C_{FF</w:t>
+      </w:r>
+      <w:r>
+        <w:rPr>
+          <w:color w:val="282C34"/>
+          <w:sz w:val="21"/>
+        </w:rPr>
+        <w:t>) phase-lead zero, output capacitor dynamic sizing, and bench RCA troubleshooting matrix.</w:t>
+      </w:r>
+    </w:p>
+    <w:p>
+      <w:pPr>
+        <w:pStyle w:val="ListBullet"/>
+        <w:spacing w:after="40"/>
+        <w:ind w:left="360"/>
+      </w:pPr>
+      <w:r>
+        <w:rPr>
+          <w:color w:val="0066CC"/>
+          <w:sz w:val="21"/>
+          <w:u w:val="single"/>
+        </w:rPr>
+        <w:t>MOSFET Master Architecture &amp; Study Guide</w:t>
+      </w:r>
+      <w:r>
+        <w:rPr>
+          <w:color w:val="282C34"/>
+          <w:sz w:val="21"/>
+        </w:rPr>
+        <w:t xml:space="preserve"> (</w:t>
+      </w:r>
+      <w:r>
+        <w:rPr>
+          <w:color w:val="0066CC"/>
+          <w:sz w:val="21"/>
+          <w:u w:val="single"/>
+        </w:rPr>
+        <w:t>Word DOCX</w:t>
+      </w:r>
+      <w:r>
+        <w:rPr>
+          <w:color w:val="282C34"/>
+          <w:sz w:val="21"/>
+        </w:rPr>
+        <w:t>): Master hub covering MOSFET taxonomy, semiconductor physics, mathematical models, switching dynamics, Miller plateau, thermal sizing, and selection matrix.</w:t>
+      </w:r>
+    </w:p>
+    <w:p>
+      <w:pPr>
+        <w:pStyle w:val="ListBullet"/>
+        <w:spacing w:after="40"/>
+        <w:ind w:left="360"/>
+      </w:pPr>
+      <w:r>
+        <w:rPr>
+          <w:color w:val="0066CC"/>
+          <w:sz w:val="21"/>
+          <w:u w:val="single"/>
+        </w:rPr>
+        <w:t>N-Channel Enhancement MOSFET Guide</w:t>
+      </w:r>
+      <w:r>
+        <w:rPr>
+          <w:color w:val="282C34"/>
+          <w:sz w:val="21"/>
+        </w:rPr>
+        <w:t xml:space="preserve"> (</w:t>
+      </w:r>
+      <w:r>
+        <w:rPr>
+          <w:color w:val="0066CC"/>
+          <w:sz w:val="21"/>
+          <w:u w:val="single"/>
+        </w:rPr>
+        <w:t>Word DOCX</w:t>
+      </w:r>
+      <w:r>
+        <w:rPr>
+          <w:color w:val="282C34"/>
+          <w:sz w:val="21"/>
+        </w:rPr>
+        <w:t>): e-NMOS physics, inversion channel, low-side switching, gate pull-down/damping resistors, and inductive flyback clamping.</w:t>
+      </w:r>
+    </w:p>
+    <w:p>
+      <w:pPr>
+        <w:pStyle w:val="ListBullet"/>
+        <w:spacing w:after="40"/>
+        <w:ind w:left="360"/>
+      </w:pPr>
+      <w:r>
+        <w:rPr>
+          <w:color w:val="0066CC"/>
+          <w:sz w:val="21"/>
+          <w:u w:val="single"/>
+        </w:rPr>
+        <w:t>P-Channel Enhancement MOSFET Guide</w:t>
+      </w:r>
+      <w:r>
+        <w:rPr>
+          <w:color w:val="282C34"/>
+          <w:sz w:val="21"/>
+        </w:rPr>
+        <w:t xml:space="preserve"> (</w:t>
+      </w:r>
+      <w:r>
+        <w:rPr>
+          <w:color w:val="0066CC"/>
+          <w:sz w:val="21"/>
+          <w:u w:val="single"/>
+        </w:rPr>
+        <w:t>Word DOCX</w:t>
+      </w:r>
+      <w:r>
+        <w:rPr>
+          <w:color w:val="282C34"/>
+          <w:sz w:val="21"/>
+        </w:rPr>
+        <w:t>): e-PMOS hole mobility penalty, high-side power switching, level shifter driver, and millivolt reverse polarity protection circuits.</w:t>
+      </w:r>
+    </w:p>
+    <w:p>
+      <w:pPr>
+        <w:pStyle w:val="ListBullet"/>
+        <w:spacing w:after="40"/>
+        <w:ind w:left="360"/>
+      </w:pPr>
+      <w:r>
+        <w:rPr>
+          <w:color w:val="0066CC"/>
+          <w:sz w:val="21"/>
+          <w:u w:val="single"/>
+        </w:rPr>
+        <w:t>Depletion-Mode MOSFET Guide</w:t>
+      </w:r>
+      <w:r>
+        <w:rPr>
+          <w:color w:val="282C34"/>
+          <w:sz w:val="21"/>
+        </w:rPr>
+        <w:t xml:space="preserve"> (</w:t>
+      </w:r>
+      <w:r>
+        <w:rPr>
+          <w:color w:val="0066CC"/>
+          <w:sz w:val="21"/>
+          <w:u w:val="single"/>
+        </w:rPr>
+        <w:t>Word DOCX</w:t>
+      </w:r>
+      <w:r>
+        <w:rPr>
+          <w:color w:val="282C34"/>
+          <w:sz w:val="21"/>
+        </w:rPr>
+        <w:t>): Normally-ON d-MOSFET physics, negative pinch-off, lossless high-voltage offline SMPS startup, and two-terminal constant current sources.</w:t>
+      </w:r>
+    </w:p>
+    <w:p>
+      <w:pPr>
+        <w:pStyle w:val="ListBullet"/>
+        <w:spacing w:after="40"/>
+        <w:ind w:left="360"/>
+      </w:pPr>
+      <w:r>
+        <w:rPr>
+          <w:color w:val="0066CC"/>
+          <w:sz w:val="21"/>
+          <w:u w:val="single"/>
+        </w:rPr>
+        <w:t>Power Trench MOSFET Guide</w:t>
+      </w:r>
+      <w:r>
+        <w:rPr>
+          <w:color w:val="282C34"/>
+          <w:sz w:val="21"/>
+        </w:rPr>
+        <w:t xml:space="preserve"> (</w:t>
+      </w:r>
+      <w:r>
+        <w:rPr>
+          <w:color w:val="0066CC"/>
+          <w:sz w:val="21"/>
+          <w:u w:val="single"/>
+        </w:rPr>
+        <w:t>Word DOCX</w:t>
+      </w:r>
+      <w:r>
+        <w:rPr>
+          <w:color w:val="282C34"/>
+          <w:sz w:val="21"/>
+        </w:rPr>
+        <w:t>): UMOS &amp; Shielded Gate Trench (SGT) architectures, JFET resistance elimination, and synchronous buck top vs bottom FET optimization.</w:t>
+      </w:r>
+    </w:p>
+    <w:p>
+      <w:pPr>
+        <w:pStyle w:val="ListBullet"/>
+        <w:spacing w:after="40"/>
+        <w:ind w:left="360"/>
+      </w:pPr>
+      <w:r>
+        <w:rPr>
+          <w:color w:val="0066CC"/>
+          <w:sz w:val="21"/>
+          <w:u w:val="single"/>
+        </w:rPr>
+        <w:t>Vertical Planar Power VDMOS Guide</w:t>
+      </w:r>
+      <w:r>
+        <w:rPr>
+          <w:color w:val="282C34"/>
+          <w:sz w:val="21"/>
+        </w:rPr>
+        <w:t xml:space="preserve"> (</w:t>
+      </w:r>
+      <w:r>
+        <w:rPr>
+          <w:color w:val="0066CC"/>
+          <w:sz w:val="21"/>
+          <w:u w:val="single"/>
+        </w:rPr>
+        <w:t>Word DOCX</w:t>
+      </w:r>
+      <w:r>
+        <w:rPr>
+          <w:color w:val="282C34"/>
+          <w:sz w:val="21"/>
+        </w:rPr>
+        <w:t>): Double-diffused planar power physics, high single-pulse avalanche energy (</w:t>
+      </w:r>
+      <w:r>
+        <w:rPr>
+          <w:i/>
+          <w:color w:val="145AA0"/>
+          <w:sz w:val="21"/>
+        </w:rPr>
+        <w:t>E_{AS</w:t>
+      </w:r>
+      <w:r>
+        <w:rPr>
+          <w:color w:val="282C34"/>
+          <w:sz w:val="21"/>
+        </w:rPr>
+        <w:t>), and linear mode SOA immunity to Spirito hotspots.</w:t>
+      </w:r>
+    </w:p>
+    <w:p>
+      <w:pPr>
+        <w:pStyle w:val="ListBullet"/>
+        <w:spacing w:after="40"/>
+        <w:ind w:left="360"/>
+      </w:pPr>
+      <w:r>
+        <w:rPr>
+          <w:color w:val="0066CC"/>
+          <w:sz w:val="21"/>
+          <w:u w:val="single"/>
+        </w:rPr>
+        <w:t>Superjunction (CoolMOS) Guide</w:t>
+      </w:r>
+      <w:r>
+        <w:rPr>
+          <w:color w:val="282C34"/>
+          <w:sz w:val="21"/>
+        </w:rPr>
+        <w:t xml:space="preserve"> (</w:t>
+      </w:r>
+      <w:r>
+        <w:rPr>
+          <w:color w:val="0066CC"/>
+          <w:sz w:val="21"/>
+          <w:u w:val="single"/>
+        </w:rPr>
+        <w:t>Word DOCX</w:t>
+      </w:r>
+      <w:r>
+        <w:rPr>
+          <w:color w:val="282C34"/>
+          <w:sz w:val="21"/>
+        </w:rPr>
+        <w:t xml:space="preserve">): Multi-epi charge balance physics, breaking the 1D Silicon limit, non-linear </w:t>
+      </w:r>
+      <w:r>
+        <w:rPr>
+          <w:i/>
+          <w:color w:val="145AA0"/>
+          <w:sz w:val="21"/>
+        </w:rPr>
+        <w:t>C_{oss</w:t>
+      </w:r>
+      <w:r>
+        <w:rPr>
+          <w:color w:val="282C34"/>
+          <w:sz w:val="21"/>
+        </w:rPr>
+        <w:t xml:space="preserve">, high </w:t>
+      </w:r>
+      <w:r>
+        <w:rPr>
+          <w:i/>
+          <w:color w:val="145AA0"/>
+          <w:sz w:val="21"/>
+        </w:rPr>
+        <w:t>dv/dt</w:t>
+      </w:r>
+      <w:r>
+        <w:rPr>
+          <w:color w:val="282C34"/>
+          <w:sz w:val="21"/>
+        </w:rPr>
+        <w:t xml:space="preserve"> handling, and fast recovery CFD body diodes.</w:t>
+      </w:r>
+    </w:p>
+    <w:p>
+      <w:pPr>
+        <w:pStyle w:val="ListBullet"/>
+        <w:spacing w:after="40"/>
+        <w:ind w:left="360"/>
+      </w:pPr>
+      <w:r>
+        <w:rPr>
+          <w:color w:val="0066CC"/>
+          <w:sz w:val="21"/>
+          <w:u w:val="single"/>
+        </w:rPr>
+        <w:t>Silicon Carbide (SiC) Power MOSFET Guide</w:t>
+      </w:r>
+      <w:r>
+        <w:rPr>
+          <w:color w:val="282C34"/>
+          <w:sz w:val="21"/>
+        </w:rPr>
+        <w:t xml:space="preserve"> (</w:t>
+      </w:r>
+      <w:r>
+        <w:rPr>
+          <w:color w:val="0066CC"/>
+          <w:sz w:val="21"/>
+          <w:u w:val="single"/>
+        </w:rPr>
+        <w:t>Word DOCX</w:t>
+      </w:r>
+      <w:r>
+        <w:rPr>
+          <w:color w:val="282C34"/>
+          <w:sz w:val="21"/>
+        </w:rPr>
+        <w:t xml:space="preserve">): Wide-bandgap </w:t>
+      </w:r>
+      <w:r>
+        <w:rPr>
+          <w:i/>
+          <w:color w:val="145AA0"/>
+          <w:sz w:val="21"/>
+        </w:rPr>
+        <w:t>3.26\,eV</w:t>
+      </w:r>
+      <w:r>
+        <w:rPr>
+          <w:color w:val="282C34"/>
+          <w:sz w:val="21"/>
+        </w:rPr>
+        <w:t xml:space="preserve"> physics, </w:t>
+      </w:r>
+      <w:r>
+        <w:rPr>
+          <w:i/>
+          <w:color w:val="145AA0"/>
+          <w:sz w:val="21"/>
+        </w:rPr>
+        <w:t>+18V/-4V</w:t>
+      </w:r>
+      <w:r>
+        <w:rPr>
+          <w:color w:val="282C34"/>
+          <w:sz w:val="21"/>
+        </w:rPr>
+        <w:t xml:space="preserve"> asymmetric gate drive, Kelvin Source connection, DESAT protection, and EV traction inverters.</w:t>
+      </w:r>
+    </w:p>
+    <w:p>
+      <w:pPr>
+        <w:pStyle w:val="ListBullet"/>
+        <w:spacing w:after="40"/>
+        <w:ind w:left="360"/>
+      </w:pPr>
+      <w:r>
+        <w:rPr>
+          <w:color w:val="0066CC"/>
+          <w:sz w:val="21"/>
+          <w:u w:val="single"/>
+        </w:rPr>
+        <w:t>Logic-Level MOSFET Guide</w:t>
+      </w:r>
+      <w:r>
+        <w:rPr>
+          <w:color w:val="282C34"/>
+          <w:sz w:val="21"/>
+        </w:rPr>
+        <w:t xml:space="preserve"> (</w:t>
+      </w:r>
+      <w:r>
+        <w:rPr>
+          <w:color w:val="0066CC"/>
+          <w:sz w:val="21"/>
+          <w:u w:val="single"/>
+        </w:rPr>
+        <w:t>Word DOCX</w:t>
+      </w:r>
+      <w:r>
+        <w:rPr>
+          <w:color w:val="282C34"/>
+          <w:sz w:val="21"/>
+        </w:rPr>
+        <w:t xml:space="preserve">): Thin-oxide </w:t>
+      </w:r>
+      <w:r>
+        <w:rPr>
+          <w:i/>
+          <w:color w:val="145AA0"/>
+          <w:sz w:val="21"/>
+        </w:rPr>
+        <w:t>1-2\,V</w:t>
+      </w:r>
+      <w:r>
+        <w:rPr>
+          <w:color w:val="282C34"/>
+          <w:sz w:val="21"/>
+        </w:rPr>
+        <w:t xml:space="preserve"> </w:t>
+      </w:r>
+      <w:r>
+        <w:rPr>
+          <w:i/>
+          <w:color w:val="145AA0"/>
+          <w:sz w:val="21"/>
+        </w:rPr>
+        <w:t>V_{TH</w:t>
+      </w:r>
+      <w:r>
+        <w:rPr>
+          <w:color w:val="282C34"/>
+          <w:sz w:val="21"/>
+        </w:rPr>
+        <w:t xml:space="preserve"> engineering, direct </w:t>
+      </w:r>
+      <w:r>
+        <w:rPr>
+          <w:i/>
+          <w:color w:val="145AA0"/>
+          <w:sz w:val="21"/>
+        </w:rPr>
+        <w:t>3.3\,V/5\,V</w:t>
+      </w:r>
+      <w:r>
+        <w:rPr>
+          <w:color w:val="282C34"/>
+          <w:sz w:val="21"/>
+        </w:rPr>
+        <w:t xml:space="preserve"> MCU GPIO drive, inrush resistor sizing, and gate charge limitations.</w:t>
+      </w:r>
+    </w:p>
+    <w:p>
+      <w:pPr>
+        <w:pStyle w:val="ListBullet"/>
+        <w:spacing w:after="40"/>
+        <w:ind w:left="360"/>
+      </w:pPr>
+      <w:r>
+        <w:rPr>
+          <w:color w:val="0066CC"/>
+          <w:sz w:val="21"/>
+          <w:u w:val="single"/>
+        </w:rPr>
+        <w:t>Lateral DMOS (LDMOS) RF Guide</w:t>
+      </w:r>
+      <w:r>
+        <w:rPr>
+          <w:color w:val="282C34"/>
+          <w:sz w:val="21"/>
+        </w:rPr>
+        <w:t xml:space="preserve"> (</w:t>
+      </w:r>
+      <w:r>
+        <w:rPr>
+          <w:color w:val="0066CC"/>
+          <w:sz w:val="21"/>
+          <w:u w:val="single"/>
+        </w:rPr>
+        <w:t>Word DOCX</w:t>
+      </w:r>
+      <w:r>
+        <w:rPr>
+          <w:color w:val="282C34"/>
+          <w:sz w:val="21"/>
+        </w:rPr>
+        <w:t xml:space="preserve">): RF power physics, grounded backside flange, ultra-low </w:t>
+      </w:r>
+      <w:r>
+        <w:rPr>
+          <w:i/>
+          <w:color w:val="145AA0"/>
+          <w:sz w:val="21"/>
+        </w:rPr>
+        <w:t>C_{rss</w:t>
+      </w:r>
+      <w:r>
+        <w:rPr>
+          <w:color w:val="282C34"/>
+          <w:sz w:val="21"/>
+        </w:rPr>
+        <w:t xml:space="preserve">, </w:t>
+      </w:r>
+      <w:r>
+        <w:rPr>
+          <w:i/>
+          <w:color w:val="145AA0"/>
+          <w:sz w:val="21"/>
+        </w:rPr>
+        <w:t>65:1</w:t>
+      </w:r>
+      <w:r>
+        <w:rPr>
+          <w:color w:val="282C34"/>
+          <w:sz w:val="21"/>
+        </w:rPr>
+        <w:t xml:space="preserve"> VSWR survival, and Doherty base station architectures.</w:t>
+      </w:r>
+    </w:p>
+    <w:p>
+      <w:pPr>
+        <w:pStyle w:val="ListBullet"/>
+        <w:spacing w:after="40"/>
+        <w:ind w:left="360"/>
+      </w:pPr>
+      <w:r>
+        <w:rPr>
+          <w:color w:val="0066CC"/>
+          <w:sz w:val="21"/>
+          <w:u w:val="single"/>
+        </w:rPr>
+        <w:t>Advanced Multi-Gate FinFET &amp; GAAFET Guide</w:t>
+      </w:r>
+      <w:r>
+        <w:rPr>
+          <w:color w:val="282C34"/>
+          <w:sz w:val="21"/>
+        </w:rPr>
+        <w:t xml:space="preserve"> (</w:t>
+      </w:r>
+      <w:r>
+        <w:rPr>
+          <w:color w:val="0066CC"/>
+          <w:sz w:val="21"/>
+          <w:u w:val="single"/>
+        </w:rPr>
+        <w:t>Word DOCX</w:t>
+      </w:r>
+      <w:r>
+        <w:rPr>
+          <w:color w:val="282C34"/>
+          <w:sz w:val="21"/>
+        </w:rPr>
+        <w:t>): 3D FinFET tri-gate, Gate-All-Around (GAA) nanosheets, FD-SOI, short-channel effect mitigation, and sub-3nm VLSI scaling.</w:t>
+      </w:r>
+    </w:p>
+    <w:p>
+      <w:pPr>
+        <w:pStyle w:val="ListBullet"/>
+        <w:spacing w:after="40"/>
+        <w:ind w:left="360"/>
+      </w:pPr>
+      <w:r>
+        <w:rPr>
+          <w:color w:val="0066CC"/>
+          <w:sz w:val="21"/>
+          <w:u w:val="single"/>
+        </w:rPr>
+        <w:t>Dual-Gate (Tetrode) MOSFET Guide</w:t>
+      </w:r>
+      <w:r>
+        <w:rPr>
+          <w:color w:val="282C34"/>
+          <w:sz w:val="21"/>
+        </w:rPr>
+        <w:t xml:space="preserve"> (</w:t>
+      </w:r>
+      <w:r>
+        <w:rPr>
+          <w:color w:val="0066CC"/>
+          <w:sz w:val="21"/>
+          <w:u w:val="single"/>
+        </w:rPr>
+        <w:t>Word DOCX</w:t>
+      </w:r>
+      <w:r>
+        <w:rPr>
+          <w:color w:val="282C34"/>
+          <w:sz w:val="21"/>
+        </w:rPr>
+        <w:t>): Monolithic cascode integration, independent dual gates, Miller suppression (</w:t>
+      </w:r>
+      <w:r>
+        <w:rPr>
+          <w:i/>
+          <w:color w:val="145AA0"/>
+          <w:sz w:val="21"/>
+        </w:rPr>
+        <w:t>C_{rss &lt; 0.02\,pF</w:t>
+      </w:r>
+      <w:r>
+        <w:rPr>
+          <w:color w:val="282C34"/>
+          <w:sz w:val="21"/>
+        </w:rPr>
+        <w:t>), AGC amplifiers, and active RF mixers.</w:t>
+      </w:r>
+    </w:p>
+    <w:p>
+      <w:pPr>
+        <w:pStyle w:val="ListBullet"/>
+        <w:spacing w:after="40"/>
+        <w:ind w:left="360"/>
+      </w:pPr>
+      <w:r>
+        <w:rPr>
+          <w:color w:val="0066CC"/>
+          <w:sz w:val="21"/>
+          <w:u w:val="single"/>
+        </w:rPr>
+        <w:t>EVSE Knowledge Base &amp; Systems Hub</w:t>
+      </w:r>
+      <w:r>
+        <w:rPr>
+          <w:color w:val="282C34"/>
+          <w:sz w:val="21"/>
+        </w:rPr>
+        <w:t xml:space="preserve"> (</w:t>
+      </w:r>
+      <w:r>
+        <w:rPr>
+          <w:color w:val="0066CC"/>
+          <w:sz w:val="21"/>
+          <w:u w:val="single"/>
+        </w:rPr>
+        <w:t>Word DOCX</w:t>
+      </w:r>
+      <w:r>
+        <w:rPr>
+          <w:color w:val="282C34"/>
+          <w:sz w:val="21"/>
+        </w:rPr>
+        <w:t>): Master hub for EV charging equipment architecture, high-voltage vs low-voltage domain separation, and international standards.</w:t>
+      </w:r>
+    </w:p>
+    <w:p>
+      <w:pPr>
+        <w:pStyle w:val="ListBullet"/>
+        <w:spacing w:after="40"/>
+        <w:ind w:left="360"/>
+      </w:pPr>
+      <w:r>
+        <w:rPr>
+          <w:color w:val="0066CC"/>
+          <w:sz w:val="21"/>
+          <w:u w:val="single"/>
+        </w:rPr>
+        <w:t>EVSE Low Voltage Controller Working &amp; Architecture</w:t>
+      </w:r>
+      <w:r>
+        <w:rPr>
+          <w:color w:val="282C34"/>
+          <w:sz w:val="21"/>
+        </w:rPr>
+        <w:t xml:space="preserve"> (</w:t>
+      </w:r>
+      <w:r>
+        <w:rPr>
+          <w:color w:val="0066CC"/>
+          <w:sz w:val="21"/>
+          <w:u w:val="single"/>
+        </w:rPr>
+        <w:t>Word DOCX</w:t>
+      </w:r>
+      <w:r>
+        <w:rPr>
+          <w:color w:val="282C34"/>
+          <w:sz w:val="21"/>
+        </w:rPr>
+        <w:t>): Complete working of the LV controller board, ±12V CP PWM bipolar generation, vehicle state machine (A..F), diode safety check, PP cable rating detection, 6mA DC / 30mA AC RCM leakage trip, welded contactor detection, precision energy metering, and coil economizer.</w:t>
+      </w:r>
+    </w:p>
+    <w:p>
+      <w:pPr>
+        <w:pStyle w:val="ListBullet"/>
+        <w:spacing w:after="40"/>
+        <w:ind w:left="360"/>
+      </w:pPr>
+      <w:r>
+        <w:rPr>
+          <w:color w:val="0066CC"/>
+          <w:sz w:val="21"/>
+          <w:u w:val="single"/>
+        </w:rPr>
+        <w:t>EVSE IoT Gateway &amp; Communication Subsystem</w:t>
+      </w:r>
+      <w:r>
+        <w:rPr>
+          <w:color w:val="282C34"/>
+          <w:sz w:val="21"/>
+        </w:rPr>
+        <w:t xml:space="preserve"> (</w:t>
+      </w:r>
+      <w:r>
+        <w:rPr>
+          <w:color w:val="0066CC"/>
+          <w:sz w:val="21"/>
+          <w:u w:val="single"/>
+        </w:rPr>
+        <w:t>Word DOCX</w:t>
+      </w:r>
+      <w:r>
+        <w:rPr>
+          <w:color w:val="282C34"/>
+          <w:sz w:val="21"/>
+        </w:rPr>
+        <w:t>): Dual-processor safety architecture, 4G LTE Cat-1 / Wi-Fi / BLE / Ethernet connectivity, complete OCPP 1.6-J / 2.0.1 transaction message flows, RS-485 Modbus Dynamic Load Management (DLM), RFID authentication, and A/B dual-bank secure OTA.</w:t>
+      </w:r>
+    </w:p>
+    <w:p>
+      <w:pPr>
+        <w:pStyle w:val="ListBullet"/>
+        <w:spacing w:after="40"/>
+        <w:ind w:left="360"/>
+      </w:pPr>
+      <w:r>
+        <w:rPr>
+          <w:color w:val="0066CC"/>
+          <w:sz w:val="21"/>
+          <w:u w:val="single"/>
+        </w:rPr>
         <w:t>EVSE Hardware Schematics &amp; Bring-Up Guide</w:t>
       </w:r>
       <w:r>
@@ -1518,6 +3175,199 @@
           <w:sz w:val="21"/>
         </w:rPr>
         <w:t>): Component-level schematics (CP op-amp buffer, PP divider, contactor driver, H-bridge lock), reinforced creepage/clearance (&gt;= 6-8mm), GDT/MOV surge protection, and bench RCA troubleshooting matrix.</w:t>
+      </w:r>
+    </w:p>
+    <w:p>
+      <w:pPr>
+        <w:pStyle w:val="ListBullet"/>
+        <w:spacing w:after="40"/>
+        <w:ind w:left="360"/>
+      </w:pPr>
+      <w:r>
+        <w:rPr>
+          <w:color w:val="0066CC"/>
+          <w:sz w:val="21"/>
+          <w:u w:val="single"/>
+        </w:rPr>
+        <w:t>Dual Lift Controller Master Hub</w:t>
+      </w:r>
+      <w:r>
+        <w:rPr>
+          <w:color w:val="282C34"/>
+          <w:sz w:val="21"/>
+        </w:rPr>
+        <w:t xml:space="preserve"> (</w:t>
+      </w:r>
+      <w:r>
+        <w:rPr>
+          <w:color w:val="0066CC"/>
+          <w:sz w:val="21"/>
+          <w:u w:val="single"/>
+        </w:rPr>
+        <w:t>Word DOCX</w:t>
+      </w:r>
+      <w:r>
+        <w:rPr>
+          <w:color w:val="282C34"/>
+          <w:sz w:val="21"/>
+        </w:rPr>
+        <w:t>): Master hub for 3-floor and 4-floor dual lift dispatch system, architectural block diagrams, and subsystem interface specifications.</w:t>
+      </w:r>
+    </w:p>
+    <w:p>
+      <w:pPr>
+        <w:pStyle w:val="ListBullet"/>
+        <w:spacing w:after="40"/>
+        <w:ind w:left="360"/>
+      </w:pPr>
+      <w:r>
+        <w:rPr>
+          <w:color w:val="0066CC"/>
+          <w:sz w:val="21"/>
+          <w:u w:val="single"/>
+        </w:rPr>
+        <w:t>3-Floor Dual Lift Gate Logic Design</w:t>
+      </w:r>
+      <w:r>
+        <w:rPr>
+          <w:color w:val="282C34"/>
+          <w:sz w:val="21"/>
+        </w:rPr>
+        <w:t xml:space="preserve"> (</w:t>
+      </w:r>
+      <w:r>
+        <w:rPr>
+          <w:color w:val="0066CC"/>
+          <w:sz w:val="21"/>
+          <w:u w:val="single"/>
+        </w:rPr>
+        <w:t>Word DOCX</w:t>
+      </w:r>
+      <w:r>
+        <w:rPr>
+          <w:color w:val="282C34"/>
+          <w:sz w:val="21"/>
+        </w:rPr>
+        <w:t>): Gate-level realization for 3 floors (Floors 0, 1, 2), 1-hot distance calculation, exhaustive 27-state truth table, K-maps, and motor direction logic (</w:t>
+      </w:r>
+      <w:r>
+        <w:rPr>
+          <w:i/>
+          <w:color w:val="145AA0"/>
+          <w:sz w:val="21"/>
+        </w:rPr>
+        <w:t>UP, DOWN, STOP</w:t>
+      </w:r>
+      <w:r>
+        <w:rPr>
+          <w:color w:val="282C34"/>
+          <w:sz w:val="21"/>
+        </w:rPr>
+        <w:t>).</w:t>
+      </w:r>
+    </w:p>
+    <w:p>
+      <w:pPr>
+        <w:pStyle w:val="ListBullet"/>
+        <w:spacing w:after="40"/>
+        <w:ind w:left="360"/>
+      </w:pPr>
+      <w:r>
+        <w:rPr>
+          <w:color w:val="0066CC"/>
+          <w:sz w:val="21"/>
+          <w:u w:val="single"/>
+        </w:rPr>
+        <w:t>4-Floor Dual Lift Gate Logic Design</w:t>
+      </w:r>
+      <w:r>
+        <w:rPr>
+          <w:color w:val="282C34"/>
+          <w:sz w:val="21"/>
+        </w:rPr>
+        <w:t xml:space="preserve"> (</w:t>
+      </w:r>
+      <w:r>
+        <w:rPr>
+          <w:color w:val="0066CC"/>
+          <w:sz w:val="21"/>
+          <w:u w:val="single"/>
+        </w:rPr>
+        <w:t>Word DOCX</w:t>
+      </w:r>
+      <w:r>
+        <w:rPr>
+          <w:color w:val="282C34"/>
+          <w:sz w:val="21"/>
+        </w:rPr>
+        <w:t>): 2-bit binary arithmetic distance subtractors (</w:t>
+      </w:r>
+      <w:r>
+        <w:rPr>
+          <w:i/>
+          <w:color w:val="145AA0"/>
+          <w:sz w:val="21"/>
+        </w:rPr>
+        <w:t>|R - A|</w:t>
+      </w:r>
+      <w:r>
+        <w:rPr>
+          <w:color w:val="282C34"/>
+          <w:sz w:val="21"/>
+        </w:rPr>
+        <w:t xml:space="preserve">, </w:t>
+      </w:r>
+      <w:r>
+        <w:rPr>
+          <w:i/>
+          <w:color w:val="145AA0"/>
+          <w:sz w:val="21"/>
+        </w:rPr>
+        <w:t>|R - B|</w:t>
+      </w:r>
+      <w:r>
+        <w:rPr>
+          <w:color w:val="282C34"/>
+          <w:sz w:val="21"/>
+        </w:rPr>
+        <w:t>), 2-bit magnitude comparators, 64-state system analysis, nearest dispatch arbiter, and busy-state priority handling.</w:t>
+      </w:r>
+    </w:p>
+    <w:p>
+      <w:pPr>
+        <w:pStyle w:val="ListBullet"/>
+        <w:spacing w:after="40"/>
+        <w:ind w:left="360"/>
+      </w:pPr>
+      <w:r>
+        <w:rPr>
+          <w:color w:val="0066CC"/>
+          <w:sz w:val="21"/>
+          <w:u w:val="single"/>
+        </w:rPr>
+        <w:t>Gate-Level Schematics &amp; Verilog Simulation</w:t>
+      </w:r>
+      <w:r>
+        <w:rPr>
+          <w:color w:val="282C34"/>
+          <w:sz w:val="21"/>
+        </w:rPr>
+        <w:t xml:space="preserve"> (</w:t>
+      </w:r>
+      <w:r>
+        <w:rPr>
+          <w:color w:val="0066CC"/>
+          <w:sz w:val="21"/>
+          <w:u w:val="single"/>
+        </w:rPr>
+        <w:t>Word DOCX</w:t>
+      </w:r>
+      <w:r>
+        <w:rPr>
+          <w:color w:val="282C34"/>
+          <w:sz w:val="21"/>
+        </w:rPr>
+        <w:t>): Standard 7400-series TTL IC Bill of Materials, pin-to-pin schematics, ULN2003 contactor drive, sub-80ns propagation delay analysis, and Verilog simulation test vectors.</w:t>
       </w:r>
     </w:p>
     <w:p>

</xml_diff>

<commit_message>
docs(protocols): complete UART and SPI master hubs, frame analysis, and calculators
</commit_message>
<xml_diff>
--- a/vvdn/README.docx
+++ b/vvdn/README.docx
@@ -99,6 +99,8 @@
               <w:br/>
               <w:t>│   ├── baud_calc.py                   # CLI tool to calculate UART baud rate divisors &amp; error %</w:t>
               <w:br/>
+              <w:t>│   ├── uart_calc.py                   # CLI tool for UART BRG divisors, frame throughput &amp; RS-485 delays</w:t>
+              <w:br/>
               <w:t>│   ├── spi_calc.py                    # CLI tool for SPI timing budgets, round-trip delays &amp; throughput</w:t>
               <w:br/>
               <w:t>│   ├── nfc_calc.py                    # CLI tool for antenna inductance, matching network, Q &amp; NDEF</w:t>
@@ -111,23 +113,31 @@
               <w:br/>
               <w:t>│   ├── ldo_calc.py                    # CLI tool for LDO thermal dissipation, feedback dividers &amp; ESR stability</w:t>
               <w:br/>
+              <w:t>│   ├── mosfet_calc.py                 # CLI tool for MOSFET conduction/switching loss, gate drive &amp; thermal</w:t>
+              <w:br/>
               <w:t>│   └── md_to_docx.py                  # CLI generator to synchronize .md guides into styled .docx files</w:t>
               <w:br/>
               <w:t>├── protocols/</w:t>
               <w:br/>
               <w:t>│   ├── uart/</w:t>
               <w:br/>
-              <w:t>│   │   ├── uart-guide.md (.docx)      # Complete guide on UART architecture &amp; debugging</w:t>
+              <w:t>│   │   ├── README.md (.docx)          # UART master hub, transceiver standards (TTL, RS-232/422/485) &amp; roadmap</w:t>
               <w:br/>
-              <w:t>│   │   └── baud-rate-calculations.md  # Detailed baud rate theory, BRG formulas &amp; error analysis</w:t>
+              <w:t>│   │   ├── uart-guide.md (.docx)      # Complete guide on UART architecture, Linux subsystem &amp; debugging</w:t>
+              <w:br/>
+              <w:t>│   │   ├── uart-frame-and-protocol-analysis.md (.docx) # Frame anatomy, 16x oversampling, 9-bit mode &amp; DMA ring buffers</w:t>
+              <w:br/>
+              <w:t>│   │   └── baud-rate-calculations.md (.docx) # Detailed baud rate theory, BRG formulas &amp; error analysis</w:t>
               <w:br/>
               <w:t>│   ├── spi/</w:t>
               <w:br/>
+              <w:t>│   │   ├── README.md (.docx)          # SPI master hub, standards overview &amp; 4-mode comparison</w:t>
+              <w:br/>
               <w:t>│   │   ├── spi-guide.md (.docx)       # Complete guide on SPI architecture, CPOL/CPHA, Linux spidev &amp; debugging</w:t>
               <w:br/>
-              <w:t>│   │   ├── spi-timing-and-modes.md    # Detailed SPI modes, AC timing budgets &amp; propagation delay analysis</w:t>
+              <w:t>│   │   ├── spi-timing-and-modes.md (.docx) # Detailed SPI modes, AC timing budgets &amp; propagation delay analysis</w:t>
               <w:br/>
-              <w:t>│   │   └── spi-frame-analysis.md      # Detailed SPI data frames, packet structures, archetypes &amp; CRC</w:t>
+              <w:t>│   │   └── spi-frame-analysis.md (.docx) # Detailed SPI data frames, packet structures, archetypes &amp; CRC</w:t>
               <w:br/>
               <w:t>│   ├── nfc/</w:t>
               <w:br/>
@@ -361,6 +371,76 @@
           <w:color w:val="282C34"/>
           <w:sz w:val="21"/>
         </w:rPr>
+        <w:t>[tools/uart_calc.py](file:///home/tthhongs/build_tthongs/tasks_aa_ii/vvdn/tools/uart_calc.py)</w:t>
+      </w:r>
+      <w:r>
+        <w:rPr>
+          <w:color w:val="282C34"/>
+          <w:sz w:val="21"/>
+        </w:rPr>
+        <w:t>: Calculate UART baud divisors, frame timing budgets, payload throughput, and RS-485 cable delays:</w:t>
+      </w:r>
+    </w:p>
+    <w:tbl>
+      <w:tblPr>
+        <w:tblW w:type="auto" w:w="0"/>
+        <w:jc w:val="center"/>
+        <w:tblLook w:firstColumn="1" w:firstRow="1" w:lastColumn="0" w:lastRow="0" w:noHBand="0" w:noVBand="1" w:val="04A0"/>
+      </w:tblPr>
+      <w:tblGrid>
+        <w:gridCol w:w="9792"/>
+      </w:tblGrid>
+      <w:tr>
+        <w:tc>
+          <w:tcPr>
+            <w:tcW w:type="dxa" w:w="9792"/>
+            <w:shd w:fill="F5F6F8"/>
+            <w:tcMar>
+              <w:top w:w="80" w:type="dxa"/>
+              <w:bottom w:w="80" w:type="dxa"/>
+              <w:left w:w="140" w:type="dxa"/>
+              <w:right w:w="140" w:type="dxa"/>
+            </w:tcMar>
+            <w:tcBorders>
+              <w:left w:val="single" w:sz="18" w:space="0" w:color="CBD5E0"/>
+              <w:top w:val="none"/>
+              <w:right w:val="none"/>
+              <w:bottom w:val="none"/>
+            </w:tcBorders>
+          </w:tcPr>
+          <w:p>
+            <w:pPr>
+              <w:spacing w:line="240" w:lineRule="auto" w:after="0"/>
+            </w:pPr>
+            <w:r>
+              <w:rPr>
+                <w:rFonts w:ascii="Consolas" w:hAnsi="Consolas"/>
+                <w:color w:val="2D3748"/>
+                <w:sz w:val="18"/>
+              </w:rPr>
+              <w:t xml:space="preserve">  python3 tools/uart_calc.py --baud --clock 16MHz --baudrate 115200</w:t>
+              <w:br/>
+              <w:t xml:space="preserve">  python3 tools/uart_calc.py --frame --baudrate 115200 --data-bits 8 --parity N --stop-bits 1</w:t>
+              <w:br/>
+              <w:t xml:space="preserve">  python3 tools/uart_calc.py --rs485 --cable-m 100 --baudrate 115200</w:t>
+            </w:r>
+          </w:p>
+        </w:tc>
+      </w:tr>
+    </w:tbl>
+    <w:p/>
+    <w:p>
+      <w:pPr>
+        <w:pStyle w:val="ListBullet"/>
+        <w:spacing w:after="40"/>
+        <w:ind w:left="360"/>
+      </w:pPr>
+      <w:r>
+        <w:rPr>
+          <w:b/>
+          <w:color w:val="282C34"/>
+          <w:sz w:val="21"/>
+        </w:rPr>
         <w:t>[tools/spi_calc.py](file:///home/tthhongs/build_tthongs/tasks_aa_ii/vvdn/tools/spi_calc.py)</w:t>
       </w:r>
       <w:r>
@@ -1171,7 +1251,7 @@
           <w:sz w:val="21"/>
           <w:u w:val="single"/>
         </w:rPr>
-        <w:t>UART Complete Guide</w:t>
+        <w:t>UART Master Architecture &amp; Knowledge Base</w:t>
       </w:r>
       <w:r>
         <w:rPr>
@@ -1193,7 +1273,7 @@
           <w:color w:val="282C34"/>
           <w:sz w:val="21"/>
         </w:rPr>
-        <w:t>): Complete architecture, Linux subsystem, C/Python code, and failure modes.</w:t>
+        <w:t>): Master hub for UART protocols, transceiver standards (TTL, RS-232, RS-422, RS-485), protocol benchmark matrix, and CLI tools.</w:t>
       </w:r>
     </w:p>
     <w:p>
@@ -1208,6 +1288,80 @@
           <w:sz w:val="21"/>
           <w:u w:val="single"/>
         </w:rPr>
+        <w:t>UART Complete Guide</w:t>
+      </w:r>
+      <w:r>
+        <w:rPr>
+          <w:color w:val="282C34"/>
+          <w:sz w:val="21"/>
+        </w:rPr>
+        <w:t xml:space="preserve"> (</w:t>
+      </w:r>
+      <w:r>
+        <w:rPr>
+          <w:color w:val="0066CC"/>
+          <w:sz w:val="21"/>
+          <w:u w:val="single"/>
+        </w:rPr>
+        <w:t>Word DOCX</w:t>
+      </w:r>
+      <w:r>
+        <w:rPr>
+          <w:color w:val="282C34"/>
+          <w:sz w:val="21"/>
+        </w:rPr>
+        <w:t>): Complete architecture, Linux subsystem, C/Python code, and failure modes.</w:t>
+      </w:r>
+    </w:p>
+    <w:p>
+      <w:pPr>
+        <w:pStyle w:val="ListBullet"/>
+        <w:spacing w:after="40"/>
+        <w:ind w:left="360"/>
+      </w:pPr>
+      <w:r>
+        <w:rPr>
+          <w:color w:val="0066CC"/>
+          <w:sz w:val="21"/>
+          <w:u w:val="single"/>
+        </w:rPr>
+        <w:t>UART Frame &amp; Protocol Analysis</w:t>
+      </w:r>
+      <w:r>
+        <w:rPr>
+          <w:color w:val="282C34"/>
+          <w:sz w:val="21"/>
+        </w:rPr>
+        <w:t xml:space="preserve"> (</w:t>
+      </w:r>
+      <w:r>
+        <w:rPr>
+          <w:color w:val="0066CC"/>
+          <w:sz w:val="21"/>
+          <w:u w:val="single"/>
+        </w:rPr>
+        <w:t>Word DOCX</w:t>
+      </w:r>
+      <w:r>
+        <w:rPr>
+          <w:color w:val="282C34"/>
+          <w:sz w:val="21"/>
+        </w:rPr>
+        <w:t>): Bit-level frame anatomy, 16x oversampling clock recovery, majority voting, 9-bit multi-drop addressing, hardware flow control, and DMA circular ring buffers.</w:t>
+      </w:r>
+    </w:p>
+    <w:p>
+      <w:pPr>
+        <w:pStyle w:val="ListBullet"/>
+        <w:spacing w:after="40"/>
+        <w:ind w:left="360"/>
+      </w:pPr>
+      <w:r>
+        <w:rPr>
+          <w:color w:val="0066CC"/>
+          <w:sz w:val="21"/>
+          <w:u w:val="single"/>
+        </w:rPr>
         <w:t>UART Baud Rate Calculations</w:t>
       </w:r>
       <w:r>
@@ -1231,6 +1385,43 @@
           <w:sz w:val="21"/>
         </w:rPr>
         <w:t>): In-depth look at baud vs bit rate, hardware BRG divisor formulas, 16x oversampling, error margins, and oscilloscope measurement.</w:t>
+      </w:r>
+    </w:p>
+    <w:p>
+      <w:pPr>
+        <w:pStyle w:val="ListBullet"/>
+        <w:spacing w:after="40"/>
+        <w:ind w:left="360"/>
+      </w:pPr>
+      <w:r>
+        <w:rPr>
+          <w:color w:val="0066CC"/>
+          <w:sz w:val="21"/>
+          <w:u w:val="single"/>
+        </w:rPr>
+        <w:t>SPI Master Architecture &amp; Knowledge Base</w:t>
+      </w:r>
+      <w:r>
+        <w:rPr>
+          <w:color w:val="282C34"/>
+          <w:sz w:val="21"/>
+        </w:rPr>
+        <w:t xml:space="preserve"> (</w:t>
+      </w:r>
+      <w:r>
+        <w:rPr>
+          <w:color w:val="0066CC"/>
+          <w:sz w:val="21"/>
+          <w:u w:val="single"/>
+        </w:rPr>
+        <w:t>Word DOCX</w:t>
+      </w:r>
+      <w:r>
+        <w:rPr>
+          <w:color w:val="282C34"/>
+          <w:sz w:val="21"/>
+        </w:rPr>
+        <w:t>): Master hub for SPI protocols, 4-mode truth table, multi-target topologies, Quad/Octal SPI extensions, and benchmark comparison.</w:t>
       </w:r>
     </w:p>
     <w:p>

</xml_diff>

<commit_message>
docs(protocols): add circuit connection guides and ASCII schematics for UART, SPI, I2C, LIN, and CAN
</commit_message>
<xml_diff>
--- a/vvdn/README.docx
+++ b/vvdn/README.docx
@@ -127,6 +127,8 @@
               <w:br/>
               <w:t>│   │   ├── uart-frame-and-protocol-analysis.md (.docx) # Frame anatomy, 16x oversampling, 9-bit mode &amp; DMA ring buffers</w:t>
               <w:br/>
+              <w:t>│   │   ├── uart-circuit-and-hardware-connections.md (.docx) # Schematics: MCU-to-MCU, USB bridge, RS-232, RS-485, level shifters</w:t>
+              <w:br/>
               <w:t>│   │   └── baud-rate-calculations.md (.docx) # Detailed baud rate theory, BRG formulas &amp; error analysis</w:t>
               <w:br/>
               <w:t>│   ├── spi/</w:t>
@@ -137,7 +139,9 @@
               <w:br/>
               <w:t>│   │   ├── spi-timing-and-modes.md (.docx) # Detailed SPI modes, AC timing budgets &amp; propagation delay analysis</w:t>
               <w:br/>
-              <w:t>│   │   └── spi-frame-analysis.md (.docx) # Detailed SPI data frames, packet structures, archetypes &amp; CRC</w:t>
+              <w:t>│   │   ├── spi-frame-analysis.md (.docx) # Detailed SPI data frames, packet structures, archetypes &amp; CRC</w:t>
+              <w:br/>
+              <w:t>│   │   └── spi-circuit-and-hardware-connections.md (.docx) # Schematics: Star/daisy-chain, QSPI Flash, isolation &amp; level shifting</w:t>
               <w:br/>
               <w:t>│   ├── nfc/</w:t>
               <w:br/>
@@ -161,6 +165,8 @@
               <w:br/>
               <w:t>│   │   ├── i2c-frame-and-protocol-analysis.md (.docx)     # Frame formats, 7/10-bit addressing, packet archetypes &amp; logic decoding</w:t>
               <w:br/>
+              <w:t>│   │   ├── i2c-circuit-and-hardware-connections.md (.docx)# Schematics: Master/Slaves, MOSFET level-shifter, TCA9548A, P82B715</w:t>
+              <w:br/>
               <w:t>│   │   └── i2c-timing-calculations-and-hardware.md (.docx)# AC timing specs, pull-up sizing math, bus capacitance &amp; PCB design</w:t>
               <w:br/>
               <w:t>│   ├── can/</w:t>
@@ -171,6 +177,8 @@
               <w:br/>
               <w:t>│   │   ├── can-frame-and-protocol-analysis.md (.docx)     # Frame formats (2.0A/B, FD), bit stuffing, J1939, CANopen, UDS &amp; SocketCAN</w:t>
               <w:br/>
+              <w:t>│   │   ├── can-circuit-and-hardware-connections.md (.docx)# Schematics: Transceiver VIO, split termination, CMC, TVS, ISO1042</w:t>
+              <w:br/>
               <w:t>│   │   └── can-timing-bitrates-and-hardware.md (.docx)    # Bit timing budgets, Time Quanta, SJW, TDC, termination &amp; RCA matrix</w:t>
               <w:br/>
               <w:t>│   └── lin/</w:t>
@@ -180,6 +188,8 @@
               <w:t>│       ├── lin-working-and-architecture.md (.docx)        # Single-wire 12V physical layer, asymmetric pull-up, scheduling &amp; sleep/wake</w:t>
               <w:br/>
               <w:t>│       ├── lin-frame-and-protocol-analysis.md (.docx)     # Frame anatomy (Break, Sync 0x55, PID parity, Classic/Enhanced Checksum)</w:t>
+              <w:br/>
+              <w:t>│       ├── lin-circuit-and-hardware-connections.md (.docx)# Schematics: Master/Slave nodes, ISO 7637-2 surge protection, harness wiring</w:t>
               <w:br/>
               <w:t>│       └── lin-timing-synchronization-and-hardware.md (.docx)# Auto-baud sync math, slave RC capture, duty cycles &amp; bench RCA</w:t>
               <w:br/>
@@ -1362,7 +1372,7 @@
           <w:sz w:val="21"/>
           <w:u w:val="single"/>
         </w:rPr>
-        <w:t>UART Baud Rate Calculations</w:t>
+        <w:t>UART Hardware Connections &amp; Circuit Schematics</w:t>
       </w:r>
       <w:r>
         <w:rPr>
@@ -1384,7 +1394,7 @@
           <w:color w:val="282C34"/>
           <w:sz w:val="21"/>
         </w:rPr>
-        <w:t>): In-depth look at baud vs bit rate, hardware BRG divisor formulas, 16x oversampling, error margins, and oscilloscope measurement.</w:t>
+        <w:t>): Circuit schematics for MCU cross-over, USB bridge (CP2102/FT232), bipolar RS-232 (MAX3232), half-duplex RS-485 (MAX485), and BSS138 level shifter.</w:t>
       </w:r>
     </w:p>
     <w:p>
@@ -1399,7 +1409,7 @@
           <w:sz w:val="21"/>
           <w:u w:val="single"/>
         </w:rPr>
-        <w:t>SPI Master Architecture &amp; Knowledge Base</w:t>
+        <w:t>UART Baud Rate Calculations</w:t>
       </w:r>
       <w:r>
         <w:rPr>
@@ -1421,7 +1431,7 @@
           <w:color w:val="282C34"/>
           <w:sz w:val="21"/>
         </w:rPr>
-        <w:t>): Master hub for SPI protocols, 4-mode truth table, multi-target topologies, Quad/Octal SPI extensions, and benchmark comparison.</w:t>
+        <w:t>): In-depth look at baud vs bit rate, hardware BRG divisor formulas, 16x oversampling, error margins, and oscilloscope measurement.</w:t>
       </w:r>
     </w:p>
     <w:p>
@@ -1436,7 +1446,7 @@
           <w:sz w:val="21"/>
           <w:u w:val="single"/>
         </w:rPr>
-        <w:t>SPI Complete Guide</w:t>
+        <w:t>SPI Master Architecture &amp; Knowledge Base</w:t>
       </w:r>
       <w:r>
         <w:rPr>
@@ -1458,7 +1468,7 @@
           <w:color w:val="282C34"/>
           <w:sz w:val="21"/>
         </w:rPr>
-        <w:t>): Complete architecture, CPOL/CPHA modes, QSPI/OSPI variants, Linux spidev, C/Python code, and failure modes.</w:t>
+        <w:t>): Master hub for SPI protocols, 4-mode truth table, multi-target topologies, Quad/Octal SPI extensions, and benchmark comparison.</w:t>
       </w:r>
     </w:p>
     <w:p>
@@ -1473,7 +1483,7 @@
           <w:sz w:val="21"/>
           <w:u w:val="single"/>
         </w:rPr>
-        <w:t>SPI Timing &amp; Modes Guide</w:t>
+        <w:t>SPI Complete Guide</w:t>
       </w:r>
       <w:r>
         <w:rPr>
@@ -1495,7 +1505,7 @@
           <w:color w:val="282C34"/>
           <w:sz w:val="21"/>
         </w:rPr>
-        <w:t>): In-depth look at CPOL/CPHA edge transitions, shift register mechanics, round-trip delay calculations, high-speed signal integrity, and logic analyzer debugging.</w:t>
+        <w:t>): Complete architecture, CPOL/CPHA modes, QSPI/OSPI variants, Linux spidev, C/Python code, and failure modes.</w:t>
       </w:r>
     </w:p>
     <w:p>
@@ -1510,7 +1520,7 @@
           <w:sz w:val="21"/>
           <w:u w:val="single"/>
         </w:rPr>
-        <w:t>SPI Data Frame Analysis</w:t>
+        <w:t>SPI Timing &amp; Modes Guide</w:t>
       </w:r>
       <w:r>
         <w:rPr>
@@ -1532,7 +1542,7 @@
           <w:color w:val="282C34"/>
           <w:sz w:val="21"/>
         </w:rPr>
-        <w:t>): Deep dive on physical vs logical framing, command/address/dummy phases, Flash/IMU/ADC/Safe-SPI archetypes, CRC-8, and multi-segment Linux transfers.</w:t>
+        <w:t>): In-depth look at CPOL/CPHA edge transitions, shift register mechanics, round-trip delay calculations, high-speed signal integrity, and logic analyzer debugging.</w:t>
       </w:r>
     </w:p>
     <w:p>
@@ -1547,7 +1557,7 @@
           <w:sz w:val="21"/>
           <w:u w:val="single"/>
         </w:rPr>
-        <w:t>NFC Knowledge Base Index</w:t>
+        <w:t>SPI Data Frame Analysis</w:t>
       </w:r>
       <w:r>
         <w:rPr>
@@ -1569,7 +1579,7 @@
           <w:color w:val="282C34"/>
           <w:sz w:val="21"/>
         </w:rPr>
-        <w:t>): Master hub for NFC protocols, ISO/IEC standards map, transceiver comparison (PN532, MFRC522, ST25R3916, TRF7970A), and glossary.</w:t>
+        <w:t>): Deep dive on physical vs logical framing, command/address/dummy phases, Flash/IMU/ADC/Safe-SPI archetypes, CRC-8, and multi-segment Linux transfers.</w:t>
       </w:r>
     </w:p>
     <w:p>
@@ -1584,7 +1594,7 @@
           <w:sz w:val="21"/>
           <w:u w:val="single"/>
         </w:rPr>
-        <w:t>NFC &amp; SPI Interaction Guide (Mentor Briefing)</w:t>
+        <w:t>SPI Hardware Connections &amp; Circuit Schematics</w:t>
       </w:r>
       <w:r>
         <w:rPr>
@@ -1606,7 +1616,7 @@
           <w:color w:val="282C34"/>
           <w:sz w:val="21"/>
         </w:rPr>
-        <w:t>): Conceptual explainer on how SPI and RFID frontends interact to create NFC, step-by-step transaction walkthrough, why SPI over I2C, and mentor defense Q&amp;A.</w:t>
+        <w:t>): Circuit schematics for single-slave with damping, multi-slave star routing, shift-register daisy-chaining, QSPI Flash (W25Q128JV), and galvanic isolation.</w:t>
       </w:r>
     </w:p>
     <w:p>
@@ -1621,7 +1631,7 @@
           <w:sz w:val="21"/>
           <w:u w:val="single"/>
         </w:rPr>
-        <w:t>NFC RF &amp; Physical Layer Guide</w:t>
+        <w:t>NFC Knowledge Base Index</w:t>
       </w:r>
       <w:r>
         <w:rPr>
@@ -1643,22 +1653,7 @@
           <w:color w:val="282C34"/>
           <w:sz w:val="21"/>
         </w:rPr>
-        <w:t xml:space="preserve">): Near-field inductive coupling physics, Biot-Savart, 100% vs 10% ASK, 848 kHz subcarrier load modulation, antenna </w:t>
-      </w:r>
-      <w:r>
-        <w:rPr>
-          <w:i/>
-          <w:color w:val="145AA0"/>
-          <w:sz w:val="21"/>
-        </w:rPr>
-        <w:t>Q</w:t>
-      </w:r>
-      <w:r>
-        <w:rPr>
-          <w:color w:val="282C34"/>
-          <w:sz w:val="21"/>
-        </w:rPr>
-        <w:t>-factor, EMC filters, and ferrite shielding against metal surfaces.</w:t>
+        <w:t>): Master hub for NFC protocols, ISO/IEC standards map, transceiver comparison (PN532, MFRC522, ST25R3916, TRF7970A), and glossary.</w:t>
       </w:r>
     </w:p>
     <w:p>
@@ -1673,7 +1668,7 @@
           <w:sz w:val="21"/>
           <w:u w:val="single"/>
         </w:rPr>
-        <w:t>NFC SPI Transceiver Interface Guide</w:t>
+        <w:t>NFC &amp; SPI Interaction Guide (Mentor Briefing)</w:t>
       </w:r>
       <w:r>
         <w:rPr>
@@ -1695,7 +1690,7 @@
           <w:color w:val="282C34"/>
           <w:sz w:val="21"/>
         </w:rPr>
-        <w:t>): 4-wire SPI + sideband GPIOs (CS#, IRQ, RSTPD), Register-driven vs Packet-driven frontends, the critical LSB-first bit order trap, FIFO watermark interrupts, and AC timing budgets.</w:t>
+        <w:t>): Conceptual explainer on how SPI and RFID frontends interact to create NFC, step-by-step transaction walkthrough, why SPI over I2C, and mentor defense Q&amp;A.</w:t>
       </w:r>
     </w:p>
     <w:p>
@@ -1710,7 +1705,7 @@
           <w:sz w:val="21"/>
           <w:u w:val="single"/>
         </w:rPr>
-        <w:t>ISO/IEC 14443 Protocol &amp; Anti-Collision Guide</w:t>
+        <w:t>NFC RF &amp; Physical Layer Guide</w:t>
       </w:r>
       <w:r>
         <w:rPr>
@@ -1732,7 +1727,22 @@
           <w:color w:val="282C34"/>
           <w:sz w:val="21"/>
         </w:rPr>
-        <w:t>): State machine, 5.0 ms guard delay, 7-bit unaligned REQA/WUPA short frames, ATQA decoding, Cascade Levels 1/2/3 bit-oriented collision walk, SAK resolution, and ISO 14443-4 T=CL APDU transport.</w:t>
+        <w:t xml:space="preserve">): Near-field inductive coupling physics, Biot-Savart, 100% vs 10% ASK, 848 kHz subcarrier load modulation, antenna </w:t>
+      </w:r>
+      <w:r>
+        <w:rPr>
+          <w:i/>
+          <w:color w:val="145AA0"/>
+          <w:sz w:val="21"/>
+        </w:rPr>
+        <w:t>Q</w:t>
+      </w:r>
+      <w:r>
+        <w:rPr>
+          <w:color w:val="282C34"/>
+          <w:sz w:val="21"/>
+        </w:rPr>
+        <w:t>-factor, EMC filters, and ferrite shielding against metal surfaces.</w:t>
       </w:r>
     </w:p>
     <w:p>
@@ -1747,7 +1757,7 @@
           <w:sz w:val="21"/>
           <w:u w:val="single"/>
         </w:rPr>
-        <w:t>NFC NDEF &amp; Card Emulation Guide</w:t>
+        <w:t>NFC SPI Transceiver Interface Guide</w:t>
       </w:r>
       <w:r>
         <w:rPr>
@@ -1769,7 +1779,7 @@
           <w:color w:val="282C34"/>
           <w:sz w:val="21"/>
         </w:rPr>
-        <w:t>): NFC Forum Tag Types 1–5, Capability Containers (CC), NDEF message framing, Record headers (TNF, RTD URI/Text/MIME), Peer-to-Peer (LLCP/SNEP), and Host Card Emulation (HCE) via SPI.</w:t>
+        <w:t>): 4-wire SPI + sideband GPIOs (CS#, IRQ, RSTPD), Register-driven vs Packet-driven frontends, the critical LSB-first bit order trap, FIFO watermark interrupts, and AC timing budgets.</w:t>
       </w:r>
     </w:p>
     <w:p>
@@ -1784,7 +1794,7 @@
           <w:sz w:val="21"/>
           <w:u w:val="single"/>
         </w:rPr>
-        <w:t>NFC Firmware, Driver &amp; Debugging Guide</w:t>
+        <w:t>ISO/IEC 14443 Protocol &amp; Anti-Collision Guide</w:t>
       </w:r>
       <w:r>
         <w:rPr>
@@ -1806,37 +1816,7 @@
           <w:color w:val="282C34"/>
           <w:sz w:val="21"/>
         </w:rPr>
-        <w:t>): Production-grade modular C driver, Linux kernel NFC subsystem (</w:t>
-      </w:r>
-      <w:r>
-        <w:rPr>
-          <w:rFonts w:ascii="Consolas" w:hAnsi="Consolas"/>
-          <w:color w:val="B4283C"/>
-          <w:sz w:val="18"/>
-        </w:rPr>
-        <w:t>drivers/nfc</w:t>
-      </w:r>
-      <w:r>
-        <w:rPr>
-          <w:color w:val="282C34"/>
-          <w:sz w:val="21"/>
-        </w:rPr>
-        <w:t xml:space="preserve">, Device Tree, </w:t>
-      </w:r>
-      <w:r>
-        <w:rPr>
-          <w:rFonts w:ascii="Consolas" w:hAnsi="Consolas"/>
-          <w:color w:val="B4283C"/>
-          <w:sz w:val="18"/>
-        </w:rPr>
-        <w:t>spidev</w:t>
-      </w:r>
-      <w:r>
-        <w:rPr>
-          <w:color w:val="282C34"/>
-          <w:sz w:val="21"/>
-        </w:rPr>
-        <w:t>), 4-step oscilloscope/logic analyzer bring-up, and RCA troubleshooting matrix.</w:t>
+        <w:t>): State machine, 5.0 ms guard delay, 7-bit unaligned REQA/WUPA short frames, ATQA decoding, Cascade Levels 1/2/3 bit-oriented collision walk, SAK resolution, and ISO 14443-4 T=CL APDU transport.</w:t>
       </w:r>
     </w:p>
     <w:p>
@@ -1851,7 +1831,7 @@
           <w:sz w:val="21"/>
           <w:u w:val="single"/>
         </w:rPr>
-        <w:t>I2C Master Architecture &amp; Knowledge Base</w:t>
+        <w:t>NFC NDEF &amp; Card Emulation Guide</w:t>
       </w:r>
       <w:r>
         <w:rPr>
@@ -1873,7 +1853,7 @@
           <w:color w:val="282C34"/>
           <w:sz w:val="21"/>
         </w:rPr>
-        <w:t>): Master hub for I2C protocol standards, speed modes (100k, 400k, 1M, 3.4M), bus comparison matrix, and hardware quick references.</w:t>
+        <w:t>): NFC Forum Tag Types 1–5, Capability Containers (CC), NDEF message framing, Record headers (TNF, RTD URI/Text/MIME), Peer-to-Peer (LLCP/SNEP), and Host Card Emulation (HCE) via SPI.</w:t>
       </w:r>
     </w:p>
     <w:p>
@@ -1888,7 +1868,7 @@
           <w:sz w:val="21"/>
           <w:u w:val="single"/>
         </w:rPr>
-        <w:t>I2C Working Mechanism &amp; Architecture</w:t>
+        <w:t>NFC Firmware, Driver &amp; Debugging Guide</w:t>
       </w:r>
       <w:r>
         <w:rPr>
@@ -1910,7 +1890,37 @@
           <w:color w:val="282C34"/>
           <w:sz w:val="21"/>
         </w:rPr>
-        <w:t>): Physical open-drain layer, wired-AND logic, bidirectional MOSFET level shifters, clock synchronization, clock stretching, multi-master arbitration, spike filters, and stuck SDA bus recovery.</w:t>
+        <w:t>): Production-grade modular C driver, Linux kernel NFC subsystem (</w:t>
+      </w:r>
+      <w:r>
+        <w:rPr>
+          <w:rFonts w:ascii="Consolas" w:hAnsi="Consolas"/>
+          <w:color w:val="B4283C"/>
+          <w:sz w:val="18"/>
+        </w:rPr>
+        <w:t>drivers/nfc</w:t>
+      </w:r>
+      <w:r>
+        <w:rPr>
+          <w:color w:val="282C34"/>
+          <w:sz w:val="21"/>
+        </w:rPr>
+        <w:t xml:space="preserve">, Device Tree, </w:t>
+      </w:r>
+      <w:r>
+        <w:rPr>
+          <w:rFonts w:ascii="Consolas" w:hAnsi="Consolas"/>
+          <w:color w:val="B4283C"/>
+          <w:sz w:val="18"/>
+        </w:rPr>
+        <w:t>spidev</w:t>
+      </w:r>
+      <w:r>
+        <w:rPr>
+          <w:color w:val="282C34"/>
+          <w:sz w:val="21"/>
+        </w:rPr>
+        <w:t>), 4-step oscilloscope/logic analyzer bring-up, and RCA troubleshooting matrix.</w:t>
       </w:r>
     </w:p>
     <w:p>
@@ -1925,7 +1935,7 @@
           <w:sz w:val="21"/>
           <w:u w:val="single"/>
         </w:rPr>
-        <w:t>I2C Frame &amp; Protocol Analysis</w:t>
+        <w:t>I2C Master Architecture &amp; Knowledge Base</w:t>
       </w:r>
       <w:r>
         <w:rPr>
@@ -1947,7 +1957,7 @@
           <w:color w:val="282C34"/>
           <w:sz w:val="21"/>
         </w:rPr>
-        <w:t>): Bit-level frame anatomy (START, STOP, Repeated START), 9-bit byte units, ACK/NACK signaling, 7-bit vs 8-bit addressing traps, 10-bit addressing frames, reserved addresses, 5 transaction archetypes, and logic analyzer frame decoding.</w:t>
+        <w:t>): Master hub for I2C protocol standards, speed modes (100k, 400k, 1M, 3.4M), bus comparison matrix, and hardware quick references.</w:t>
       </w:r>
     </w:p>
     <w:p>
@@ -1962,7 +1972,7 @@
           <w:sz w:val="21"/>
           <w:u w:val="single"/>
         </w:rPr>
-        <w:t>I2C AC Timing, Pull-Up Calculations &amp; Hardware</w:t>
+        <w:t>I2C Working Mechanism &amp; Architecture</w:t>
       </w:r>
       <w:r>
         <w:rPr>
@@ -1984,52 +1994,7 @@
           <w:color w:val="282C34"/>
           <w:sz w:val="21"/>
         </w:rPr>
-        <w:t xml:space="preserve">): AC timing parameter matrix, mathematical derivation of </w:t>
-      </w:r>
-      <w:r>
-        <w:rPr>
-          <w:i/>
-          <w:color w:val="145AA0"/>
-          <w:sz w:val="21"/>
-        </w:rPr>
-        <w:t>R_{p(min)</w:t>
-      </w:r>
-      <w:r>
-        <w:rPr>
-          <w:color w:val="282C34"/>
-          <w:sz w:val="21"/>
-        </w:rPr>
-        <w:t xml:space="preserve"> and </w:t>
-      </w:r>
-      <w:r>
-        <w:rPr>
-          <w:i/>
-          <w:color w:val="145AA0"/>
-          <w:sz w:val="21"/>
-        </w:rPr>
-        <w:t>R_{p(max)</w:t>
-      </w:r>
-      <w:r>
-        <w:rPr>
-          <w:color w:val="282C34"/>
-          <w:sz w:val="21"/>
-        </w:rPr>
-        <w:t>, bus capacitance budgeting (</w:t>
-      </w:r>
-      <w:r>
-        <w:rPr>
-          <w:i/>
-          <w:color w:val="145AA0"/>
-          <w:sz w:val="21"/>
-        </w:rPr>
-        <w:t>C_b</w:t>
-      </w:r>
-      <w:r>
-        <w:rPr>
-          <w:color w:val="282C34"/>
-          <w:sz w:val="21"/>
-        </w:rPr>
-        <w:t>), active bus accelerators, PCB layout &amp; crosstalk shielding, and bench RCA troubleshooting matrix.</w:t>
+        <w:t>): Physical open-drain layer, wired-AND logic, bidirectional MOSFET level shifters, clock synchronization, clock stretching, multi-master arbitration, spike filters, and stuck SDA bus recovery.</w:t>
       </w:r>
     </w:p>
     <w:p>
@@ -2044,7 +2009,7 @@
           <w:sz w:val="21"/>
           <w:u w:val="single"/>
         </w:rPr>
-        <w:t>CAN Master Architecture &amp; Knowledge Base</w:t>
+        <w:t>I2C Frame &amp; Protocol Analysis</w:t>
       </w:r>
       <w:r>
         <w:rPr>
@@ -2066,7 +2031,7 @@
           <w:color w:val="282C34"/>
           <w:sz w:val="21"/>
         </w:rPr>
-        <w:t>): Master hub for CAN/CAN-FD standards, generational comparison matrix (2.0A/B, FD, XL), bus architecture, and CLI tools.</w:t>
+        <w:t>): Bit-level frame anatomy (START, STOP, Repeated START), 9-bit byte units, ACK/NACK signaling, 7-bit vs 8-bit addressing traps, 10-bit addressing frames, reserved addresses, 5 transaction archetypes, and logic analyzer frame decoding.</w:t>
       </w:r>
     </w:p>
     <w:p>
@@ -2081,7 +2046,7 @@
           <w:sz w:val="21"/>
           <w:u w:val="single"/>
         </w:rPr>
-        <w:t>CAN Working Mechanism &amp; Physical Layer</w:t>
+        <w:t>I2C Hardware Connections &amp; Circuit Schematics</w:t>
       </w:r>
       <w:r>
         <w:rPr>
@@ -2103,7 +2068,7 @@
           <w:color w:val="282C34"/>
           <w:sz w:val="21"/>
         </w:rPr>
-        <w:t>): Physical differential signaling, Recessive/Dominant voltage levels, transceivers, non-destructive bitwise arbitration, error detection, fault confinement state machine (TEC/REC), and acceptance filters.</w:t>
+        <w:t>): Circuit schematics for multi-target bus, BSS138 bi-voltage level shifter, TCA9548A multiplexer for address conflicts, and P82B715 long-distance buffer.</w:t>
       </w:r>
     </w:p>
     <w:p>
@@ -2118,7 +2083,7 @@
           <w:sz w:val="21"/>
           <w:u w:val="single"/>
         </w:rPr>
-        <w:t>CAN Frame &amp; Protocol Analysis</w:t>
+        <w:t>I2C AC Timing, Pull-Up Calculations &amp; Hardware</w:t>
       </w:r>
       <w:r>
         <w:rPr>
@@ -2140,7 +2105,52 @@
           <w:color w:val="282C34"/>
           <w:sz w:val="21"/>
         </w:rPr>
-        <w:t>): Bit-by-bit frame anatomy (Standard 2.0A, Extended 2.0B, CAN FD), bit-stuffing overhead, SAE J1939, CANopen, UDS over CAN-TP (ISO 15765-2), and Linux SocketCAN C driver.</w:t>
+        <w:t xml:space="preserve">): AC timing parameter matrix, mathematical derivation of </w:t>
+      </w:r>
+      <w:r>
+        <w:rPr>
+          <w:i/>
+          <w:color w:val="145AA0"/>
+          <w:sz w:val="21"/>
+        </w:rPr>
+        <w:t>R_{p(min)</w:t>
+      </w:r>
+      <w:r>
+        <w:rPr>
+          <w:color w:val="282C34"/>
+          <w:sz w:val="21"/>
+        </w:rPr>
+        <w:t xml:space="preserve"> and </w:t>
+      </w:r>
+      <w:r>
+        <w:rPr>
+          <w:i/>
+          <w:color w:val="145AA0"/>
+          <w:sz w:val="21"/>
+        </w:rPr>
+        <w:t>R_{p(max)</w:t>
+      </w:r>
+      <w:r>
+        <w:rPr>
+          <w:color w:val="282C34"/>
+          <w:sz w:val="21"/>
+        </w:rPr>
+        <w:t>, bus capacitance budgeting (</w:t>
+      </w:r>
+      <w:r>
+        <w:rPr>
+          <w:i/>
+          <w:color w:val="145AA0"/>
+          <w:sz w:val="21"/>
+        </w:rPr>
+        <w:t>C_b</w:t>
+      </w:r>
+      <w:r>
+        <w:rPr>
+          <w:color w:val="282C34"/>
+          <w:sz w:val="21"/>
+        </w:rPr>
+        <w:t>), active bus accelerators, PCB layout &amp; crosstalk shielding, and bench RCA troubleshooting matrix.</w:t>
       </w:r>
     </w:p>
     <w:p>
@@ -2155,7 +2165,7 @@
           <w:sz w:val="21"/>
           <w:u w:val="single"/>
         </w:rPr>
-        <w:t>CAN Timing, Bitrates &amp; Hardware Engineering</w:t>
+        <w:t>CAN Master Architecture &amp; Knowledge Base</w:t>
       </w:r>
       <w:r>
         <w:rPr>
@@ -2177,7 +2187,7 @@
           <w:color w:val="282C34"/>
           <w:sz w:val="21"/>
         </w:rPr>
-        <w:t>): Bit timing theory, Time Quanta, SJW, sample point optimization, CAN FD dual-bitrate timing, Transmitter Delay Compensation (TDC/SSP), bus length trade-offs, split termination, and bench RCA matrix.</w:t>
+        <w:t>): Master hub for CAN/CAN-FD standards, generational comparison matrix (2.0A/B, FD, XL), bus architecture, and CLI tools.</w:t>
       </w:r>
     </w:p>
     <w:p>
@@ -2192,7 +2202,7 @@
           <w:sz w:val="21"/>
           <w:u w:val="single"/>
         </w:rPr>
-        <w:t>LIN Master Architecture &amp; Knowledge Base</w:t>
+        <w:t>CAN Working Mechanism &amp; Physical Layer</w:t>
       </w:r>
       <w:r>
         <w:rPr>
@@ -2214,7 +2224,7 @@
           <w:color w:val="282C34"/>
           <w:sz w:val="21"/>
         </w:rPr>
-        <w:t>): Master hub for LIN protocol standards (LIN 1.3, 2.0, 2.1, 2.2A, ISO 17987), vehicle sub-bus architecture, and comparison matrix.</w:t>
+        <w:t>): Physical differential signaling, Recessive/Dominant voltage levels, transceivers, non-destructive bitwise arbitration, error detection, fault confinement state machine (TEC/REC), and acceptance filters.</w:t>
       </w:r>
     </w:p>
     <w:p>
@@ -2229,7 +2239,7 @@
           <w:sz w:val="21"/>
           <w:u w:val="single"/>
         </w:rPr>
-        <w:t>LIN Working Mechanism &amp; Electrical Architecture</w:t>
+        <w:t>CAN Frame &amp; Protocol Analysis</w:t>
       </w:r>
       <w:r>
         <w:rPr>
@@ -2251,37 +2261,7 @@
           <w:color w:val="282C34"/>
           <w:sz w:val="21"/>
         </w:rPr>
-        <w:t>): Single-wire 12V physical layer, asymmetric termination (</w:t>
-      </w:r>
-      <w:r>
-        <w:rPr>
-          <w:i/>
-          <w:color w:val="145AA0"/>
-          <w:sz w:val="21"/>
-        </w:rPr>
-        <w:t>1k\Omega</w:t>
-      </w:r>
-      <w:r>
-        <w:rPr>
-          <w:color w:val="282C34"/>
-          <w:sz w:val="21"/>
-        </w:rPr>
-        <w:t xml:space="preserve"> Master, </w:t>
-      </w:r>
-      <w:r>
-        <w:rPr>
-          <w:i/>
-          <w:color w:val="145AA0"/>
-          <w:sz w:val="21"/>
-        </w:rPr>
-        <w:t>30k\Omega</w:t>
-      </w:r>
-      <w:r>
-        <w:rPr>
-          <w:color w:val="282C34"/>
-          <w:sz w:val="21"/>
-        </w:rPr>
-        <w:t xml:space="preserve"> Slave), transceiver slew-rate control, deterministic schedule tables, sleep/wake-up protocol, and node configuration (NAD).</w:t>
+        <w:t>): Bit-by-bit frame anatomy (Standard 2.0A, Extended 2.0B, CAN FD), bit-stuffing overhead, SAE J1939, CANopen, UDS over CAN-TP (ISO 15765-2), and Linux SocketCAN C driver.</w:t>
       </w:r>
     </w:p>
     <w:p>
@@ -2296,7 +2276,7 @@
           <w:sz w:val="21"/>
           <w:u w:val="single"/>
         </w:rPr>
-        <w:t>LIN Frame &amp; Protocol Analysis</w:t>
+        <w:t>CAN Hardware Connections &amp; Circuit Schematics</w:t>
       </w:r>
       <w:r>
         <w:rPr>
@@ -2318,7 +2298,118 @@
           <w:color w:val="282C34"/>
           <w:sz w:val="21"/>
         </w:rPr>
-        <w:t xml:space="preserve">): Bit-level frame anatomy (Break </w:t>
+        <w:t>): Circuit schematics for TJA1051 VIO transceiver, split termination, common-mode choke (51µH), TVS ESD diodes, and ISO1042 galvanically isolated nodes.</w:t>
+      </w:r>
+    </w:p>
+    <w:p>
+      <w:pPr>
+        <w:pStyle w:val="ListBullet"/>
+        <w:spacing w:after="40"/>
+        <w:ind w:left="360"/>
+      </w:pPr>
+      <w:r>
+        <w:rPr>
+          <w:color w:val="0066CC"/>
+          <w:sz w:val="21"/>
+          <w:u w:val="single"/>
+        </w:rPr>
+        <w:t>CAN Timing, Bitrates &amp; Hardware Engineering</w:t>
+      </w:r>
+      <w:r>
+        <w:rPr>
+          <w:color w:val="282C34"/>
+          <w:sz w:val="21"/>
+        </w:rPr>
+        <w:t xml:space="preserve"> (</w:t>
+      </w:r>
+      <w:r>
+        <w:rPr>
+          <w:color w:val="0066CC"/>
+          <w:sz w:val="21"/>
+          <w:u w:val="single"/>
+        </w:rPr>
+        <w:t>Word DOCX</w:t>
+      </w:r>
+      <w:r>
+        <w:rPr>
+          <w:color w:val="282C34"/>
+          <w:sz w:val="21"/>
+        </w:rPr>
+        <w:t>): Bit timing theory, Time Quanta, SJW, sample point optimization, CAN FD dual-bitrate timing, Transmitter Delay Compensation (TDC/SSP), bus length trade-offs, split termination, and bench RCA matrix.</w:t>
+      </w:r>
+    </w:p>
+    <w:p>
+      <w:pPr>
+        <w:pStyle w:val="ListBullet"/>
+        <w:spacing w:after="40"/>
+        <w:ind w:left="360"/>
+      </w:pPr>
+      <w:r>
+        <w:rPr>
+          <w:color w:val="0066CC"/>
+          <w:sz w:val="21"/>
+          <w:u w:val="single"/>
+        </w:rPr>
+        <w:t>LIN Master Architecture &amp; Knowledge Base</w:t>
+      </w:r>
+      <w:r>
+        <w:rPr>
+          <w:color w:val="282C34"/>
+          <w:sz w:val="21"/>
+        </w:rPr>
+        <w:t xml:space="preserve"> (</w:t>
+      </w:r>
+      <w:r>
+        <w:rPr>
+          <w:color w:val="0066CC"/>
+          <w:sz w:val="21"/>
+          <w:u w:val="single"/>
+        </w:rPr>
+        <w:t>Word DOCX</w:t>
+      </w:r>
+      <w:r>
+        <w:rPr>
+          <w:color w:val="282C34"/>
+          <w:sz w:val="21"/>
+        </w:rPr>
+        <w:t>): Master hub for LIN protocol standards (LIN 1.3, 2.0, 2.1, 2.2A, ISO 17987), vehicle sub-bus architecture, and comparison matrix.</w:t>
+      </w:r>
+    </w:p>
+    <w:p>
+      <w:pPr>
+        <w:pStyle w:val="ListBullet"/>
+        <w:spacing w:after="40"/>
+        <w:ind w:left="360"/>
+      </w:pPr>
+      <w:r>
+        <w:rPr>
+          <w:color w:val="0066CC"/>
+          <w:sz w:val="21"/>
+          <w:u w:val="single"/>
+        </w:rPr>
+        <w:t>LIN Working Mechanism &amp; Electrical Architecture</w:t>
+      </w:r>
+      <w:r>
+        <w:rPr>
+          <w:color w:val="282C34"/>
+          <w:sz w:val="21"/>
+        </w:rPr>
+        <w:t xml:space="preserve"> (</w:t>
+      </w:r>
+      <w:r>
+        <w:rPr>
+          <w:color w:val="0066CC"/>
+          <w:sz w:val="21"/>
+          <w:u w:val="single"/>
+        </w:rPr>
+        <w:t>Word DOCX</w:t>
+      </w:r>
+      <w:r>
+        <w:rPr>
+          <w:color w:val="282C34"/>
+          <w:sz w:val="21"/>
+        </w:rPr>
+        <w:t>): Single-wire 12V physical layer, asymmetric termination (</w:t>
       </w:r>
       <w:r>
         <w:rPr>
@@ -2326,6 +2417,73 @@
           <w:color w:val="145AA0"/>
           <w:sz w:val="21"/>
         </w:rPr>
+        <w:t>1k\Omega</w:t>
+      </w:r>
+      <w:r>
+        <w:rPr>
+          <w:color w:val="282C34"/>
+          <w:sz w:val="21"/>
+        </w:rPr>
+        <w:t xml:space="preserve"> Master, </w:t>
+      </w:r>
+      <w:r>
+        <w:rPr>
+          <w:i/>
+          <w:color w:val="145AA0"/>
+          <w:sz w:val="21"/>
+        </w:rPr>
+        <w:t>30k\Omega</w:t>
+      </w:r>
+      <w:r>
+        <w:rPr>
+          <w:color w:val="282C34"/>
+          <w:sz w:val="21"/>
+        </w:rPr>
+        <w:t xml:space="preserve"> Slave), transceiver slew-rate control, deterministic schedule tables, sleep/wake-up protocol, and node configuration (NAD).</w:t>
+      </w:r>
+    </w:p>
+    <w:p>
+      <w:pPr>
+        <w:pStyle w:val="ListBullet"/>
+        <w:spacing w:after="40"/>
+        <w:ind w:left="360"/>
+      </w:pPr>
+      <w:r>
+        <w:rPr>
+          <w:color w:val="0066CC"/>
+          <w:sz w:val="21"/>
+          <w:u w:val="single"/>
+        </w:rPr>
+        <w:t>LIN Frame &amp; Protocol Analysis</w:t>
+      </w:r>
+      <w:r>
+        <w:rPr>
+          <w:color w:val="282C34"/>
+          <w:sz w:val="21"/>
+        </w:rPr>
+        <w:t xml:space="preserve"> (</w:t>
+      </w:r>
+      <w:r>
+        <w:rPr>
+          <w:color w:val="0066CC"/>
+          <w:sz w:val="21"/>
+          <w:u w:val="single"/>
+        </w:rPr>
+        <w:t>Word DOCX</w:t>
+      </w:r>
+      <w:r>
+        <w:rPr>
+          <w:color w:val="282C34"/>
+          <w:sz w:val="21"/>
+        </w:rPr>
+        <w:t xml:space="preserve">): Bit-level frame anatomy (Break </w:t>
+      </w:r>
+      <w:r>
+        <w:rPr>
+          <w:i/>
+          <w:color w:val="145AA0"/>
+          <w:sz w:val="21"/>
+        </w:rPr>
         <w:t>≥ 13</w:t>
       </w:r>
       <w:r>
@@ -2334,6 +2492,43 @@
           <w:sz w:val="21"/>
         </w:rPr>
         <w:t xml:space="preserve"> bits, Sync 0x55, PID parity equations P0/P1), Classic vs Enhanced Checksum algorithms, frame types, LIN TP, waveform decoding, and MCU UART driver.</w:t>
+      </w:r>
+    </w:p>
+    <w:p>
+      <w:pPr>
+        <w:pStyle w:val="ListBullet"/>
+        <w:spacing w:after="40"/>
+        <w:ind w:left="360"/>
+      </w:pPr>
+      <w:r>
+        <w:rPr>
+          <w:color w:val="0066CC"/>
+          <w:sz w:val="21"/>
+          <w:u w:val="single"/>
+        </w:rPr>
+        <w:t>LIN Hardware Connections &amp; Circuit Schematics</w:t>
+      </w:r>
+      <w:r>
+        <w:rPr>
+          <w:color w:val="282C34"/>
+          <w:sz w:val="21"/>
+        </w:rPr>
+        <w:t xml:space="preserve"> (</w:t>
+      </w:r>
+      <w:r>
+        <w:rPr>
+          <w:color w:val="0066CC"/>
+          <w:sz w:val="21"/>
+          <w:u w:val="single"/>
+        </w:rPr>
+        <w:t>Word DOCX</w:t>
+      </w:r>
+      <w:r>
+        <w:rPr>
+          <w:color w:val="282C34"/>
+          <w:sz w:val="21"/>
+        </w:rPr>
+        <w:t>): Circuit schematics for automotive Master Node (1kΩ + BAS21 diode), Slave Node (internal 30kΩ), ISO 7637-2 surge protection, and vehicle harness wiring.</w:t>
       </w:r>
     </w:p>
     <w:p>

</xml_diff>

<commit_message>
docs(power-electronics): add comprehensive Power MOSFET and LDO power electronics guides and schematics
</commit_message>
<xml_diff>
--- a/vvdn/README.docx
+++ b/vvdn/README.docx
@@ -2818,6 +2818,43 @@
           <w:sz w:val="21"/>
           <w:u w:val="single"/>
         </w:rPr>
+        <w:t>LDOs in Power Electronics: Architectures &amp; Rugged Protection</w:t>
+      </w:r>
+      <w:r>
+        <w:rPr>
+          <w:color w:val="282C34"/>
+          <w:sz w:val="21"/>
+        </w:rPr>
+        <w:t xml:space="preserve"> (</w:t>
+      </w:r>
+      <w:r>
+        <w:rPr>
+          <w:color w:val="0066CC"/>
+          <w:sz w:val="21"/>
+          <w:u w:val="single"/>
+        </w:rPr>
+        <w:t>Word DOCX</w:t>
+      </w:r>
+      <w:r>
+        <w:rPr>
+          <w:color w:val="282C34"/>
+          <w:sz w:val="21"/>
+        </w:rPr>
+        <w:t>): Hybrid SMPS pre-regulator + LDO post-regulator architecture, dynamic headroom sizing, high-current paralleling (ballast resistors vs SET-pin current mirrors), reverse-current backfeeding protection under bus collapse, inrush soft-start, and industrial 24V-to-3.3V analog power stage schematic.</w:t>
+      </w:r>
+    </w:p>
+    <w:p>
+      <w:pPr>
+        <w:pStyle w:val="ListBullet"/>
+        <w:spacing w:after="40"/>
+        <w:ind w:left="360"/>
+      </w:pPr>
+      <w:r>
+        <w:rPr>
+          <w:color w:val="0066CC"/>
+          <w:sz w:val="21"/>
+          <w:u w:val="single"/>
+        </w:rPr>
         <w:t>MOSFET Master Architecture &amp; Study Guide</w:t>
       </w:r>
       <w:r>
@@ -2841,6 +2878,58 @@
           <w:sz w:val="21"/>
         </w:rPr>
         <w:t>): Master hub covering MOSFET taxonomy, semiconductor physics, mathematical models, switching dynamics, Miller plateau, thermal sizing, and selection matrix.</w:t>
+      </w:r>
+    </w:p>
+    <w:p>
+      <w:pPr>
+        <w:pStyle w:val="ListBullet"/>
+        <w:spacing w:after="40"/>
+        <w:ind w:left="360"/>
+      </w:pPr>
+      <w:r>
+        <w:rPr>
+          <w:color w:val="0066CC"/>
+          <w:sz w:val="21"/>
+          <w:u w:val="single"/>
+        </w:rPr>
+        <w:t>Power MOSFETs in Power Electronics: Topologies, Gate Drives &amp; Design</w:t>
+      </w:r>
+      <w:r>
+        <w:rPr>
+          <w:color w:val="282C34"/>
+          <w:sz w:val="21"/>
+        </w:rPr>
+        <w:t xml:space="preserve"> (</w:t>
+      </w:r>
+      <w:r>
+        <w:rPr>
+          <w:color w:val="0066CC"/>
+          <w:sz w:val="21"/>
+          <w:u w:val="single"/>
+        </w:rPr>
+        <w:t>Word DOCX</w:t>
+      </w:r>
+      <w:r>
+        <w:rPr>
+          <w:color w:val="282C34"/>
+          <w:sz w:val="21"/>
+        </w:rPr>
+        <w:t>): Synchronous buck/boost converters, half-bridge/inverters, high dV/dt Miller turn-on prevention (Active Miller Clamp &amp; negative bias), isolated flyback RCD snubber design, LLC resonant ZVS, bootstrap gate drivers, Kelvin-Source connections, SOA Spirito limits, UIS avalanche energy (</w:t>
+      </w:r>
+      <w:r>
+        <w:rPr>
+          <w:i/>
+          <w:color w:val="145AA0"/>
+          <w:sz w:val="21"/>
+        </w:rPr>
+        <w:t>E_{AS</w:t>
+      </w:r>
+      <w:r>
+        <w:rPr>
+          <w:color w:val="282C34"/>
+          <w:sz w:val="21"/>
+        </w:rPr>
+        <w:t>), and 48V/10A power stage schematic.</w:t>
       </w:r>
     </w:p>
     <w:p>

</xml_diff>

<commit_message>
feat(spps): add Smart Programmable Power Supply engineering design suite, schematics, and calculation tool
</commit_message>
<xml_diff>
--- a/vvdn/README.docx
+++ b/vvdn/README.docx
@@ -1157,6 +1157,125 @@
           <w:color w:val="282C34"/>
           <w:sz w:val="21"/>
         </w:rPr>
+        <w:t>[tools/psu_calc.py](file:///home/tthhongs/build_tthongs/tasks_aa_ii/vvdn/tools/psu_calc.py)</w:t>
+      </w:r>
+      <w:r>
+        <w:rPr>
+          <w:color w:val="282C34"/>
+          <w:sz w:val="21"/>
+        </w:rPr>
+        <w:t>: Calculate QR Flyback transformer parameters (</w:t>
+      </w:r>
+      <w:r>
+        <w:rPr>
+          <w:i/>
+          <w:color w:val="145AA0"/>
+          <w:sz w:val="21"/>
+        </w:rPr>
+        <w:t>L_p, I_{pk</w:t>
+      </w:r>
+      <w:r>
+        <w:rPr>
+          <w:color w:val="282C34"/>
+          <w:sz w:val="21"/>
+        </w:rPr>
+        <w:t xml:space="preserve">, turns ratio, air gap), primary RCD snubber values, 4-switch Buck-Boost </w:t>
+      </w:r>
+      <w:r>
+        <w:rPr>
+          <w:i/>
+          <w:color w:val="145AA0"/>
+          <w:sz w:val="21"/>
+        </w:rPr>
+        <w:t>L</w:t>
+      </w:r>
+      <w:r>
+        <w:rPr>
+          <w:color w:val="282C34"/>
+          <w:sz w:val="21"/>
+        </w:rPr>
+        <w:t xml:space="preserve"> and </w:t>
+      </w:r>
+      <w:r>
+        <w:rPr>
+          <w:i/>
+          <w:color w:val="145AA0"/>
+          <w:sz w:val="21"/>
+        </w:rPr>
+        <w:t>C_{OUT</w:t>
+      </w:r>
+      <w:r>
+        <w:rPr>
+          <w:color w:val="282C34"/>
+          <w:sz w:val="21"/>
+        </w:rPr>
+        <w:t xml:space="preserve"> bank, DAC feedback summing network, and real-time efficiency:</w:t>
+      </w:r>
+    </w:p>
+    <w:tbl>
+      <w:tblPr>
+        <w:tblW w:type="auto" w:w="0"/>
+        <w:jc w:val="center"/>
+        <w:tblLook w:firstColumn="1" w:firstRow="1" w:lastColumn="0" w:lastRow="0" w:noHBand="0" w:noVBand="1" w:val="04A0"/>
+      </w:tblPr>
+      <w:tblGrid>
+        <w:gridCol w:w="9792"/>
+      </w:tblGrid>
+      <w:tr>
+        <w:tc>
+          <w:tcPr>
+            <w:tcW w:type="dxa" w:w="9792"/>
+            <w:shd w:fill="F5F6F8"/>
+            <w:tcMar>
+              <w:top w:w="80" w:type="dxa"/>
+              <w:bottom w:w="80" w:type="dxa"/>
+              <w:left w:w="140" w:type="dxa"/>
+              <w:right w:w="140" w:type="dxa"/>
+            </w:tcMar>
+            <w:tcBorders>
+              <w:left w:val="single" w:sz="18" w:space="0" w:color="CBD5E0"/>
+              <w:top w:val="none"/>
+              <w:right w:val="none"/>
+              <w:bottom w:val="none"/>
+            </w:tcBorders>
+          </w:tcPr>
+          <w:p>
+            <w:pPr>
+              <w:spacing w:line="240" w:lineRule="auto" w:after="0"/>
+            </w:pPr>
+            <w:r>
+              <w:rPr>
+                <w:rFonts w:ascii="Consolas" w:hAnsi="Consolas"/>
+                <w:color w:val="2D3748"/>
+                <w:sz w:val="18"/>
+              </w:rPr>
+              <w:t xml:space="preserve">  python3 tools/psu_calc.py --flyback --vin-min 85 --vin-max 265 --vout 24 --iout 3.0 --fsw 65000</w:t>
+              <w:br/>
+              <w:t xml:space="preserve">  python3 tools/psu_calc.py --snubber --vin-max 265 --vout 24 --turns-ratio 4.0 --leakage-ind 3.3e-6 --ipeak 3.45 --fsw 70000</w:t>
+              <w:br/>
+              <w:t xml:space="preserve">  python3 tools/psu_calc.py --buckboost --vin 24 --vout-min 5.0 --vout-max 20.0 --iout 3.0 --fsw 250000</w:t>
+              <w:br/>
+              <w:t xml:space="preserve">  python3 tools/psu_calc.py --feedback --vout-min 5.0 --vout-max 20.0 --vdac-max 3.3 --vref 1.20</w:t>
+              <w:br/>
+              <w:t xml:space="preserve">  python3 tools/psu_calc.py --efficiency --vac 230 --iac 0.35 --pac 72.5 --vdc 20.0 --idc 3.0</w:t>
+            </w:r>
+          </w:p>
+        </w:tc>
+      </w:tr>
+    </w:tbl>
+    <w:p/>
+    <w:p>
+      <w:pPr>
+        <w:pStyle w:val="ListBullet"/>
+        <w:spacing w:after="40"/>
+        <w:ind w:left="360"/>
+      </w:pPr>
+      <w:r>
+        <w:rPr>
+          <w:b/>
+          <w:color w:val="282C34"/>
+          <w:sz w:val="21"/>
+        </w:rPr>
         <w:t>[tools/md_to_docx.py](file:///home/tthhongs/build_tthongs/tasks_aa_ii/vvdn/tools/md_to_docx.py)</w:t>
       </w:r>
       <w:r>
@@ -3843,6 +3962,266 @@
           <w:sz w:val="21"/>
         </w:rPr>
         <w:t>): Standard 7400-series TTL IC Bill of Materials, pin-to-pin schematics, ULN2003 contactor drive, sub-80ns propagation delay analysis, and Verilog simulation test vectors.</w:t>
+      </w:r>
+    </w:p>
+    <w:p>
+      <w:pPr>
+        <w:pStyle w:val="ListBullet"/>
+        <w:spacing w:after="40"/>
+        <w:ind w:left="360"/>
+      </w:pPr>
+      <w:r>
+        <w:rPr>
+          <w:color w:val="0066CC"/>
+          <w:sz w:val="21"/>
+          <w:u w:val="single"/>
+        </w:rPr>
+        <w:t>Smart Programmable Power Supply Master Hub</w:t>
+      </w:r>
+      <w:r>
+        <w:rPr>
+          <w:color w:val="282C34"/>
+          <w:sz w:val="21"/>
+        </w:rPr>
+        <w:t xml:space="preserve"> (</w:t>
+      </w:r>
+      <w:r>
+        <w:rPr>
+          <w:color w:val="0066CC"/>
+          <w:sz w:val="21"/>
+          <w:u w:val="single"/>
+        </w:rPr>
+        <w:t>Word DOCX</w:t>
+      </w:r>
+      <w:r>
+        <w:rPr>
+          <w:color w:val="282C34"/>
+          <w:sz w:val="21"/>
+        </w:rPr>
+        <w:t>): Master hub for 85–265V AC universal input, 5–20V / 3A (60W) programmable DC output power supply module with real-time efficiency monitoring and data logging.</w:t>
+      </w:r>
+    </w:p>
+    <w:p>
+      <w:pPr>
+        <w:pStyle w:val="ListBullet"/>
+        <w:spacing w:after="40"/>
+        <w:ind w:left="360"/>
+      </w:pPr>
+      <w:r>
+        <w:rPr>
+          <w:color w:val="0066CC"/>
+          <w:sz w:val="21"/>
+          <w:u w:val="single"/>
+        </w:rPr>
+        <w:t>AC-DC Flyback Stage Design &amp; Magnetics</w:t>
+      </w:r>
+      <w:r>
+        <w:rPr>
+          <w:color w:val="282C34"/>
+          <w:sz w:val="21"/>
+        </w:rPr>
+        <w:t xml:space="preserve"> (</w:t>
+      </w:r>
+      <w:r>
+        <w:rPr>
+          <w:color w:val="0066CC"/>
+          <w:sz w:val="21"/>
+          <w:u w:val="single"/>
+        </w:rPr>
+        <w:t>Word DOCX</w:t>
+      </w:r>
+      <w:r>
+        <w:rPr>
+          <w:color w:val="282C34"/>
+          <w:sz w:val="21"/>
+        </w:rPr>
+        <w:t>): Universal AC frontend (fuse, NTC, MOV, 2-stage EMI filter, bridge, bulk cap), Quasi-Resonant (QR) valley-switching Flyback, PQ26/20 transformer design, 800V Superjunction FET, RCD snubber, secondary synchronous rectification (MP6908), and TL431/PC817 isolated regulation.</w:t>
+      </w:r>
+    </w:p>
+    <w:p>
+      <w:pPr>
+        <w:pStyle w:val="ListBullet"/>
+        <w:spacing w:after="40"/>
+        <w:ind w:left="360"/>
+      </w:pPr>
+      <w:r>
+        <w:rPr>
+          <w:color w:val="0066CC"/>
+          <w:sz w:val="21"/>
+          <w:u w:val="single"/>
+        </w:rPr>
+        <w:t>MCU-Controlled Synchronous Buck-Boost Post-Regulator</w:t>
+      </w:r>
+      <w:r>
+        <w:rPr>
+          <w:color w:val="282C34"/>
+          <w:sz w:val="21"/>
+        </w:rPr>
+        <w:t xml:space="preserve"> (</w:t>
+      </w:r>
+      <w:r>
+        <w:rPr>
+          <w:color w:val="0066CC"/>
+          <w:sz w:val="21"/>
+          <w:u w:val="single"/>
+        </w:rPr>
+        <w:t>Word DOCX</w:t>
+      </w:r>
+      <w:r>
+        <w:rPr>
+          <w:color w:val="282C34"/>
+          <w:sz w:val="21"/>
+        </w:rPr>
+        <w:t>): 4-switch synchronous Buck-Boost H-bridge (</w:t>
+      </w:r>
+      <w:r>
+        <w:rPr>
+          <w:i/>
+          <w:color w:val="145AA0"/>
+          <w:sz w:val="21"/>
+        </w:rPr>
+        <w:t>24\,V \rightarrow 5-20\,V</w:t>
+      </w:r>
+      <w:r>
+        <w:rPr>
+          <w:color w:val="282C34"/>
+          <w:sz w:val="21"/>
+        </w:rPr>
+        <w:t xml:space="preserve"> @ </w:t>
+      </w:r>
+      <w:r>
+        <w:rPr>
+          <w:i/>
+          <w:color w:val="145AA0"/>
+          <w:sz w:val="21"/>
+        </w:rPr>
+        <w:t>3\,A</w:t>
+      </w:r>
+      <w:r>
+        <w:rPr>
+          <w:color w:val="282C34"/>
+          <w:sz w:val="21"/>
+        </w:rPr>
+        <w:t>), 10µH flat-wire inductor, output capacitor bank (&lt; 25mV ripple), 12-bit DAC current-injection feedback network (10mV resolution), and analog fast Constant Current (CC) clamp loop.</w:t>
+      </w:r>
+    </w:p>
+    <w:p>
+      <w:pPr>
+        <w:pStyle w:val="ListBullet"/>
+        <w:spacing w:after="40"/>
+        <w:ind w:left="360"/>
+      </w:pPr>
+      <w:r>
+        <w:rPr>
+          <w:color w:val="0066CC"/>
+          <w:sz w:val="21"/>
+          <w:u w:val="single"/>
+        </w:rPr>
+        <w:t>Efficiency Monitoring, Data Logging &amp; Telemetry</w:t>
+      </w:r>
+      <w:r>
+        <w:rPr>
+          <w:color w:val="282C34"/>
+          <w:sz w:val="21"/>
+        </w:rPr>
+        <w:t xml:space="preserve"> (</w:t>
+      </w:r>
+      <w:r>
+        <w:rPr>
+          <w:color w:val="0066CC"/>
+          <w:sz w:val="21"/>
+          <w:u w:val="single"/>
+        </w:rPr>
+        <w:t>Word DOCX</w:t>
+      </w:r>
+      <w:r>
+        <w:rPr>
+          <w:color w:val="282C34"/>
+          <w:sz w:val="21"/>
+        </w:rPr>
+        <w:t xml:space="preserve">): Dual-domain power metering (isolated primary AC </w:t>
+      </w:r>
+      <w:r>
+        <w:rPr>
+          <w:i/>
+          <w:color w:val="145AA0"/>
+          <w:sz w:val="21"/>
+        </w:rPr>
+        <w:t>\Delta\Sigma</w:t>
+      </w:r>
+      <w:r>
+        <w:rPr>
+          <w:color w:val="282C34"/>
+          <w:sz w:val="21"/>
+        </w:rPr>
+        <w:t xml:space="preserve"> modulator AMC1311/CT and secondary DC INA226 I2C monitor), real-time efficiency engine (</w:t>
+      </w:r>
+      <w:r>
+        <w:rPr>
+          <w:i/>
+          <w:color w:val="145AA0"/>
+          <w:sz w:val="21"/>
+        </w:rPr>
+        <w:t>\eta = P_{DC / P_{AC</w:t>
+      </w:r>
+      <w:r>
+        <w:rPr>
+          <w:color w:val="282C34"/>
+          <w:sz w:val="21"/>
+        </w:rPr>
+        <w:t xml:space="preserve"> at 10Hz), non-blocking FreeRTOS MicroSD FAT32 CSV logger, 1.3" OLED display, and USB-C SCPI command parser.</w:t>
+      </w:r>
+    </w:p>
+    <w:p>
+      <w:pPr>
+        <w:pStyle w:val="ListBullet"/>
+        <w:spacing w:after="40"/>
+        <w:ind w:left="360"/>
+      </w:pPr>
+      <w:r>
+        <w:rPr>
+          <w:color w:val="0066CC"/>
+          <w:sz w:val="21"/>
+          <w:u w:val="single"/>
+        </w:rPr>
+        <w:t>System Schematics, Safety &amp; PCB Design</w:t>
+      </w:r>
+      <w:r>
+        <w:rPr>
+          <w:color w:val="282C34"/>
+          <w:sz w:val="21"/>
+        </w:rPr>
+        <w:t xml:space="preserve"> (</w:t>
+      </w:r>
+      <w:r>
+        <w:rPr>
+          <w:color w:val="0066CC"/>
+          <w:sz w:val="21"/>
+          <w:u w:val="single"/>
+        </w:rPr>
+        <w:t>Word DOCX</w:t>
+      </w:r>
+      <w:r>
+        <w:rPr>
+          <w:color w:val="282C34"/>
+          <w:sz w:val="21"/>
+        </w:rPr>
+        <w:t>): Complete end-to-end system interconnect schematic, reinforced isolation barrier rules (</w:t>
+      </w:r>
+      <w:r>
+        <w:rPr>
+          <w:i/>
+          <w:color w:val="145AA0"/>
+          <w:sz w:val="21"/>
+        </w:rPr>
+        <w:t>≥ 6.4\,mm</w:t>
+      </w:r>
+      <w:r>
+        <w:rPr>
+          <w:color w:val="282C34"/>
+          <w:sz w:val="21"/>
+        </w:rPr>
+        <w:t xml:space="preserve"> creepage, 2.0mm PCB isolation slot, Y1 safety cap), 4-layer PCB stackup and layout guidelines, Bill of Materials (BOM), bring-up checklist, and RCA troubleshooting matrix.</w:t>
       </w:r>
     </w:p>
     <w:p>

</xml_diff>

<commit_message>
feat(converters): add comprehensive power electronic converters knowledge base across DC-DC, AC-AC, DC-AC, and AC-DC
</commit_message>
<xml_diff>
--- a/vvdn/README.docx
+++ b/vvdn/README.docx
@@ -273,6 +273,44 @@
               <w:br/>
               <w:t>│       └── msl-guide.md (.docx)       # Moisture Sensitivity Levels (J-STD-020/033, popcorning, bake)</w:t>
               <w:br/>
+              <w:t>├── converters/                        # Power Electronics Converters Knowledge Base (DC-DC, AC-AC, DC-AC, AC-DC)</w:t>
+              <w:br/>
+              <w:t>│   ├── README.md (.docx)              # Master hub, 4-quadrant conversion matrix &amp; selection benchmark</w:t>
+              <w:br/>
+              <w:t>│   ├── dc-dc/                         # DC-to-DC Voltage Conversion (Isolated &amp; Non-Isolated Topologies)</w:t>
+              <w:br/>
+              <w:t>│   │   ├── README.md (.docx)          # DC-DC master hub, taxonomy &amp; 13-topology comparison</w:t>
+              <w:br/>
+              <w:t>│   │   ├── isolated/                  # Forward, Flyback, DAB, Full-Bridge, Half-Bridge, Push-Pull, Resonant (LLC)</w:t>
+              <w:br/>
+              <w:t>│   │   └── non-isolated/              # Buck, Boost, Buck-Boost, Cuk, SEPIC, Zeta</w:t>
+              <w:br/>
+              <w:t>│   ├── ac-ac/                         # AC-to-AC Frequency &amp; Voltage Conversion</w:t>
+              <w:br/>
+              <w:t>│   │   ├── README.md (.docx)          # AC-AC master hub &amp; direct conversion taxonomy</w:t>
+              <w:br/>
+              <w:t>│   │   ├── cycloconverters.md (.docx) # Line-commutated cycloconverters (P/N banks, sub-fundamental drives)</w:t>
+              <w:br/>
+              <w:t>│   │   └── ac-voltage-controllers.md (.docx) # Phase angle &amp; integral cycle control (TRIAC/SCR, soft-starters)</w:t>
+              <w:br/>
+              <w:t>│   ├── dc-ac/                         # DC-to-AC Inversion (Single-Phase &amp; Three-Phase Inverters)</w:t>
+              <w:br/>
+              <w:t>│   │   ├── README.md (.docx)          # DC-AC master hub &amp; modulation comparison</w:t>
+              <w:br/>
+              <w:t>│   │   ├── single-phase-inverters.md (.docx) # Half/Full-Bridge, Bipolar/Unipolar SPWM, LC filter design</w:t>
+              <w:br/>
+              <w:t>│   │   └── three-phase-inverters.md (.docx) # 6-Switch VSI, 180°/120°, THIPWM &amp; Space Vector PWM (SVPWM)</w:t>
+              <w:br/>
+              <w:t>│   └── ac-dc/                         # AC-to-DC Rectification &amp; Power Quality</w:t>
+              <w:br/>
+              <w:t>│       ├── README.md (.docx)          # AC-DC master hub, power quality metrics &amp; standards (IEC 61000-3-2)</w:t>
+              <w:br/>
+              <w:t>│       ├── uncontrolled-rectifiers.md (.docx) # 1-Phase &amp; 3-Phase diode bridges, conduction angle &amp; capacitor ripple</w:t>
+              <w:br/>
+              <w:t>│       ├── controlled-rectifiers.md (.docx) # Phase-controlled SCR rectifiers (Semi/Full, Quadrant IV inversion)</w:t>
+              <w:br/>
+              <w:t>│       └── active-pfc-rectifiers.md (.docx) # Active Boost PFC, Bridgeless Totem-Pole GaN &amp; Vienna Rectifier</w:t>
+              <w:br/>
               <w:t>├── active/                            # In-progress investigations &amp; open device issues</w:t>
               <w:br/>
               <w:t>└── resolved/                          # Documented fixes, post-mortems, and RCA</w:t>
@@ -4222,6 +4260,702 @@
           <w:sz w:val="21"/>
         </w:rPr>
         <w:t xml:space="preserve"> creepage, 2.0mm PCB isolation slot, Y1 safety cap), 4-layer PCB stackup and layout guidelines, Bill of Materials (BOM), bring-up checklist, and RCA troubleshooting matrix.</w:t>
+      </w:r>
+    </w:p>
+    <w:p>
+      <w:pPr>
+        <w:spacing w:before="80" w:after="80"/>
+        <w:pBdr>
+          <w:bottom w:val="single" w:sz="6" w:space="1" w:color="E2E8F0"/>
+        </w:pBdr>
+      </w:pPr>
+    </w:p>
+    <w:p>
+      <w:pPr>
+        <w:spacing w:before="240" w:after="120"/>
+      </w:pPr>
+      <w:r>
+        <w:rPr>
+          <w:b/>
+          <w:color w:val="184C78"/>
+          <w:sz w:val="28"/>
+        </w:rPr>
+        <w:t>Power Electronics Converters Knowledge Base</w:t>
+      </w:r>
+    </w:p>
+    <w:p>
+      <w:pPr>
+        <w:pStyle w:val="ListBullet"/>
+        <w:spacing w:after="40"/>
+        <w:ind w:left="360"/>
+      </w:pPr>
+      <w:r>
+        <w:rPr>
+          <w:color w:val="0066CC"/>
+          <w:sz w:val="21"/>
+          <w:u w:val="single"/>
+        </w:rPr>
+        <w:t>Power Converters Master Hub</w:t>
+      </w:r>
+      <w:r>
+        <w:rPr>
+          <w:color w:val="282C34"/>
+          <w:sz w:val="21"/>
+        </w:rPr>
+        <w:t xml:space="preserve"> (</w:t>
+      </w:r>
+      <w:r>
+        <w:rPr>
+          <w:color w:val="0066CC"/>
+          <w:sz w:val="21"/>
+          <w:u w:val="single"/>
+        </w:rPr>
+        <w:t>Word DOCX</w:t>
+      </w:r>
+      <w:r>
+        <w:rPr>
+          <w:color w:val="282C34"/>
+          <w:sz w:val="21"/>
+        </w:rPr>
+        <w:t>): Master hub for 4-quadrant power electronic converters (DC-DC, AC-AC, DC-AC, AC-DC) with taxonomy, 13-topology benchmark matrix, and component stress formulas.</w:t>
+      </w:r>
+    </w:p>
+    <w:p>
+      <w:pPr>
+        <w:pStyle w:val="ListBullet"/>
+        <w:spacing w:after="40"/>
+        <w:ind w:left="360"/>
+      </w:pPr>
+      <w:r>
+        <w:rPr>
+          <w:color w:val="0066CC"/>
+          <w:sz w:val="21"/>
+          <w:u w:val="single"/>
+        </w:rPr>
+        <w:t>DC-DC Converters Hub</w:t>
+      </w:r>
+      <w:r>
+        <w:rPr>
+          <w:color w:val="282C34"/>
+          <w:sz w:val="21"/>
+        </w:rPr>
+        <w:t xml:space="preserve"> (</w:t>
+      </w:r>
+      <w:r>
+        <w:rPr>
+          <w:color w:val="0066CC"/>
+          <w:sz w:val="21"/>
+          <w:u w:val="single"/>
+        </w:rPr>
+        <w:t>Word DOCX</w:t>
+      </w:r>
+      <w:r>
+        <w:rPr>
+          <w:color w:val="282C34"/>
+          <w:sz w:val="21"/>
+        </w:rPr>
+        <w:t>): Master hub covering 7 Isolated topologies (Forward, Flyback, DAB, Full-Bridge, Half-Bridge, Push-Pull, Resonant) and 6 Non-Isolated topologies (Buck, Boost, Buck-Boost, Cuk, SEPIC, Zeta).</w:t>
+      </w:r>
+    </w:p>
+    <w:p>
+      <w:pPr>
+        <w:pStyle w:val="ListBullet"/>
+        <w:spacing w:after="40"/>
+        <w:ind w:left="720"/>
+      </w:pPr>
+      <w:r>
+        <w:rPr>
+          <w:color w:val="0066CC"/>
+          <w:sz w:val="21"/>
+          <w:u w:val="single"/>
+        </w:rPr>
+        <w:t>Isolated Resonant Converters (SRC, PRC, LLC) [IMP]</w:t>
+      </w:r>
+      <w:r>
+        <w:rPr>
+          <w:color w:val="282C34"/>
+          <w:sz w:val="21"/>
+        </w:rPr>
+        <w:t xml:space="preserve"> (</w:t>
+      </w:r>
+      <w:r>
+        <w:rPr>
+          <w:color w:val="0066CC"/>
+          <w:sz w:val="21"/>
+          <w:u w:val="single"/>
+        </w:rPr>
+        <w:t>Word DOCX</w:t>
+      </w:r>
+      <w:r>
+        <w:rPr>
+          <w:color w:val="282C34"/>
+          <w:sz w:val="21"/>
+        </w:rPr>
+        <w:t xml:space="preserve">): Deep dive into Series, Parallel, and LLC Resonant Half-Bridge converters, FHA gain curves </w:t>
+      </w:r>
+      <w:r>
+        <w:rPr>
+          <w:i/>
+          <w:color w:val="145AA0"/>
+          <w:sz w:val="21"/>
+        </w:rPr>
+        <w:t>M(f_n, Q, L_n)</w:t>
+      </w:r>
+      <w:r>
+        <w:rPr>
+          <w:color w:val="282C34"/>
+          <w:sz w:val="21"/>
+        </w:rPr>
+        <w:t>, and complete ZVS/ZCS design procedures.</w:t>
+      </w:r>
+    </w:p>
+    <w:p>
+      <w:pPr>
+        <w:pStyle w:val="ListBullet"/>
+        <w:spacing w:after="40"/>
+        <w:ind w:left="720"/>
+      </w:pPr>
+      <w:r>
+        <w:rPr>
+          <w:color w:val="0066CC"/>
+          <w:sz w:val="21"/>
+          <w:u w:val="single"/>
+        </w:rPr>
+        <w:t>Phase-Shifted Full-Bridge (PSFB)</w:t>
+      </w:r>
+      <w:r>
+        <w:rPr>
+          <w:color w:val="282C34"/>
+          <w:sz w:val="21"/>
+        </w:rPr>
+        <w:t xml:space="preserve"> (</w:t>
+      </w:r>
+      <w:r>
+        <w:rPr>
+          <w:color w:val="0066CC"/>
+          <w:sz w:val="21"/>
+          <w:u w:val="single"/>
+        </w:rPr>
+        <w:t>Word DOCX</w:t>
+      </w:r>
+      <w:r>
+        <w:rPr>
+          <w:color w:val="282C34"/>
+          <w:sz w:val="21"/>
+        </w:rPr>
+        <w:t>): Soft-switching ZVS mechanisms, leading/lagging leg transitions, duty-cycle loss (</w:t>
+      </w:r>
+      <w:r>
+        <w:rPr>
+          <w:i/>
+          <w:color w:val="145AA0"/>
+          <w:sz w:val="21"/>
+        </w:rPr>
+        <w:t>\Delta D</w:t>
+      </w:r>
+      <w:r>
+        <w:rPr>
+          <w:color w:val="282C34"/>
+          <w:sz w:val="21"/>
+        </w:rPr>
+        <w:t>), and secondary ringing suppression.</w:t>
+      </w:r>
+    </w:p>
+    <w:p>
+      <w:pPr>
+        <w:pStyle w:val="ListBullet"/>
+        <w:spacing w:after="40"/>
+        <w:ind w:left="720"/>
+      </w:pPr>
+      <w:r>
+        <w:rPr>
+          <w:color w:val="0066CC"/>
+          <w:sz w:val="21"/>
+          <w:u w:val="single"/>
+        </w:rPr>
+        <w:t>Dual Active Bridge (DAB)</w:t>
+      </w:r>
+      <w:r>
+        <w:rPr>
+          <w:color w:val="282C34"/>
+          <w:sz w:val="21"/>
+        </w:rPr>
+        <w:t xml:space="preserve"> (</w:t>
+      </w:r>
+      <w:r>
+        <w:rPr>
+          <w:color w:val="0066CC"/>
+          <w:sz w:val="21"/>
+          <w:u w:val="single"/>
+        </w:rPr>
+        <w:t>Word DOCX</w:t>
+      </w:r>
+      <w:r>
+        <w:rPr>
+          <w:color w:val="282C34"/>
+          <w:sz w:val="21"/>
+        </w:rPr>
+        <w:t>): Bidirectional phase-shift modulation (SPS, EPS, DPS, TPS), leakage inductance power transfer, and EV battery charging design.</w:t>
+      </w:r>
+    </w:p>
+    <w:p>
+      <w:pPr>
+        <w:pStyle w:val="ListBullet"/>
+        <w:spacing w:after="40"/>
+        <w:ind w:left="360"/>
+      </w:pPr>
+      <w:r>
+        <w:rPr>
+          <w:color w:val="0066CC"/>
+          <w:sz w:val="21"/>
+          <w:u w:val="single"/>
+        </w:rPr>
+        <w:t>AC-AC Converters Hub</w:t>
+      </w:r>
+      <w:r>
+        <w:rPr>
+          <w:color w:val="282C34"/>
+          <w:sz w:val="21"/>
+        </w:rPr>
+        <w:t xml:space="preserve"> (</w:t>
+      </w:r>
+      <w:r>
+        <w:rPr>
+          <w:color w:val="0066CC"/>
+          <w:sz w:val="21"/>
+          <w:u w:val="single"/>
+        </w:rPr>
+        <w:t>Word DOCX</w:t>
+      </w:r>
+      <w:r>
+        <w:rPr>
+          <w:color w:val="282C34"/>
+          <w:sz w:val="21"/>
+        </w:rPr>
+        <w:t>): Direct AC-AC frequency and voltage conversion.</w:t>
+      </w:r>
+    </w:p>
+    <w:p>
+      <w:pPr>
+        <w:pStyle w:val="ListBullet"/>
+        <w:spacing w:after="40"/>
+        <w:ind w:left="720"/>
+      </w:pPr>
+      <w:r>
+        <w:rPr>
+          <w:color w:val="0066CC"/>
+          <w:sz w:val="21"/>
+          <w:u w:val="single"/>
+        </w:rPr>
+        <w:t>Cycloconverters</w:t>
+      </w:r>
+      <w:r>
+        <w:rPr>
+          <w:color w:val="282C34"/>
+          <w:sz w:val="21"/>
+        </w:rPr>
+        <w:t xml:space="preserve"> (</w:t>
+      </w:r>
+      <w:r>
+        <w:rPr>
+          <w:color w:val="0066CC"/>
+          <w:sz w:val="21"/>
+          <w:u w:val="single"/>
+        </w:rPr>
+        <w:t>Word DOCX</w:t>
+      </w:r>
+      <w:r>
+        <w:rPr>
+          <w:color w:val="282C34"/>
+          <w:sz w:val="21"/>
+        </w:rPr>
+        <w:t>): Multi-pulse naturally-commutated thyristor banks (P/N groups), circulating vs. non-circulating modes, and low-frequency mega-watt drives.</w:t>
+      </w:r>
+    </w:p>
+    <w:p>
+      <w:pPr>
+        <w:pStyle w:val="ListBullet"/>
+        <w:spacing w:after="40"/>
+        <w:ind w:left="720"/>
+      </w:pPr>
+      <w:r>
+        <w:rPr>
+          <w:color w:val="0066CC"/>
+          <w:sz w:val="21"/>
+          <w:u w:val="single"/>
+        </w:rPr>
+        <w:t>AC Voltage Controllers</w:t>
+      </w:r>
+      <w:r>
+        <w:rPr>
+          <w:color w:val="282C34"/>
+          <w:sz w:val="21"/>
+        </w:rPr>
+        <w:t xml:space="preserve"> (</w:t>
+      </w:r>
+      <w:r>
+        <w:rPr>
+          <w:color w:val="0066CC"/>
+          <w:sz w:val="21"/>
+          <w:u w:val="single"/>
+        </w:rPr>
+        <w:t>Word DOCX</w:t>
+      </w:r>
+      <w:r>
+        <w:rPr>
+          <w:color w:val="282C34"/>
+          <w:sz w:val="21"/>
+        </w:rPr>
+        <w:t>): Phase-angle control vs. integral cycle burst firing, antiparallel SCR pairs/TRIACs, and induction motor soft-starters.</w:t>
+      </w:r>
+    </w:p>
+    <w:p>
+      <w:pPr>
+        <w:pStyle w:val="ListBullet"/>
+        <w:spacing w:after="40"/>
+        <w:ind w:left="360"/>
+      </w:pPr>
+      <w:r>
+        <w:rPr>
+          <w:color w:val="0066CC"/>
+          <w:sz w:val="21"/>
+          <w:u w:val="single"/>
+        </w:rPr>
+        <w:t>DC-AC Inverters Hub</w:t>
+      </w:r>
+      <w:r>
+        <w:rPr>
+          <w:color w:val="282C34"/>
+          <w:sz w:val="21"/>
+        </w:rPr>
+        <w:t xml:space="preserve"> (</w:t>
+      </w:r>
+      <w:r>
+        <w:rPr>
+          <w:color w:val="0066CC"/>
+          <w:sz w:val="21"/>
+          <w:u w:val="single"/>
+        </w:rPr>
+        <w:t>Word DOCX</w:t>
+      </w:r>
+      <w:r>
+        <w:rPr>
+          <w:color w:val="282C34"/>
+          <w:sz w:val="21"/>
+        </w:rPr>
+        <w:t>): Stiff DC-bus inversion for grid-tied solar, UPS, and motor drives.</w:t>
+      </w:r>
+    </w:p>
+    <w:p>
+      <w:pPr>
+        <w:pStyle w:val="ListBullet"/>
+        <w:spacing w:after="40"/>
+        <w:ind w:left="720"/>
+      </w:pPr>
+      <w:r>
+        <w:rPr>
+          <w:color w:val="0066CC"/>
+          <w:sz w:val="21"/>
+          <w:u w:val="single"/>
+        </w:rPr>
+        <w:t>Single-Phase Inverters &amp; Filter Design</w:t>
+      </w:r>
+      <w:r>
+        <w:rPr>
+          <w:color w:val="282C34"/>
+          <w:sz w:val="21"/>
+        </w:rPr>
+        <w:t xml:space="preserve"> (</w:t>
+      </w:r>
+      <w:r>
+        <w:rPr>
+          <w:color w:val="0066CC"/>
+          <w:sz w:val="21"/>
+          <w:u w:val="single"/>
+        </w:rPr>
+        <w:t>Word DOCX</w:t>
+      </w:r>
+      <w:r>
+        <w:rPr>
+          <w:color w:val="282C34"/>
+          <w:sz w:val="21"/>
+        </w:rPr>
+        <w:t>): Half-bridge vs Full-bridge H-bridge, Bipolar vs Unipolar SPWM (</w:t>
+      </w:r>
+      <w:r>
+        <w:rPr>
+          <w:i/>
+          <w:color w:val="145AA0"/>
+          <w:sz w:val="21"/>
+        </w:rPr>
+        <w:t>2f_c</w:t>
+      </w:r>
+      <w:r>
+        <w:rPr>
+          <w:color w:val="282C34"/>
+          <w:sz w:val="21"/>
+        </w:rPr>
+        <w:t xml:space="preserve"> harmonic cancellation), and second-order LC output low-pass filter design.</w:t>
+      </w:r>
+    </w:p>
+    <w:p>
+      <w:pPr>
+        <w:pStyle w:val="ListBullet"/>
+        <w:spacing w:after="40"/>
+        <w:ind w:left="720"/>
+      </w:pPr>
+      <w:r>
+        <w:rPr>
+          <w:color w:val="0066CC"/>
+          <w:sz w:val="21"/>
+          <w:u w:val="single"/>
+        </w:rPr>
+        <w:t>Three-Phase Inverters &amp; Space Vector PWM (SVPWM)</w:t>
+      </w:r>
+      <w:r>
+        <w:rPr>
+          <w:color w:val="282C34"/>
+          <w:sz w:val="21"/>
+        </w:rPr>
+        <w:t xml:space="preserve"> (</w:t>
+      </w:r>
+      <w:r>
+        <w:rPr>
+          <w:color w:val="0066CC"/>
+          <w:sz w:val="21"/>
+          <w:u w:val="single"/>
+        </w:rPr>
+        <w:t>Word DOCX</w:t>
+      </w:r>
+      <w:r>
+        <w:rPr>
+          <w:color w:val="282C34"/>
+          <w:sz w:val="21"/>
+        </w:rPr>
+        <w:t>): 6-Switch two-level VSI, 180°/120° six-step, THIPWM saddle modulation, and Space Vector PWM (SVPWM) mathematical deep dive (</w:t>
+      </w:r>
+      <w:r>
+        <w:rPr>
+          <w:i/>
+          <w:color w:val="145AA0"/>
+          <w:sz w:val="21"/>
+        </w:rPr>
+        <w:t>15.5\%</w:t>
+      </w:r>
+      <w:r>
+        <w:rPr>
+          <w:color w:val="282C34"/>
+          <w:sz w:val="21"/>
+        </w:rPr>
+        <w:t xml:space="preserve"> higher DC utilization).</w:t>
+      </w:r>
+    </w:p>
+    <w:p>
+      <w:pPr>
+        <w:pStyle w:val="ListBullet"/>
+        <w:spacing w:after="40"/>
+        <w:ind w:left="360"/>
+      </w:pPr>
+      <w:r>
+        <w:rPr>
+          <w:color w:val="0066CC"/>
+          <w:sz w:val="21"/>
+          <w:u w:val="single"/>
+        </w:rPr>
+        <w:t>AC-DC Rectifiers Hub</w:t>
+      </w:r>
+      <w:r>
+        <w:rPr>
+          <w:color w:val="282C34"/>
+          <w:sz w:val="21"/>
+        </w:rPr>
+        <w:t xml:space="preserve"> (</w:t>
+      </w:r>
+      <w:r>
+        <w:rPr>
+          <w:color w:val="0066CC"/>
+          <w:sz w:val="21"/>
+          <w:u w:val="single"/>
+        </w:rPr>
+        <w:t>Word DOCX</w:t>
+      </w:r>
+      <w:r>
+        <w:rPr>
+          <w:color w:val="282C34"/>
+          <w:sz w:val="21"/>
+        </w:rPr>
+        <w:t>): AC mains rectification, power quality metrics (</w:t>
+      </w:r>
+      <w:r>
+        <w:rPr>
+          <w:i/>
+          <w:color w:val="145AA0"/>
+          <w:sz w:val="21"/>
+        </w:rPr>
+        <w:t>PF, DPF, THD_i</w:t>
+      </w:r>
+      <w:r>
+        <w:rPr>
+          <w:color w:val="282C34"/>
+          <w:sz w:val="21"/>
+        </w:rPr>
+        <w:t>), and regulatory compliance (IEC 61000-3-2).</w:t>
+      </w:r>
+    </w:p>
+    <w:p>
+      <w:pPr>
+        <w:pStyle w:val="ListBullet"/>
+        <w:spacing w:after="40"/>
+        <w:ind w:left="720"/>
+      </w:pPr>
+      <w:r>
+        <w:rPr>
+          <w:color w:val="0066CC"/>
+          <w:sz w:val="21"/>
+          <w:u w:val="single"/>
+        </w:rPr>
+        <w:t>Uncontrolled Diode Rectifiers</w:t>
+      </w:r>
+      <w:r>
+        <w:rPr>
+          <w:color w:val="282C34"/>
+          <w:sz w:val="21"/>
+        </w:rPr>
+        <w:t xml:space="preserve"> (</w:t>
+      </w:r>
+      <w:r>
+        <w:rPr>
+          <w:color w:val="0066CC"/>
+          <w:sz w:val="21"/>
+          <w:u w:val="single"/>
+        </w:rPr>
+        <w:t>Word DOCX</w:t>
+      </w:r>
+      <w:r>
+        <w:rPr>
+          <w:color w:val="282C34"/>
+          <w:sz w:val="21"/>
+        </w:rPr>
+        <w:t xml:space="preserve">): 1-Phase &amp; 3-Phase diode bridges, conduction angle </w:t>
+      </w:r>
+      <w:r>
+        <w:rPr>
+          <w:i/>
+          <w:color w:val="145AA0"/>
+          <w:sz w:val="21"/>
+        </w:rPr>
+        <w:t>\theta_c</w:t>
+      </w:r>
+      <w:r>
+        <w:rPr>
+          <w:color w:val="282C34"/>
+          <w:sz w:val="21"/>
+        </w:rPr>
+        <w:t>, crest factor, bulk capacitor sizing, and inrush surge protection.</w:t>
+      </w:r>
+    </w:p>
+    <w:p>
+      <w:pPr>
+        <w:pStyle w:val="ListBullet"/>
+        <w:spacing w:after="40"/>
+        <w:ind w:left="720"/>
+      </w:pPr>
+      <w:r>
+        <w:rPr>
+          <w:color w:val="0066CC"/>
+          <w:sz w:val="21"/>
+          <w:u w:val="single"/>
+        </w:rPr>
+        <w:t>Controlled Phase-Rectifiers &amp; Inversion</w:t>
+      </w:r>
+      <w:r>
+        <w:rPr>
+          <w:color w:val="282C34"/>
+          <w:sz w:val="21"/>
+        </w:rPr>
+        <w:t xml:space="preserve"> (</w:t>
+      </w:r>
+      <w:r>
+        <w:rPr>
+          <w:color w:val="0066CC"/>
+          <w:sz w:val="21"/>
+          <w:u w:val="single"/>
+        </w:rPr>
+        <w:t>Word DOCX</w:t>
+      </w:r>
+      <w:r>
+        <w:rPr>
+          <w:color w:val="282C34"/>
+          <w:sz w:val="21"/>
+        </w:rPr>
+        <w:t xml:space="preserve">): Semi-converters, full-converters, firing delay </w:t>
+      </w:r>
+      <w:r>
+        <w:rPr>
+          <w:i/>
+          <w:color w:val="145AA0"/>
+          <w:sz w:val="21"/>
+        </w:rPr>
+        <w:t>\alpha</w:t>
+      </w:r>
+      <w:r>
+        <w:rPr>
+          <w:color w:val="282C34"/>
+          <w:sz w:val="21"/>
+        </w:rPr>
+        <w:t>, and Quadrant IV line-commutated inversion for DC motor regenerative braking.</w:t>
+      </w:r>
+    </w:p>
+    <w:p>
+      <w:pPr>
+        <w:pStyle w:val="ListBullet"/>
+        <w:spacing w:after="40"/>
+        <w:ind w:left="720"/>
+      </w:pPr>
+      <w:r>
+        <w:rPr>
+          <w:color w:val="0066CC"/>
+          <w:sz w:val="21"/>
+          <w:u w:val="single"/>
+        </w:rPr>
+        <w:t>Active PFC Rectifiers (Boost, Totem-Pole GaN, Vienna)</w:t>
+      </w:r>
+      <w:r>
+        <w:rPr>
+          <w:color w:val="282C34"/>
+          <w:sz w:val="21"/>
+        </w:rPr>
+        <w:t xml:space="preserve"> (</w:t>
+      </w:r>
+      <w:r>
+        <w:rPr>
+          <w:color w:val="0066CC"/>
+          <w:sz w:val="21"/>
+          <w:u w:val="single"/>
+        </w:rPr>
+        <w:t>Word DOCX</w:t>
+      </w:r>
+      <w:r>
+        <w:rPr>
+          <w:color w:val="282C34"/>
+          <w:sz w:val="21"/>
+        </w:rPr>
+        <w:t>): Active Boost PFC (inner current + outer voltage loop), Bridgeless Totem-Pole GaN (</w:t>
+      </w:r>
+      <w:r>
+        <w:rPr>
+          <w:i/>
+          <w:color w:val="145AA0"/>
+          <w:sz w:val="21"/>
+        </w:rPr>
+        <w:t>99\%</w:t>
+      </w:r>
+      <w:r>
+        <w:rPr>
+          <w:color w:val="282C34"/>
+          <w:sz w:val="21"/>
+        </w:rPr>
+        <w:t xml:space="preserve"> efficiency), 3-Phase Vienna Rectifier, and hold-up capacitor sizing.</w:t>
       </w:r>
     </w:p>
     <w:p>

</xml_diff>

<commit_message>
docs: standardize formula formatting to plain notation and regenerate DOCX files across all modules
</commit_message>
<xml_diff>
--- a/vvdn/README.docx
+++ b/vvdn/README.docx
@@ -562,22 +562,7 @@
           <w:color w:val="282C34"/>
           <w:sz w:val="21"/>
         </w:rPr>
-        <w:t xml:space="preserve">: Calculate PCB antenna inductance, resonance capacitors, </w:t>
-      </w:r>
-      <w:r>
-        <w:rPr>
-          <w:i/>
-          <w:color w:val="145AA0"/>
-          <w:sz w:val="21"/>
-        </w:rPr>
-        <w:t>Q</w:t>
-      </w:r>
-      <w:r>
-        <w:rPr>
-          <w:color w:val="282C34"/>
-          <w:sz w:val="21"/>
-        </w:rPr>
-        <w:t>-factor, matching network, and NDEF record encodings:</w:t>
+        <w:t>: Calculate PCB antenna inductance, resonance capacitors, Q-factor, matching network, and NDEF record encodings:</w:t>
       </w:r>
     </w:p>
     <w:tbl>
@@ -647,37 +632,7 @@
           <w:color w:val="282C34"/>
           <w:sz w:val="21"/>
         </w:rPr>
-        <w:t>: Calculate I2C pull-up resistor windows (</w:t>
-      </w:r>
-      <w:r>
-        <w:rPr>
-          <w:i/>
-          <w:color w:val="145AA0"/>
-          <w:sz w:val="21"/>
-        </w:rPr>
-        <w:t>R_{p(min)</w:t>
-      </w:r>
-      <w:r>
-        <w:rPr>
-          <w:color w:val="282C34"/>
-          <w:sz w:val="21"/>
-        </w:rPr>
-        <w:t xml:space="preserve"> and </w:t>
-      </w:r>
-      <w:r>
-        <w:rPr>
-          <w:i/>
-          <w:color w:val="145AA0"/>
-          <w:sz w:val="21"/>
-        </w:rPr>
-        <w:t>R_{p(max)</w:t>
-      </w:r>
-      <w:r>
-        <w:rPr>
-          <w:color w:val="282C34"/>
-          <w:sz w:val="21"/>
-        </w:rPr>
-        <w:t>), bus capacitance budgets, rise time compliance, and 7-bit/8-bit address conversions:</w:t>
+        <w:t>: Calculate I2C pull-up resistor windows (R_p(min) and R_p(max)), bus capacitance budgets, rise time compliance, and 7-bit/8-bit address conversions:</w:t>
       </w:r>
     </w:p>
     <w:tbl>
@@ -813,37 +768,7 @@
           <w:color w:val="282C34"/>
           <w:sz w:val="21"/>
         </w:rPr>
-        <w:t>: Calculate LIN frame slot durations (</w:t>
-      </w:r>
-      <w:r>
-        <w:rPr>
-          <w:i/>
-          <w:color w:val="145AA0"/>
-          <w:sz w:val="21"/>
-        </w:rPr>
-        <w:t>1.4×</w:t>
-      </w:r>
-      <w:r>
-        <w:rPr>
-          <w:color w:val="282C34"/>
-          <w:sz w:val="21"/>
-        </w:rPr>
-        <w:t xml:space="preserve"> slot budget), PID parity bits (</w:t>
-      </w:r>
-      <w:r>
-        <w:rPr>
-          <w:i/>
-          <w:color w:val="145AA0"/>
-          <w:sz w:val="21"/>
-        </w:rPr>
-        <w:t>P0, P1</w:t>
-      </w:r>
-      <w:r>
-        <w:rPr>
-          <w:color w:val="282C34"/>
-          <w:sz w:val="21"/>
-        </w:rPr>
-        <w:t>), Classic &amp; Enhanced checksums, auto-baud sync capture ticks, and bus RC parameters:</w:t>
+        <w:t>: Calculate LIN frame slot durations (1.4* slot budget), PID parity bits (P0, P1), Classic &amp; Enhanced checksums, auto-baud sync capture ticks, and bus RC parameters:</w:t>
       </w:r>
     </w:p>
     <w:tbl>
@@ -913,22 +838,7 @@
           <w:color w:val="282C34"/>
           <w:sz w:val="21"/>
         </w:rPr>
-        <w:t>: Calculate LDO power dissipation, junction temperature (</w:t>
-      </w:r>
-      <w:r>
-        <w:rPr>
-          <w:i/>
-          <w:color w:val="145AA0"/>
-          <w:sz w:val="21"/>
-        </w:rPr>
-        <w:t>T_J</w:t>
-      </w:r>
-      <w:r>
-        <w:rPr>
-          <w:color w:val="282C34"/>
-          <w:sz w:val="21"/>
-        </w:rPr>
-        <w:t>), required heatsink thermal resistance, feedback resistor divider sizing (E96 1%), and ESR stability zero frequency:</w:t>
+        <w:t>: Calculate LDO power dissipation, junction temperature (T_J), required heatsink thermal resistance, feedback resistor divider sizing (E96 1%), and ESR stability zero frequency:</w:t>
       </w:r>
     </w:p>
     <w:tbl>
@@ -1202,52 +1112,7 @@
           <w:color w:val="282C34"/>
           <w:sz w:val="21"/>
         </w:rPr>
-        <w:t>: Calculate QR Flyback transformer parameters (</w:t>
-      </w:r>
-      <w:r>
-        <w:rPr>
-          <w:i/>
-          <w:color w:val="145AA0"/>
-          <w:sz w:val="21"/>
-        </w:rPr>
-        <w:t>L_p, I_{pk</w:t>
-      </w:r>
-      <w:r>
-        <w:rPr>
-          <w:color w:val="282C34"/>
-          <w:sz w:val="21"/>
-        </w:rPr>
-        <w:t xml:space="preserve">, turns ratio, air gap), primary RCD snubber values, 4-switch Buck-Boost </w:t>
-      </w:r>
-      <w:r>
-        <w:rPr>
-          <w:i/>
-          <w:color w:val="145AA0"/>
-          <w:sz w:val="21"/>
-        </w:rPr>
-        <w:t>L</w:t>
-      </w:r>
-      <w:r>
-        <w:rPr>
-          <w:color w:val="282C34"/>
-          <w:sz w:val="21"/>
-        </w:rPr>
-        <w:t xml:space="preserve"> and </w:t>
-      </w:r>
-      <w:r>
-        <w:rPr>
-          <w:i/>
-          <w:color w:val="145AA0"/>
-          <w:sz w:val="21"/>
-        </w:rPr>
-        <w:t>C_{OUT</w:t>
-      </w:r>
-      <w:r>
-        <w:rPr>
-          <w:color w:val="282C34"/>
-          <w:sz w:val="21"/>
-        </w:rPr>
-        <w:t xml:space="preserve"> bank, DAC feedback summing network, and real-time efficiency:</w:t>
+        <w:t>: Calculate QR Flyback transformer parameters (L_p, I_pk, turns ratio, air gap), primary RCD snubber values, 4-switch Buck-Boost L and C_OUT bank, DAC feedback summing network, and real-time efficiency:</w:t>
       </w:r>
     </w:p>
     <w:tbl>
@@ -1884,22 +1749,7 @@
           <w:color w:val="282C34"/>
           <w:sz w:val="21"/>
         </w:rPr>
-        <w:t xml:space="preserve">): Near-field inductive coupling physics, Biot-Savart, 100% vs 10% ASK, 848 kHz subcarrier load modulation, antenna </w:t>
-      </w:r>
-      <w:r>
-        <w:rPr>
-          <w:i/>
-          <w:color w:val="145AA0"/>
-          <w:sz w:val="21"/>
-        </w:rPr>
-        <w:t>Q</w:t>
-      </w:r>
-      <w:r>
-        <w:rPr>
-          <w:color w:val="282C34"/>
-          <w:sz w:val="21"/>
-        </w:rPr>
-        <w:t>-factor, EMC filters, and ferrite shielding against metal surfaces.</w:t>
+        <w:t>): Near-field inductive coupling physics, Biot-Savart, 100% vs 10% ASK, 848 kHz subcarrier load modulation, antenna Q-factor, EMC filters, and ferrite shielding against metal surfaces.</w:t>
       </w:r>
     </w:p>
     <w:p>
@@ -2262,52 +2112,7 @@
           <w:color w:val="282C34"/>
           <w:sz w:val="21"/>
         </w:rPr>
-        <w:t xml:space="preserve">): AC timing parameter matrix, mathematical derivation of </w:t>
-      </w:r>
-      <w:r>
-        <w:rPr>
-          <w:i/>
-          <w:color w:val="145AA0"/>
-          <w:sz w:val="21"/>
-        </w:rPr>
-        <w:t>R_{p(min)</w:t>
-      </w:r>
-      <w:r>
-        <w:rPr>
-          <w:color w:val="282C34"/>
-          <w:sz w:val="21"/>
-        </w:rPr>
-        <w:t xml:space="preserve"> and </w:t>
-      </w:r>
-      <w:r>
-        <w:rPr>
-          <w:i/>
-          <w:color w:val="145AA0"/>
-          <w:sz w:val="21"/>
-        </w:rPr>
-        <w:t>R_{p(max)</w:t>
-      </w:r>
-      <w:r>
-        <w:rPr>
-          <w:color w:val="282C34"/>
-          <w:sz w:val="21"/>
-        </w:rPr>
-        <w:t>, bus capacitance budgeting (</w:t>
-      </w:r>
-      <w:r>
-        <w:rPr>
-          <w:i/>
-          <w:color w:val="145AA0"/>
-          <w:sz w:val="21"/>
-        </w:rPr>
-        <w:t>C_b</w:t>
-      </w:r>
-      <w:r>
-        <w:rPr>
-          <w:color w:val="282C34"/>
-          <w:sz w:val="21"/>
-        </w:rPr>
-        <w:t>), active bus accelerators, PCB layout &amp; crosstalk shielding, and bench RCA troubleshooting matrix.</w:t>
+        <w:t>): AC timing parameter matrix, mathematical derivation of R_p(min) and R_p(max), bus capacitance budgeting (C_b), active bus accelerators, PCB layout &amp; crosstalk shielding, and bench RCA troubleshooting matrix.</w:t>
       </w:r>
     </w:p>
     <w:p>
@@ -2566,37 +2371,7 @@
           <w:color w:val="282C34"/>
           <w:sz w:val="21"/>
         </w:rPr>
-        <w:t>): Single-wire 12V physical layer, asymmetric termination (</w:t>
-      </w:r>
-      <w:r>
-        <w:rPr>
-          <w:i/>
-          <w:color w:val="145AA0"/>
-          <w:sz w:val="21"/>
-        </w:rPr>
-        <w:t>1k\Omega</w:t>
-      </w:r>
-      <w:r>
-        <w:rPr>
-          <w:color w:val="282C34"/>
-          <w:sz w:val="21"/>
-        </w:rPr>
-        <w:t xml:space="preserve"> Master, </w:t>
-      </w:r>
-      <w:r>
-        <w:rPr>
-          <w:i/>
-          <w:color w:val="145AA0"/>
-          <w:sz w:val="21"/>
-        </w:rPr>
-        <w:t>30k\Omega</w:t>
-      </w:r>
-      <w:r>
-        <w:rPr>
-          <w:color w:val="282C34"/>
-          <w:sz w:val="21"/>
-        </w:rPr>
-        <w:t xml:space="preserve"> Slave), transceiver slew-rate control, deterministic schedule tables, sleep/wake-up protocol, and node configuration (NAD).</w:t>
+        <w:t>): Single-wire 12V physical layer, asymmetric termination (1kΩ Master, 30kΩ Slave), transceiver slew-rate control, deterministic schedule tables, sleep/wake-up protocol, and node configuration (NAD).</w:t>
       </w:r>
     </w:p>
     <w:p>
@@ -2633,22 +2408,7 @@
           <w:color w:val="282C34"/>
           <w:sz w:val="21"/>
         </w:rPr>
-        <w:t xml:space="preserve">): Bit-level frame anatomy (Break </w:t>
-      </w:r>
-      <w:r>
-        <w:rPr>
-          <w:i/>
-          <w:color w:val="145AA0"/>
-          <w:sz w:val="21"/>
-        </w:rPr>
-        <w:t>≥ 13</w:t>
-      </w:r>
-      <w:r>
-        <w:rPr>
-          <w:color w:val="282C34"/>
-          <w:sz w:val="21"/>
-        </w:rPr>
-        <w:t xml:space="preserve"> bits, Sync 0x55, PID parity equations P0/P1), Classic vs Enhanced Checksum algorithms, frame types, LIN TP, waveform decoding, and MCU UART driver.</w:t>
+        <w:t>): Bit-level frame anatomy (Break &gt;= 13 bits, Sync 0x55, PID parity equations P0/P1), Classic vs Enhanced Checksum algorithms, frame types, LIN TP, waveform decoding, and MCU UART driver.</w:t>
       </w:r>
     </w:p>
     <w:p>
@@ -2722,22 +2482,7 @@
           <w:color w:val="282C34"/>
           <w:sz w:val="21"/>
         </w:rPr>
-        <w:t xml:space="preserve">): Bit timing, </w:t>
-      </w:r>
-      <w:r>
-        <w:rPr>
-          <w:i/>
-          <w:color w:val="145AA0"/>
-          <w:sz w:val="21"/>
-        </w:rPr>
-        <w:t>1.4×</w:t>
-      </w:r>
-      <w:r>
-        <w:rPr>
-          <w:color w:val="282C34"/>
-          <w:sz w:val="21"/>
-        </w:rPr>
-        <w:t xml:space="preserve"> slot budget sizing, slave auto-baud clock synchronization math, timer input capture ISR, duty cycle timing budgets, bus RC capacitance, ISO 7637-2 surge protection, and bench RCA matrix.</w:t>
+        <w:t>): Bit timing, 1.4* slot budget sizing, slave auto-baud clock synchronization math, timer input capture ISR, duty cycle timing budgets, bus RC capacitance, ISO 7637-2 surge protection, and bench RCA matrix.</w:t>
       </w:r>
     </w:p>
     <w:p>
@@ -2811,22 +2556,7 @@
           <w:color w:val="282C34"/>
           <w:sz w:val="21"/>
         </w:rPr>
-        <w:t>): Common-Source topology, gate drive physics (</w:t>
-      </w:r>
-      <w:r>
-        <w:rPr>
-          <w:i/>
-          <w:color w:val="145AA0"/>
-          <w:sz w:val="21"/>
-        </w:rPr>
-        <w:t>V_{GATE &lt; V_{IN</w:t>
-      </w:r>
-      <w:r>
-        <w:rPr>
-          <w:color w:val="282C34"/>
-          <w:sz w:val="21"/>
-        </w:rPr>
-        <w:t>), two-pole loop dynamics, ESR stability tunnel, MLCC ceramic compensation, and parasitic body diode reverse current protection.</w:t>
+        <w:t>): Common-Source topology, gate drive physics (V_GATE &lt; V_IN), two-pole loop dynamics, ESR stability tunnel, MLCC ceramic compensation, and parasitic body diode reverse current protection.</w:t>
       </w:r>
     </w:p>
     <w:p>
@@ -2863,37 +2593,7 @@
           <w:color w:val="282C34"/>
           <w:sz w:val="21"/>
         </w:rPr>
-        <w:t>): Source-Follower topology, intrinsic local feedback, gate headroom constraint (</w:t>
-      </w:r>
-      <w:r>
-        <w:rPr>
-          <w:i/>
-          <w:color w:val="145AA0"/>
-          <w:sz w:val="21"/>
-        </w:rPr>
-        <w:t>V_{GATE &gt; V_{IN</w:t>
-      </w:r>
-      <w:r>
-        <w:rPr>
-          <w:color w:val="282C34"/>
-          <w:sz w:val="21"/>
-        </w:rPr>
-        <w:t xml:space="preserve">), dual-rail </w:t>
-      </w:r>
-      <w:r>
-        <w:rPr>
-          <w:i/>
-          <w:color w:val="145AA0"/>
-          <w:sz w:val="21"/>
-        </w:rPr>
-        <w:t>V_{BIAS</w:t>
-      </w:r>
-      <w:r>
-        <w:rPr>
-          <w:color w:val="282C34"/>
-          <w:sz w:val="21"/>
-        </w:rPr>
-        <w:t xml:space="preserve"> vs. internal charge pumps, wideband MLCC stability, and triple-well body effect elimination.</w:t>
+        <w:t>): Source-Follower topology, intrinsic local feedback, gate headroom constraint (V_GATE &gt; V_IN), dual-rail V_BIAS vs. internal charge pumps, wideband MLCC stability, and triple-well body effect elimination.</w:t>
       </w:r>
     </w:p>
     <w:p>
@@ -2930,37 +2630,7 @@
           <w:color w:val="282C34"/>
           <w:sz w:val="21"/>
         </w:rPr>
-        <w:t>): Power dissipation math, thermal resistance network (</w:t>
-      </w:r>
-      <w:r>
-        <w:rPr>
-          <w:i/>
-          <w:color w:val="145AA0"/>
-          <w:sz w:val="21"/>
-        </w:rPr>
-        <w:t>\theta_{JA, \theta_{JC</w:t>
-      </w:r>
-      <w:r>
-        <w:rPr>
-          <w:color w:val="282C34"/>
-          <w:sz w:val="21"/>
-        </w:rPr>
-        <w:t>), heatsink sizing, standard E96 feedback divider design, feedforward capacitor (</w:t>
-      </w:r>
-      <w:r>
-        <w:rPr>
-          <w:i/>
-          <w:color w:val="145AA0"/>
-          <w:sz w:val="21"/>
-        </w:rPr>
-        <w:t>C_{FF</w:t>
-      </w:r>
-      <w:r>
-        <w:rPr>
-          <w:color w:val="282C34"/>
-          <w:sz w:val="21"/>
-        </w:rPr>
-        <w:t>) phase-lead zero, output capacitor dynamic sizing, and bench RCA troubleshooting matrix.</w:t>
+        <w:t>): Power dissipation math, thermal resistance network (θ_JA, θ_JC), heatsink sizing, standard E96 feedback divider design, feedforward capacitor (C_FF) phase-lead zero, output capacitor dynamic sizing, and bench RCA troubleshooting matrix.</w:t>
       </w:r>
     </w:p>
     <w:p>
@@ -3071,22 +2741,7 @@
           <w:color w:val="282C34"/>
           <w:sz w:val="21"/>
         </w:rPr>
-        <w:t>): Synchronous buck/boost converters, half-bridge/inverters, high dV/dt Miller turn-on prevention (Active Miller Clamp &amp; negative bias), isolated flyback RCD snubber design, LLC resonant ZVS, bootstrap gate drivers, Kelvin-Source connections, SOA Spirito limits, UIS avalanche energy (</w:t>
-      </w:r>
-      <w:r>
-        <w:rPr>
-          <w:i/>
-          <w:color w:val="145AA0"/>
-          <w:sz w:val="21"/>
-        </w:rPr>
-        <w:t>E_{AS</w:t>
-      </w:r>
-      <w:r>
-        <w:rPr>
-          <w:color w:val="282C34"/>
-          <w:sz w:val="21"/>
-        </w:rPr>
-        <w:t>), and 48V/10A power stage schematic.</w:t>
+        <w:t>): Synchronous buck/boost converters, half-bridge/inverters, high dV/dt Miller turn-on prevention (Active Miller Clamp &amp; negative bias), isolated flyback RCD snubber design, LLC resonant ZVS, bootstrap gate drivers, Kelvin-Source connections, SOA Spirito limits, UIS avalanche energy (E_AS), and 48V/10A power stage schematic.</w:t>
       </w:r>
     </w:p>
     <w:p>
@@ -3271,22 +2926,7 @@
           <w:color w:val="282C34"/>
           <w:sz w:val="21"/>
         </w:rPr>
-        <w:t>): Double-diffused planar power physics, high single-pulse avalanche energy (</w:t>
-      </w:r>
-      <w:r>
-        <w:rPr>
-          <w:i/>
-          <w:color w:val="145AA0"/>
-          <w:sz w:val="21"/>
-        </w:rPr>
-        <w:t>E_{AS</w:t>
-      </w:r>
-      <w:r>
-        <w:rPr>
-          <w:color w:val="282C34"/>
-          <w:sz w:val="21"/>
-        </w:rPr>
-        <w:t>), and linear mode SOA immunity to Spirito hotspots.</w:t>
+        <w:t>): Double-diffused planar power physics, high single-pulse avalanche energy (E_AS), and linear mode SOA immunity to Spirito hotspots.</w:t>
       </w:r>
     </w:p>
     <w:p>
@@ -3323,37 +2963,7 @@
           <w:color w:val="282C34"/>
           <w:sz w:val="21"/>
         </w:rPr>
-        <w:t xml:space="preserve">): Multi-epi charge balance physics, breaking the 1D Silicon limit, non-linear </w:t>
-      </w:r>
-      <w:r>
-        <w:rPr>
-          <w:i/>
-          <w:color w:val="145AA0"/>
-          <w:sz w:val="21"/>
-        </w:rPr>
-        <w:t>C_{oss</w:t>
-      </w:r>
-      <w:r>
-        <w:rPr>
-          <w:color w:val="282C34"/>
-          <w:sz w:val="21"/>
-        </w:rPr>
-        <w:t xml:space="preserve">, high </w:t>
-      </w:r>
-      <w:r>
-        <w:rPr>
-          <w:i/>
-          <w:color w:val="145AA0"/>
-          <w:sz w:val="21"/>
-        </w:rPr>
-        <w:t>dv/dt</w:t>
-      </w:r>
-      <w:r>
-        <w:rPr>
-          <w:color w:val="282C34"/>
-          <w:sz w:val="21"/>
-        </w:rPr>
-        <w:t xml:space="preserve"> handling, and fast recovery CFD body diodes.</w:t>
+        <w:t>): Multi-epi charge balance physics, breaking the 1D Silicon limit, non-linear C_oss, high dv/dt handling, and fast recovery CFD body diodes.</w:t>
       </w:r>
     </w:p>
     <w:p>
@@ -3390,37 +3000,7 @@
           <w:color w:val="282C34"/>
           <w:sz w:val="21"/>
         </w:rPr>
-        <w:t xml:space="preserve">): Wide-bandgap </w:t>
-      </w:r>
-      <w:r>
-        <w:rPr>
-          <w:i/>
-          <w:color w:val="145AA0"/>
-          <w:sz w:val="21"/>
-        </w:rPr>
-        <w:t>3.26\,eV</w:t>
-      </w:r>
-      <w:r>
-        <w:rPr>
-          <w:color w:val="282C34"/>
-          <w:sz w:val="21"/>
-        </w:rPr>
-        <w:t xml:space="preserve"> physics, </w:t>
-      </w:r>
-      <w:r>
-        <w:rPr>
-          <w:i/>
-          <w:color w:val="145AA0"/>
-          <w:sz w:val="21"/>
-        </w:rPr>
-        <w:t>+18V/-4V</w:t>
-      </w:r>
-      <w:r>
-        <w:rPr>
-          <w:color w:val="282C34"/>
-          <w:sz w:val="21"/>
-        </w:rPr>
-        <w:t xml:space="preserve"> asymmetric gate drive, Kelvin Source connection, DESAT protection, and EV traction inverters.</w:t>
+        <w:t>): Wide-bandgap 3.26 eV physics, +18V/-4V asymmetric gate drive, Kelvin Source connection, DESAT protection, and EV traction inverters.</w:t>
       </w:r>
     </w:p>
     <w:p>
@@ -3457,52 +3037,7 @@
           <w:color w:val="282C34"/>
           <w:sz w:val="21"/>
         </w:rPr>
-        <w:t xml:space="preserve">): Thin-oxide </w:t>
-      </w:r>
-      <w:r>
-        <w:rPr>
-          <w:i/>
-          <w:color w:val="145AA0"/>
-          <w:sz w:val="21"/>
-        </w:rPr>
-        <w:t>1-2\,V</w:t>
-      </w:r>
-      <w:r>
-        <w:rPr>
-          <w:color w:val="282C34"/>
-          <w:sz w:val="21"/>
-        </w:rPr>
-        <w:t xml:space="preserve"> </w:t>
-      </w:r>
-      <w:r>
-        <w:rPr>
-          <w:i/>
-          <w:color w:val="145AA0"/>
-          <w:sz w:val="21"/>
-        </w:rPr>
-        <w:t>V_{TH</w:t>
-      </w:r>
-      <w:r>
-        <w:rPr>
-          <w:color w:val="282C34"/>
-          <w:sz w:val="21"/>
-        </w:rPr>
-        <w:t xml:space="preserve"> engineering, direct </w:t>
-      </w:r>
-      <w:r>
-        <w:rPr>
-          <w:i/>
-          <w:color w:val="145AA0"/>
-          <w:sz w:val="21"/>
-        </w:rPr>
-        <w:t>3.3\,V/5\,V</w:t>
-      </w:r>
-      <w:r>
-        <w:rPr>
-          <w:color w:val="282C34"/>
-          <w:sz w:val="21"/>
-        </w:rPr>
-        <w:t xml:space="preserve"> MCU GPIO drive, inrush resistor sizing, and gate charge limitations.</w:t>
+        <w:t>): Thin-oxide 1-2 V V_TH engineering, direct 3.3 V/5 V MCU GPIO drive, inrush resistor sizing, and gate charge limitations.</w:t>
       </w:r>
     </w:p>
     <w:p>
@@ -3539,37 +3074,7 @@
           <w:color w:val="282C34"/>
           <w:sz w:val="21"/>
         </w:rPr>
-        <w:t xml:space="preserve">): RF power physics, grounded backside flange, ultra-low </w:t>
-      </w:r>
-      <w:r>
-        <w:rPr>
-          <w:i/>
-          <w:color w:val="145AA0"/>
-          <w:sz w:val="21"/>
-        </w:rPr>
-        <w:t>C_{rss</w:t>
-      </w:r>
-      <w:r>
-        <w:rPr>
-          <w:color w:val="282C34"/>
-          <w:sz w:val="21"/>
-        </w:rPr>
-        <w:t xml:space="preserve">, </w:t>
-      </w:r>
-      <w:r>
-        <w:rPr>
-          <w:i/>
-          <w:color w:val="145AA0"/>
-          <w:sz w:val="21"/>
-        </w:rPr>
-        <w:t>65:1</w:t>
-      </w:r>
-      <w:r>
-        <w:rPr>
-          <w:color w:val="282C34"/>
-          <w:sz w:val="21"/>
-        </w:rPr>
-        <w:t xml:space="preserve"> VSWR survival, and Doherty base station architectures.</w:t>
+        <w:t>): RF power physics, grounded backside flange, ultra-low C_rss, 65:1 VSWR survival, and Doherty base station architectures.</w:t>
       </w:r>
     </w:p>
     <w:p>
@@ -3643,22 +3148,7 @@
           <w:color w:val="282C34"/>
           <w:sz w:val="21"/>
         </w:rPr>
-        <w:t>): Monolithic cascode integration, independent dual gates, Miller suppression (</w:t>
-      </w:r>
-      <w:r>
-        <w:rPr>
-          <w:i/>
-          <w:color w:val="145AA0"/>
-          <w:sz w:val="21"/>
-        </w:rPr>
-        <w:t>C_{rss &lt; 0.02\,pF</w:t>
-      </w:r>
-      <w:r>
-        <w:rPr>
-          <w:color w:val="282C34"/>
-          <w:sz w:val="21"/>
-        </w:rPr>
-        <w:t>), AGC amplifiers, and active RF mixers.</w:t>
+        <w:t>): Monolithic cascode integration, independent dual gates, Miller suppression (C_rss &lt; 0.02 pF), AGC amplifiers, and active RF mixers.</w:t>
       </w:r>
     </w:p>
     <w:p>
@@ -3880,22 +3370,7 @@
           <w:color w:val="282C34"/>
           <w:sz w:val="21"/>
         </w:rPr>
-        <w:t>): Gate-level realization for 3 floors (Floors 0, 1, 2), 1-hot distance calculation, exhaustive 27-state truth table, K-maps, and motor direction logic (</w:t>
-      </w:r>
-      <w:r>
-        <w:rPr>
-          <w:i/>
-          <w:color w:val="145AA0"/>
-          <w:sz w:val="21"/>
-        </w:rPr>
-        <w:t>UP, DOWN, STOP</w:t>
-      </w:r>
-      <w:r>
-        <w:rPr>
-          <w:color w:val="282C34"/>
-          <w:sz w:val="21"/>
-        </w:rPr>
-        <w:t>).</w:t>
+        <w:t>): Gate-level realization for 3 floors (Floors 0, 1, 2), 1-hot distance calculation, exhaustive 27-state truth table, K-maps, and motor direction logic (UP, DOWN, STOP).</w:t>
       </w:r>
     </w:p>
     <w:p>
@@ -3932,37 +3407,7 @@
           <w:color w:val="282C34"/>
           <w:sz w:val="21"/>
         </w:rPr>
-        <w:t>): 2-bit binary arithmetic distance subtractors (</w:t>
-      </w:r>
-      <w:r>
-        <w:rPr>
-          <w:i/>
-          <w:color w:val="145AA0"/>
-          <w:sz w:val="21"/>
-        </w:rPr>
-        <w:t>|R - A|</w:t>
-      </w:r>
-      <w:r>
-        <w:rPr>
-          <w:color w:val="282C34"/>
-          <w:sz w:val="21"/>
-        </w:rPr>
-        <w:t xml:space="preserve">, </w:t>
-      </w:r>
-      <w:r>
-        <w:rPr>
-          <w:i/>
-          <w:color w:val="145AA0"/>
-          <w:sz w:val="21"/>
-        </w:rPr>
-        <w:t>|R - B|</w:t>
-      </w:r>
-      <w:r>
-        <w:rPr>
-          <w:color w:val="282C34"/>
-          <w:sz w:val="21"/>
-        </w:rPr>
-        <w:t>), 2-bit magnitude comparators, 64-state system analysis, nearest dispatch arbiter, and busy-state priority handling.</w:t>
+        <w:t>): 2-bit binary arithmetic distance subtractors (|R - A|, |R - B|), 2-bit magnitude comparators, 64-state system analysis, nearest dispatch arbiter, and busy-state priority handling.</w:t>
       </w:r>
     </w:p>
     <w:p>
@@ -4110,37 +3555,7 @@
           <w:color w:val="282C34"/>
           <w:sz w:val="21"/>
         </w:rPr>
-        <w:t>): 4-switch synchronous Buck-Boost H-bridge (</w:t>
-      </w:r>
-      <w:r>
-        <w:rPr>
-          <w:i/>
-          <w:color w:val="145AA0"/>
-          <w:sz w:val="21"/>
-        </w:rPr>
-        <w:t>24\,V \rightarrow 5-20\,V</w:t>
-      </w:r>
-      <w:r>
-        <w:rPr>
-          <w:color w:val="282C34"/>
-          <w:sz w:val="21"/>
-        </w:rPr>
-        <w:t xml:space="preserve"> @ </w:t>
-      </w:r>
-      <w:r>
-        <w:rPr>
-          <w:i/>
-          <w:color w:val="145AA0"/>
-          <w:sz w:val="21"/>
-        </w:rPr>
-        <w:t>3\,A</w:t>
-      </w:r>
-      <w:r>
-        <w:rPr>
-          <w:color w:val="282C34"/>
-          <w:sz w:val="21"/>
-        </w:rPr>
-        <w:t>), 10µH flat-wire inductor, output capacitor bank (&lt; 25mV ripple), 12-bit DAC current-injection feedback network (10mV resolution), and analog fast Constant Current (CC) clamp loop.</w:t>
+        <w:t>): 4-switch synchronous Buck-Boost H-bridge (24 V -&gt; 5-20 V @ 3 A), 10µH flat-wire inductor, output capacitor bank (&lt; 25mV ripple), 12-bit DAC current-injection feedback network (10mV resolution), and analog fast Constant Current (CC) clamp loop.</w:t>
       </w:r>
     </w:p>
     <w:p>
@@ -4177,37 +3592,7 @@
           <w:color w:val="282C34"/>
           <w:sz w:val="21"/>
         </w:rPr>
-        <w:t xml:space="preserve">): Dual-domain power metering (isolated primary AC </w:t>
-      </w:r>
-      <w:r>
-        <w:rPr>
-          <w:i/>
-          <w:color w:val="145AA0"/>
-          <w:sz w:val="21"/>
-        </w:rPr>
-        <w:t>\Delta\Sigma</w:t>
-      </w:r>
-      <w:r>
-        <w:rPr>
-          <w:color w:val="282C34"/>
-          <w:sz w:val="21"/>
-        </w:rPr>
-        <w:t xml:space="preserve"> modulator AMC1311/CT and secondary DC INA226 I2C monitor), real-time efficiency engine (</w:t>
-      </w:r>
-      <w:r>
-        <w:rPr>
-          <w:i/>
-          <w:color w:val="145AA0"/>
-          <w:sz w:val="21"/>
-        </w:rPr>
-        <w:t>\eta = P_{DC / P_{AC</w:t>
-      </w:r>
-      <w:r>
-        <w:rPr>
-          <w:color w:val="282C34"/>
-          <w:sz w:val="21"/>
-        </w:rPr>
-        <w:t xml:space="preserve"> at 10Hz), non-blocking FreeRTOS MicroSD FAT32 CSV logger, 1.3" OLED display, and USB-C SCPI command parser.</w:t>
+        <w:t>): Dual-domain power metering (isolated primary AC ΔSigma modulator AMC1311/CT and secondary DC INA226 I2C monitor), real-time efficiency engine (η = P_DC / P_AC at 10Hz), non-blocking FreeRTOS MicroSD FAT32 CSV logger, 1.3" OLED display, and USB-C SCPI command parser.</w:t>
       </w:r>
     </w:p>
     <w:p>
@@ -4244,22 +3629,7 @@
           <w:color w:val="282C34"/>
           <w:sz w:val="21"/>
         </w:rPr>
-        <w:t>): Complete end-to-end system interconnect schematic, reinforced isolation barrier rules (</w:t>
-      </w:r>
-      <w:r>
-        <w:rPr>
-          <w:i/>
-          <w:color w:val="145AA0"/>
-          <w:sz w:val="21"/>
-        </w:rPr>
-        <w:t>≥ 6.4\,mm</w:t>
-      </w:r>
-      <w:r>
-        <w:rPr>
-          <w:color w:val="282C34"/>
-          <w:sz w:val="21"/>
-        </w:rPr>
-        <w:t xml:space="preserve"> creepage, 2.0mm PCB isolation slot, Y1 safety cap), 4-layer PCB stackup and layout guidelines, Bill of Materials (BOM), bring-up checklist, and RCA troubleshooting matrix.</w:t>
+        <w:t>): Complete end-to-end system interconnect schematic, reinforced isolation barrier rules (&gt;= 6.4 mm creepage, 2.0mm PCB isolation slot, Y1 safety cap), 4-layer PCB stackup and layout guidelines, Bill of Materials (BOM), bring-up checklist, and RCA troubleshooting matrix.</w:t>
       </w:r>
     </w:p>
     <w:p>
@@ -4391,22 +3761,7 @@
           <w:color w:val="282C34"/>
           <w:sz w:val="21"/>
         </w:rPr>
-        <w:t xml:space="preserve">): Deep dive into Series, Parallel, and LLC Resonant Half-Bridge converters, FHA gain curves </w:t>
-      </w:r>
-      <w:r>
-        <w:rPr>
-          <w:i/>
-          <w:color w:val="145AA0"/>
-          <w:sz w:val="21"/>
-        </w:rPr>
-        <w:t>M(f_n, Q, L_n)</w:t>
-      </w:r>
-      <w:r>
-        <w:rPr>
-          <w:color w:val="282C34"/>
-          <w:sz w:val="21"/>
-        </w:rPr>
-        <w:t>, and complete ZVS/ZCS design procedures.</w:t>
+        <w:t>): Deep dive into Series, Parallel, and LLC Resonant Half-Bridge converters, FHA gain curves M(f_n, Q, L_n), and complete ZVS/ZCS design procedures.</w:t>
       </w:r>
     </w:p>
     <w:p>
@@ -4443,22 +3798,7 @@
           <w:color w:val="282C34"/>
           <w:sz w:val="21"/>
         </w:rPr>
-        <w:t>): Soft-switching ZVS mechanisms, leading/lagging leg transitions, duty-cycle loss (</w:t>
-      </w:r>
-      <w:r>
-        <w:rPr>
-          <w:i/>
-          <w:color w:val="145AA0"/>
-          <w:sz w:val="21"/>
-        </w:rPr>
-        <w:t>\Delta D</w:t>
-      </w:r>
-      <w:r>
-        <w:rPr>
-          <w:color w:val="282C34"/>
-          <w:sz w:val="21"/>
-        </w:rPr>
-        <w:t>), and secondary ringing suppression.</w:t>
+        <w:t>): Soft-switching ZVS mechanisms, leading/lagging leg transitions, duty-cycle loss (Δ D), and secondary ringing suppression.</w:t>
       </w:r>
     </w:p>
     <w:p>
@@ -4680,22 +4020,7 @@
           <w:color w:val="282C34"/>
           <w:sz w:val="21"/>
         </w:rPr>
-        <w:t>): Half-bridge vs Full-bridge H-bridge, Bipolar vs Unipolar SPWM (</w:t>
-      </w:r>
-      <w:r>
-        <w:rPr>
-          <w:i/>
-          <w:color w:val="145AA0"/>
-          <w:sz w:val="21"/>
-        </w:rPr>
-        <w:t>2f_c</w:t>
-      </w:r>
-      <w:r>
-        <w:rPr>
-          <w:color w:val="282C34"/>
-          <w:sz w:val="21"/>
-        </w:rPr>
-        <w:t xml:space="preserve"> harmonic cancellation), and second-order LC output low-pass filter design.</w:t>
+        <w:t>): Half-bridge vs Full-bridge H-bridge, Bipolar vs Unipolar SPWM (2f_c harmonic cancellation), and second-order LC output low-pass filter design.</w:t>
       </w:r>
     </w:p>
     <w:p>
@@ -4732,22 +4057,7 @@
           <w:color w:val="282C34"/>
           <w:sz w:val="21"/>
         </w:rPr>
-        <w:t>): 6-Switch two-level VSI, 180°/120° six-step, THIPWM saddle modulation, and Space Vector PWM (SVPWM) mathematical deep dive (</w:t>
-      </w:r>
-      <w:r>
-        <w:rPr>
-          <w:i/>
-          <w:color w:val="145AA0"/>
-          <w:sz w:val="21"/>
-        </w:rPr>
-        <w:t>15.5\%</w:t>
-      </w:r>
-      <w:r>
-        <w:rPr>
-          <w:color w:val="282C34"/>
-          <w:sz w:val="21"/>
-        </w:rPr>
-        <w:t xml:space="preserve"> higher DC utilization).</w:t>
+        <w:t>): 6-Switch two-level VSI, 180°/120° six-step, THIPWM saddle modulation, and Space Vector PWM (SVPWM) mathematical deep dive (15.5\% higher DC utilization).</w:t>
       </w:r>
     </w:p>
     <w:p>
@@ -4784,22 +4094,7 @@
           <w:color w:val="282C34"/>
           <w:sz w:val="21"/>
         </w:rPr>
-        <w:t>): AC mains rectification, power quality metrics (</w:t>
-      </w:r>
-      <w:r>
-        <w:rPr>
-          <w:i/>
-          <w:color w:val="145AA0"/>
-          <w:sz w:val="21"/>
-        </w:rPr>
-        <w:t>PF, DPF, THD_i</w:t>
-      </w:r>
-      <w:r>
-        <w:rPr>
-          <w:color w:val="282C34"/>
-          <w:sz w:val="21"/>
-        </w:rPr>
-        <w:t>), and regulatory compliance (IEC 61000-3-2).</w:t>
+        <w:t>): AC mains rectification, power quality metrics (PF, DPF, THD_i), and regulatory compliance (IEC 61000-3-2).</w:t>
       </w:r>
     </w:p>
     <w:p>
@@ -4836,22 +4131,7 @@
           <w:color w:val="282C34"/>
           <w:sz w:val="21"/>
         </w:rPr>
-        <w:t xml:space="preserve">): 1-Phase &amp; 3-Phase diode bridges, conduction angle </w:t>
-      </w:r>
-      <w:r>
-        <w:rPr>
-          <w:i/>
-          <w:color w:val="145AA0"/>
-          <w:sz w:val="21"/>
-        </w:rPr>
-        <w:t>\theta_c</w:t>
-      </w:r>
-      <w:r>
-        <w:rPr>
-          <w:color w:val="282C34"/>
-          <w:sz w:val="21"/>
-        </w:rPr>
-        <w:t>, crest factor, bulk capacitor sizing, and inrush surge protection.</w:t>
+        <w:t>): 1-Phase &amp; 3-Phase diode bridges, conduction angle θ_c, crest factor, bulk capacitor sizing, and inrush surge protection.</w:t>
       </w:r>
     </w:p>
     <w:p>
@@ -4888,22 +4168,7 @@
           <w:color w:val="282C34"/>
           <w:sz w:val="21"/>
         </w:rPr>
-        <w:t xml:space="preserve">): Semi-converters, full-converters, firing delay </w:t>
-      </w:r>
-      <w:r>
-        <w:rPr>
-          <w:i/>
-          <w:color w:val="145AA0"/>
-          <w:sz w:val="21"/>
-        </w:rPr>
-        <w:t>\alpha</w:t>
-      </w:r>
-      <w:r>
-        <w:rPr>
-          <w:color w:val="282C34"/>
-          <w:sz w:val="21"/>
-        </w:rPr>
-        <w:t>, and Quadrant IV line-commutated inversion for DC motor regenerative braking.</w:t>
+        <w:t>): Semi-converters, full-converters, firing delay α, and Quadrant IV line-commutated inversion for DC motor regenerative braking.</w:t>
       </w:r>
     </w:p>
     <w:p>
@@ -4940,22 +4205,7 @@
           <w:color w:val="282C34"/>
           <w:sz w:val="21"/>
         </w:rPr>
-        <w:t>): Active Boost PFC (inner current + outer voltage loop), Bridgeless Totem-Pole GaN (</w:t>
-      </w:r>
-      <w:r>
-        <w:rPr>
-          <w:i/>
-          <w:color w:val="145AA0"/>
-          <w:sz w:val="21"/>
-        </w:rPr>
-        <w:t>99\%</w:t>
-      </w:r>
-      <w:r>
-        <w:rPr>
-          <w:color w:val="282C34"/>
-          <w:sz w:val="21"/>
-        </w:rPr>
-        <w:t xml:space="preserve"> efficiency), 3-Phase Vienna Rectifier, and hold-up capacitor sizing.</w:t>
+        <w:t>): Active Boost PFC (inner current + outer voltage loop), Bridgeless Totem-Pole GaN (99\% efficiency), 3-Phase Vienna Rectifier, and hold-up capacitor sizing.</w:t>
       </w:r>
     </w:p>
     <w:p>
@@ -5166,22 +4416,7 @@
           <w:color w:val="282C34"/>
           <w:sz w:val="21"/>
         </w:rPr>
-        <w:t>): Automotive Electronics Council standards (AEC-Q100/101/102/103/104/200), temperature grades (0 to 4), stress test groups A–G, zero-defect (</w:t>
-      </w:r>
-      <w:r>
-        <w:rPr>
-          <w:i/>
-          <w:color w:val="145AA0"/>
-          <w:sz w:val="21"/>
-        </w:rPr>
-        <w:t>c=0</w:t>
-      </w:r>
-      <w:r>
-        <w:rPr>
-          <w:color w:val="282C34"/>
-          <w:sz w:val="21"/>
-        </w:rPr>
-        <w:t>), and PPAP integration.</w:t>
+        <w:t>): Automotive Electronics Council standards (AEC-Q100/101/102/103/104/200), temperature grades (0 to 4), stress test groups A–G, zero-defect (c=0), and PPAP integration.</w:t>
       </w:r>
     </w:p>
     <w:p>

</xml_diff>